<commit_message>
Report finalized for review by HH!!!
</commit_message>
<xml_diff>
--- a/markdown/RFsportmort_Report.2_editing.docx
+++ b/markdown/RFsportmort_Report.2_editing.docx
@@ -1545,13 +1545,13 @@
       <w:pPr>
         <w:pStyle w:val="Heading1"/>
       </w:pPr>
-      <w:bookmarkStart w:id="0" w:name="abstract"/>
-      <w:bookmarkStart w:id="1" w:name="_Toc242785270"/>
+      <w:bookmarkStart w:id="0" w:name="_Toc242785270"/>
+      <w:bookmarkStart w:id="1" w:name="abstract"/>
       <w:r>
         <w:lastRenderedPageBreak/>
         <w:t>Abstract</w:t>
       </w:r>
-      <w:bookmarkEnd w:id="1"/>
+      <w:bookmarkEnd w:id="0"/>
     </w:p>
     <w:p>
       <w:pPr>
@@ -1565,18 +1565,36 @@
           <w:i/>
           <w:iCs/>
         </w:rPr>
-        <w:t>Sebastes melanops</w:t>
-      </w:r>
-      <w:r>
-        <w:t>) and yelloweye rockfishes (</w:t>
-      </w:r>
+        <w:t xml:space="preserve">Sebastes </w:t>
+      </w:r>
+      <w:proofErr w:type="spellStart"/>
       <w:r>
         <w:rPr>
           <w:i/>
           <w:iCs/>
         </w:rPr>
-        <w:t>S. ruberrimus</w:t>
-      </w:r>
+        <w:t>melanops</w:t>
+      </w:r>
+      <w:proofErr w:type="spellEnd"/>
+      <w:r>
+        <w:t>) and yelloweye rockfishes (</w:t>
+      </w:r>
+      <w:r>
+        <w:rPr>
+          <w:i/>
+          <w:iCs/>
+        </w:rPr>
+        <w:t xml:space="preserve">S. </w:t>
+      </w:r>
+      <w:proofErr w:type="spellStart"/>
+      <w:r>
+        <w:rPr>
+          <w:i/>
+          <w:iCs/>
+        </w:rPr>
+        <w:t>ruberrimus</w:t>
+      </w:r>
+      <w:proofErr w:type="spellEnd"/>
       <w:r>
         <w:t>) as well as demersal shelf</w:t>
       </w:r>
@@ -1586,7 +1604,15 @@
         </w:r>
       </w:ins>
       <w:r>
-        <w:t xml:space="preserve">, slope, and non-black pelagic rockfish complexes in Southeast Alaska, in geographic units consistent with commercial fishery management units (CFMUs) and incorporates release mortalities and fish weights to estimate total fishing mortality in pounds. The new methods build on the foundational work of Howard et al. (2020) that developed the spatial relationship between sport and commercial fishery management units and provided estimates between 1999 and today. The Bayesian methods used here allow for estimation from 1977 through today, corrects some </w:t>
+        <w:t xml:space="preserve">, slope, and non-black pelagic rockfish complexes in Southeast Alaska, in geographic units consistent with commercial fishery management units (CFMUs) and incorporates release mortalities and fish weights to estimate total fishing mortality in pounds. The new methods </w:t>
+      </w:r>
+      <w:proofErr w:type="gramStart"/>
+      <w:r>
+        <w:t>build</w:t>
+      </w:r>
+      <w:proofErr w:type="gramEnd"/>
+      <w:r>
+        <w:t xml:space="preserve"> on the foundational work of Howard et al. (2020) that developed the spatial relationship between sport and commercial fishery management units and provided estimates between 1999 and today. The Bayesian methods used here allow for estimation from 1977 through today, corrects some </w:t>
       </w:r>
       <w:del w:id="3" w:author="Joy, Philip J (DFG)" w:date="2026-10-13T13:58:00Z" w16du:dateUtc="2026-10-13T21:58:00Z">
         <w:r>
@@ -1595,10 +1621,7 @@
       </w:del>
       <w:ins w:id="4" w:author="Joy, Philip J (DFG)" w:date="2026-10-13T13:58:00Z" w16du:dateUtc="2026-10-13T21:58:00Z">
         <w:r>
-          <w:t>flawed</w:t>
-        </w:r>
-        <w:r>
-          <w:t xml:space="preserve"> </w:t>
+          <w:t xml:space="preserve">flawed </w:t>
         </w:r>
       </w:ins>
       <w:r>
@@ -1610,7 +1633,15 @@
         </w:r>
       </w:del>
       <w:r>
-        <w:t>share information across areas within regions. Assumptions about key parameters and estimates before data collection began are made using logistic curves to estimate trends. Harvest estimates from the Bayesian model are very similar to the Howard et al. (2020) estimates but release estimates differ considerably as a result of bias correction and more informed estimates of release probability by species and species assemblage informed by logbook and portside interview data. The new model provides a unified approach to quantifying rockfish removals going forward and these methods are recommended for use in stock assessments.</w:t>
+        <w:t xml:space="preserve">share information across areas within regions. Assumptions about key parameters and estimates before data collection began are made using logistic curves to estimate trends. Harvest estimates from the Bayesian model are very similar to the Howard et al. (2020) estimates but release estimates differ considerably </w:t>
+      </w:r>
+      <w:proofErr w:type="gramStart"/>
+      <w:r>
+        <w:t>as a result of</w:t>
+      </w:r>
+      <w:proofErr w:type="gramEnd"/>
+      <w:r>
+        <w:t xml:space="preserve"> bias correction and more informed estimates of release probability by species and species assemblage informed by logbook and portside interview data. The new model provides a unified approach to quantifying rockfish removals going forward and these methods are recommended for use in stock assessments.</w:t>
       </w:r>
     </w:p>
     <w:p>
@@ -1635,70 +1666,131 @@
           <w:i/>
           <w:iCs/>
         </w:rPr>
-        <w:t>Sebastes melanops</w:t>
-      </w:r>
-      <w:r>
-        <w:t xml:space="preserve">, </w:t>
-      </w:r>
+        <w:t xml:space="preserve">Sebastes </w:t>
+      </w:r>
+      <w:proofErr w:type="spellStart"/>
       <w:r>
         <w:rPr>
           <w:i/>
           <w:iCs/>
         </w:rPr>
-        <w:t>Sebastes ruberrimus</w:t>
-      </w:r>
-      <w:r>
-        <w:t>, rockfish</w:t>
-      </w:r>
-    </w:p>
-    <w:p>
-      <w:pPr>
-        <w:pStyle w:val="Heading1"/>
-      </w:pPr>
-      <w:bookmarkStart w:id="6" w:name="introduction"/>
-      <w:bookmarkStart w:id="7" w:name="_Toc242785271"/>
-      <w:bookmarkEnd w:id="0"/>
-      <w:r>
-        <w:t>Introduction</w:t>
-      </w:r>
-      <w:bookmarkEnd w:id="7"/>
-    </w:p>
-    <w:p>
-      <w:pPr>
-        <w:pStyle w:val="FirstParagraph"/>
-      </w:pPr>
-      <w:r>
-        <w:t>Rockfish (</w:t>
+        <w:t>melanops</w:t>
+      </w:r>
+      <w:proofErr w:type="spellEnd"/>
+      <w:r>
+        <w:t xml:space="preserve">, </w:t>
       </w:r>
       <w:r>
         <w:rPr>
           <w:i/>
           <w:iCs/>
         </w:rPr>
-        <w:t>Sebastes spp</w:t>
-      </w:r>
-      <w:r>
-        <w:t>) harvests in Alaskan waters have become an increasing concern as restrictions on halibut and salmon have led to increased pressure on rockfish stocks. In response to this pressure, the Alaska Department of Fish and Game (ADF&amp;G) initiated an interdivisional, inter-regional strategic plan to develop long-term management and stock assessment strategies for black rockfish (</w:t>
-      </w:r>
+        <w:t xml:space="preserve">Sebastes </w:t>
+      </w:r>
+      <w:proofErr w:type="spellStart"/>
       <w:r>
         <w:rPr>
           <w:i/>
           <w:iCs/>
         </w:rPr>
-        <w:t>S. melanops</w:t>
-      </w:r>
-      <w:r>
-        <w:t>) and yelloweye rockfish (</w:t>
+        <w:t>ruberrimus</w:t>
+      </w:r>
+      <w:proofErr w:type="spellEnd"/>
+      <w:r>
+        <w:t>, rockfish</w:t>
+      </w:r>
+    </w:p>
+    <w:p>
+      <w:pPr>
+        <w:pStyle w:val="Heading1"/>
+      </w:pPr>
+      <w:bookmarkStart w:id="6" w:name="_Toc242785271"/>
+      <w:bookmarkStart w:id="7" w:name="introduction"/>
+      <w:bookmarkEnd w:id="1"/>
+      <w:r>
+        <w:t>Introduction</w:t>
+      </w:r>
+      <w:bookmarkEnd w:id="6"/>
+    </w:p>
+    <w:p>
+      <w:pPr>
+        <w:pStyle w:val="FirstParagraph"/>
+      </w:pPr>
+      <w:r>
+        <w:t>Rockfish (</w:t>
       </w:r>
       <w:r>
         <w:rPr>
           <w:i/>
           <w:iCs/>
         </w:rPr>
-        <w:t>S. ruberrimus</w:t>
-      </w:r>
-      <w:r>
-        <w:t>) across the Gulf of Alaska (GOA) (Howard et al. 2019a). The first step in assessing any fish stock is to have an accurate and complete history of fishery removals from the stock. While commercial fisheries rely on a fish ticketing system that censuses the harvest, Alaska sport fisheries rely on a number of programs, phased in over time, to account for rockfish removals in the sport fishery.</w:t>
+        <w:t xml:space="preserve">Sebastes </w:t>
+      </w:r>
+      <w:proofErr w:type="spellStart"/>
+      <w:r>
+        <w:rPr>
+          <w:i/>
+          <w:iCs/>
+        </w:rPr>
+        <w:t>spp</w:t>
+      </w:r>
+      <w:proofErr w:type="spellEnd"/>
+      <w:r>
+        <w:t>) harvests in Alaskan waters have become an increasing concern as restrictions on halibut and salmon have led to increased pressure on rockfish stocks. In response to this pressure, the Alaska Department of Fish and Game (ADF&amp;G) initiated an interdivisional, inter-regional strategic plan to develop long-term management and stock assessment strategies for black rockfish (</w:t>
+      </w:r>
+      <w:r>
+        <w:rPr>
+          <w:i/>
+          <w:iCs/>
+        </w:rPr>
+        <w:t xml:space="preserve">S. </w:t>
+      </w:r>
+      <w:proofErr w:type="spellStart"/>
+      <w:r>
+        <w:rPr>
+          <w:i/>
+          <w:iCs/>
+        </w:rPr>
+        <w:t>melanops</w:t>
+      </w:r>
+      <w:proofErr w:type="spellEnd"/>
+      <w:r>
+        <w:t>) and yelloweye rockfish (</w:t>
+      </w:r>
+      <w:r>
+        <w:rPr>
+          <w:i/>
+          <w:iCs/>
+        </w:rPr>
+        <w:t xml:space="preserve">S. </w:t>
+      </w:r>
+      <w:proofErr w:type="spellStart"/>
+      <w:r>
+        <w:rPr>
+          <w:i/>
+          <w:iCs/>
+        </w:rPr>
+        <w:t>ruberrimus</w:t>
+      </w:r>
+      <w:proofErr w:type="spellEnd"/>
+      <w:r>
+        <w:t xml:space="preserve">) across the Gulf of Alaska (GOA) (Howard et al. 2019a). The first step in assessing any fish stock is to have an accurate and complete history of fishery removals from the stock. While commercial fisheries rely on a fish ticketing system that censuses the harvest, Alaska sport fisheries rely on </w:t>
+      </w:r>
+      <w:proofErr w:type="gramStart"/>
+      <w:r>
+        <w:t>a number of</w:t>
+      </w:r>
+      <w:proofErr w:type="gramEnd"/>
+      <w:r>
+        <w:t xml:space="preserve"> programs, phased in </w:t>
+      </w:r>
+      <w:proofErr w:type="gramStart"/>
+      <w:r>
+        <w:t>over time</w:t>
+      </w:r>
+      <w:proofErr w:type="gramEnd"/>
+      <w:r>
+        <w:t>, to account for rockfish removals in the sport fishery.</w:t>
       </w:r>
     </w:p>
     <w:p>
@@ -1731,7 +1823,15 @@
         <w:pStyle w:val="BodyText"/>
       </w:pPr>
       <w:r>
-        <w:t>Stock assessments also require estimates of total mortalities in weight units. Rockfish can experience high levels of release mortality as a result of barotrauma (Jarvis and Lowe 2008; Hochhalter and Reed 2011), particularly before the mandating of deep-water release mechanism (DRM) devices in recent years. This requires an accounting of rockfish releases and reliable estimates of mortality. Converting fish numbers to biomass also requires weight data by species and species complex.</w:t>
+        <w:t xml:space="preserve">Stock assessments also require estimates of total mortalities in weight units. Rockfish can experience high levels of release mortality </w:t>
+      </w:r>
+      <w:proofErr w:type="gramStart"/>
+      <w:r>
+        <w:t>as a result of</w:t>
+      </w:r>
+      <w:proofErr w:type="gramEnd"/>
+      <w:r>
+        <w:t xml:space="preserve"> barotrauma (Jarvis and Lowe 2008; Hochhalter and Reed 2011), particularly before the mandating of deep-water release mechanism (DRM) devices in recent years. This requires an accounting of rockfish releases and reliable estimates of mortality. Converting fish numbers to biomass also requires weight data by species and species complex.</w:t>
       </w:r>
     </w:p>
     <w:p>
@@ -1739,7 +1839,17 @@
         <w:pStyle w:val="BodyText"/>
       </w:pPr>
       <w:r>
-        <w:t xml:space="preserve">Yelloweye and black rockfish removal estimation methods were originally developed by Howard et al. (2020; hereafter referred to as the Howard methods), which included spatial partitioning of the data, identifying bias in the SWHS survey estimates relative to the logbook census of guided anglers, and estimating unguided harvests and releases by expanding logbook catch and release data using the proportions of guided:unguided harvests and releases from SWHS estimates. This approach was both novel and critical in providing harvest and release estimates for managers to understand the magnitude of the catch and </w:t>
+        <w:t xml:space="preserve">Yelloweye and black rockfish removal estimation methods were originally developed by Howard et al. (2020; hereafter referred to as the Howard methods), which included spatial partitioning of the data, identifying bias in the SWHS survey estimates relative to the logbook census of guided anglers, and estimating unguided harvests and releases by expanding logbook catch and release data using the proportions of </w:t>
+      </w:r>
+      <w:proofErr w:type="spellStart"/>
+      <w:proofErr w:type="gramStart"/>
+      <w:r>
+        <w:t>guided:unguided</w:t>
+      </w:r>
+      <w:proofErr w:type="spellEnd"/>
+      <w:proofErr w:type="gramEnd"/>
+      <w:r>
+        <w:t xml:space="preserve"> harvests and releases from SWHS estimates. This approach was both novel and critical in providing harvest and release estimates for managers to understand the magnitude of the catch and </w:t>
       </w:r>
       <w:del w:id="8" w:author="Joy, Philip J (DFG)" w:date="2026-10-13T14:02:00Z" w16du:dateUtc="2026-10-13T22:02:00Z">
         <w:r>
@@ -1764,7 +1874,15 @@
       </w:r>
       <w:r>
         <w:lastRenderedPageBreak/>
-        <w:t xml:space="preserve">based on the guided:unguided ratio in the SWHS </w:t>
+        <w:t xml:space="preserve">based on the </w:t>
+      </w:r>
+      <w:proofErr w:type="spellStart"/>
+      <w:r>
+        <w:t>guided:unguided</w:t>
+      </w:r>
+      <w:proofErr w:type="spellEnd"/>
+      <w:r>
+        <w:t xml:space="preserve"> ratio in the SWHS </w:t>
       </w:r>
       <w:del w:id="10" w:author="Joy, Philip J (DFG)" w:date="2026-10-13T14:03:00Z" w16du:dateUtc="2026-10-13T22:03:00Z">
         <w:r>
@@ -1773,10 +1891,7 @@
       </w:del>
       <w:ins w:id="11" w:author="Joy, Philip J (DFG)" w:date="2026-10-13T14:03:00Z" w16du:dateUtc="2026-10-13T22:03:00Z">
         <w:r>
-          <w:t>estimates</w:t>
-        </w:r>
-        <w:r>
-          <w:t xml:space="preserve"> </w:t>
+          <w:t xml:space="preserve">estimates </w:t>
         </w:r>
       </w:ins>
       <w:r>
@@ -1832,13 +1947,13 @@
       <w:pPr>
         <w:pStyle w:val="Heading1"/>
       </w:pPr>
-      <w:bookmarkStart w:id="15" w:name="objective"/>
-      <w:bookmarkStart w:id="16" w:name="_Toc242785272"/>
-      <w:bookmarkEnd w:id="6"/>
+      <w:bookmarkStart w:id="15" w:name="_Toc242785272"/>
+      <w:bookmarkStart w:id="16" w:name="objective"/>
+      <w:bookmarkEnd w:id="7"/>
       <w:r>
         <w:t>Objective</w:t>
       </w:r>
-      <w:bookmarkEnd w:id="16"/>
+      <w:bookmarkEnd w:id="15"/>
     </w:p>
     <w:p>
       <w:pPr>
@@ -1857,10 +1972,7 @@
       </w:del>
       <w:ins w:id="18" w:author="Joy, Philip J (DFG)" w:date="2026-10-13T14:05:00Z" w16du:dateUtc="2026-10-13T22:05:00Z">
         <w:r>
-          <w:t>202</w:t>
-        </w:r>
-        <w:r>
-          <w:t>5</w:t>
+          <w:t>2025</w:t>
         </w:r>
       </w:ins>
       <w:r>
@@ -1922,6 +2034,7 @@
       <w:r>
         <w:t xml:space="preserve">, widow </w:t>
       </w:r>
+      <w:proofErr w:type="spellStart"/>
       <w:r>
         <w:rPr>
           <w:i/>
@@ -1929,6 +2042,7 @@
         </w:rPr>
         <w:t>entomelas</w:t>
       </w:r>
+      <w:proofErr w:type="spellEnd"/>
       <w:r>
         <w:t xml:space="preserve">, yellowtail </w:t>
       </w:r>
@@ -1937,18 +2051,36 @@
           <w:i/>
           <w:iCs/>
         </w:rPr>
-        <w:t>S. flavidus</w:t>
-      </w:r>
-      <w:r>
-        <w:t xml:space="preserve">, and blue </w:t>
-      </w:r>
+        <w:t xml:space="preserve">S. </w:t>
+      </w:r>
+      <w:proofErr w:type="spellStart"/>
       <w:r>
         <w:rPr>
           <w:i/>
           <w:iCs/>
         </w:rPr>
-        <w:t>S. mystinus</w:t>
-      </w:r>
+        <w:t>flavidus</w:t>
+      </w:r>
+      <w:proofErr w:type="spellEnd"/>
+      <w:r>
+        <w:t xml:space="preserve">, and blue </w:t>
+      </w:r>
+      <w:r>
+        <w:rPr>
+          <w:i/>
+          <w:iCs/>
+        </w:rPr>
+        <w:t xml:space="preserve">S. </w:t>
+      </w:r>
+      <w:proofErr w:type="spellStart"/>
+      <w:r>
+        <w:rPr>
+          <w:i/>
+          <w:iCs/>
+        </w:rPr>
+        <w:t>mystinus</w:t>
+      </w:r>
+      <w:proofErr w:type="spellEnd"/>
       <w:r>
         <w:t xml:space="preserve"> rockfish); Southeast only,</w:t>
       </w:r>
@@ -1969,20 +2101,46 @@
           <w:i/>
           <w:iCs/>
         </w:rPr>
-        <w:t>S. pinniger</w:t>
-      </w:r>
-      <w:r>
-        <w:t xml:space="preserve">, quillback </w:t>
-      </w:r>
+        <w:t xml:space="preserve">S. </w:t>
+      </w:r>
+      <w:proofErr w:type="spellStart"/>
       <w:r>
         <w:rPr>
           <w:i/>
           <w:iCs/>
         </w:rPr>
-        <w:t>S. maliger</w:t>
-      </w:r>
-      <w:r>
-        <w:t xml:space="preserve">, china </w:t>
+        <w:t>pinniger</w:t>
+      </w:r>
+      <w:proofErr w:type="spellEnd"/>
+      <w:r>
+        <w:t xml:space="preserve">, quillback </w:t>
+      </w:r>
+      <w:r>
+        <w:rPr>
+          <w:i/>
+          <w:iCs/>
+        </w:rPr>
+        <w:t xml:space="preserve">S. </w:t>
+      </w:r>
+      <w:proofErr w:type="spellStart"/>
+      <w:r>
+        <w:rPr>
+          <w:i/>
+          <w:iCs/>
+        </w:rPr>
+        <w:t>maliger</w:t>
+      </w:r>
+      <w:proofErr w:type="spellEnd"/>
+      <w:r>
+        <w:t xml:space="preserve">, </w:t>
+      </w:r>
+      <w:proofErr w:type="spellStart"/>
+      <w:r>
+        <w:t>china</w:t>
+      </w:r>
+      <w:proofErr w:type="spellEnd"/>
+      <w:r>
+        <w:t xml:space="preserve"> </w:t>
       </w:r>
       <w:r>
         <w:rPr>
@@ -1999,28 +2157,63 @@
           <w:i/>
           <w:iCs/>
         </w:rPr>
-        <w:t>S. caurinus</w:t>
-      </w:r>
-      <w:r>
-        <w:t xml:space="preserve">, rosethorn </w:t>
-      </w:r>
+        <w:t xml:space="preserve">S. </w:t>
+      </w:r>
+      <w:proofErr w:type="spellStart"/>
       <w:r>
         <w:rPr>
           <w:i/>
           <w:iCs/>
         </w:rPr>
-        <w:t>S. helvomaculatus</w:t>
-      </w:r>
-      <w:r>
-        <w:t xml:space="preserve"> and tiger </w:t>
+        <w:t>caurinus</w:t>
+      </w:r>
+      <w:proofErr w:type="spellEnd"/>
+      <w:r>
+        <w:t xml:space="preserve">, </w:t>
+      </w:r>
+      <w:proofErr w:type="spellStart"/>
+      <w:r>
+        <w:t>rosethorn</w:t>
+      </w:r>
+      <w:proofErr w:type="spellEnd"/>
+      <w:r>
+        <w:t xml:space="preserve"> </w:t>
       </w:r>
       <w:r>
         <w:rPr>
           <w:i/>
           <w:iCs/>
         </w:rPr>
-        <w:t>S. nigrocinctus</w:t>
-      </w:r>
+        <w:t xml:space="preserve">S. </w:t>
+      </w:r>
+      <w:proofErr w:type="spellStart"/>
+      <w:r>
+        <w:rPr>
+          <w:i/>
+          <w:iCs/>
+        </w:rPr>
+        <w:t>helvomaculatus</w:t>
+      </w:r>
+      <w:proofErr w:type="spellEnd"/>
+      <w:r>
+        <w:t xml:space="preserve"> and tiger </w:t>
+      </w:r>
+      <w:r>
+        <w:rPr>
+          <w:i/>
+          <w:iCs/>
+        </w:rPr>
+        <w:t xml:space="preserve">S. </w:t>
+      </w:r>
+      <w:proofErr w:type="spellStart"/>
+      <w:r>
+        <w:rPr>
+          <w:i/>
+          <w:iCs/>
+        </w:rPr>
+        <w:t>nigrocinctus</w:t>
+      </w:r>
+      <w:proofErr w:type="spellEnd"/>
       <w:r>
         <w:t xml:space="preserve"> rockfish); Southeast only, and,</w:t>
       </w:r>
@@ -2034,37 +2227,101 @@
         </w:numPr>
       </w:pPr>
       <w:r>
-        <w:t xml:space="preserve">slope rockfish (redbanded </w:t>
+        <w:t>slope rockfish (</w:t>
+      </w:r>
+      <w:proofErr w:type="spellStart"/>
+      <w:r>
+        <w:t>redbanded</w:t>
+      </w:r>
+      <w:proofErr w:type="spellEnd"/>
+      <w:r>
+        <w:t xml:space="preserve"> </w:t>
       </w:r>
       <w:r>
         <w:rPr>
           <w:i/>
           <w:iCs/>
         </w:rPr>
-        <w:t>S. babcocki</w:t>
-      </w:r>
-      <w:r>
-        <w:t xml:space="preserve"> , rougheye </w:t>
-      </w:r>
+        <w:t xml:space="preserve">S. </w:t>
+      </w:r>
+      <w:proofErr w:type="spellStart"/>
+      <w:proofErr w:type="gramStart"/>
       <w:r>
         <w:rPr>
           <w:i/>
           <w:iCs/>
         </w:rPr>
-        <w:t>S. aleutianus</w:t>
-      </w:r>
-      <w:r>
-        <w:t xml:space="preserve">, silvergray </w:t>
+        <w:t>babcocki</w:t>
+      </w:r>
+      <w:proofErr w:type="spellEnd"/>
+      <w:r>
+        <w:t xml:space="preserve"> ,</w:t>
+      </w:r>
+      <w:proofErr w:type="gramEnd"/>
+      <w:r>
+        <w:t xml:space="preserve"> </w:t>
+      </w:r>
+      <w:proofErr w:type="spellStart"/>
+      <w:r>
+        <w:t>rougheye</w:t>
+      </w:r>
+      <w:proofErr w:type="spellEnd"/>
+      <w:r>
+        <w:t xml:space="preserve"> </w:t>
       </w:r>
       <w:r>
         <w:rPr>
           <w:i/>
           <w:iCs/>
         </w:rPr>
-        <w:t>S. brevispinis</w:t>
-      </w:r>
-      <w:r>
-        <w:t xml:space="preserve">, shortraker </w:t>
+        <w:t xml:space="preserve">S. </w:t>
+      </w:r>
+      <w:proofErr w:type="spellStart"/>
+      <w:r>
+        <w:rPr>
+          <w:i/>
+          <w:iCs/>
+        </w:rPr>
+        <w:t>aleutianus</w:t>
+      </w:r>
+      <w:proofErr w:type="spellEnd"/>
+      <w:r>
+        <w:t xml:space="preserve">, </w:t>
+      </w:r>
+      <w:proofErr w:type="spellStart"/>
+      <w:r>
+        <w:t>silvergray</w:t>
+      </w:r>
+      <w:proofErr w:type="spellEnd"/>
+      <w:r>
+        <w:t xml:space="preserve"> </w:t>
+      </w:r>
+      <w:r>
+        <w:rPr>
+          <w:i/>
+          <w:iCs/>
+        </w:rPr>
+        <w:t xml:space="preserve">S. </w:t>
+      </w:r>
+      <w:proofErr w:type="spellStart"/>
+      <w:r>
+        <w:rPr>
+          <w:i/>
+          <w:iCs/>
+        </w:rPr>
+        <w:t>brevispinis</w:t>
+      </w:r>
+      <w:proofErr w:type="spellEnd"/>
+      <w:r>
+        <w:t xml:space="preserve">, </w:t>
+      </w:r>
+      <w:proofErr w:type="spellStart"/>
+      <w:r>
+        <w:t>shortraker</w:t>
+      </w:r>
+      <w:proofErr w:type="spellEnd"/>
+      <w:r>
+        <w:t xml:space="preserve"> </w:t>
       </w:r>
       <w:r>
         <w:rPr>
@@ -2081,18 +2338,36 @@
           <w:i/>
           <w:iCs/>
         </w:rPr>
-        <w:t>S. miniatus</w:t>
-      </w:r>
-      <w:r>
-        <w:t xml:space="preserve">, and bocaccio </w:t>
-      </w:r>
+        <w:t xml:space="preserve">S. </w:t>
+      </w:r>
+      <w:proofErr w:type="spellStart"/>
       <w:r>
         <w:rPr>
           <w:i/>
           <w:iCs/>
         </w:rPr>
-        <w:t>S. pauciscpinis</w:t>
-      </w:r>
+        <w:t>miniatus</w:t>
+      </w:r>
+      <w:proofErr w:type="spellEnd"/>
+      <w:r>
+        <w:t xml:space="preserve">, and bocaccio </w:t>
+      </w:r>
+      <w:r>
+        <w:rPr>
+          <w:i/>
+          <w:iCs/>
+        </w:rPr>
+        <w:t xml:space="preserve">S. </w:t>
+      </w:r>
+      <w:proofErr w:type="spellStart"/>
+      <w:r>
+        <w:rPr>
+          <w:i/>
+          <w:iCs/>
+        </w:rPr>
+        <w:t>pauciscpinis</w:t>
+      </w:r>
+      <w:proofErr w:type="spellEnd"/>
       <w:r>
         <w:t xml:space="preserve"> rockfish); Southeast only.</w:t>
       </w:r>
@@ -2101,14 +2376,14 @@
       <w:pPr>
         <w:pStyle w:val="Heading1"/>
       </w:pPr>
-      <w:bookmarkStart w:id="19" w:name="study-area"/>
-      <w:bookmarkStart w:id="20" w:name="_Toc242785273"/>
-      <w:bookmarkEnd w:id="15"/>
+      <w:bookmarkStart w:id="19" w:name="_Toc242785273"/>
+      <w:bookmarkStart w:id="20" w:name="study-area"/>
+      <w:bookmarkEnd w:id="16"/>
       <w:r>
         <w:lastRenderedPageBreak/>
         <w:t>Study Area</w:t>
       </w:r>
-      <w:bookmarkEnd w:id="20"/>
+      <w:bookmarkEnd w:id="19"/>
     </w:p>
     <w:p>
       <w:pPr>
@@ -2123,31 +2398,39 @@
         <w:pStyle w:val="BodyText"/>
       </w:pPr>
       <w:r>
-        <w:t>Several of the westward and Kodiak subdistricts have little data and necessitated pooling for this analysis (Figure 4 KOD_CFMUs). In addition to the Afognak, Eastside and Northeast CFMUs which contained adequate data, the Westside and Mainland districts were pooled to form the Western Kodiak management area (WKMA) while the Southeast, Southwest, Chignik and South Alaska Peninsula (SAKPEN) districts were pooled into a CFMU called SOKO2PEN. Lastly the Aleatian and Bering Sea CFMUs were pooled into the BSAI CFMU and included in the Kodiak region.</w:t>
+        <w:t xml:space="preserve">Several of the westward and Kodiak subdistricts have little data and necessitated pooling for this analysis (Figure 4 KOD_CFMUs). In addition to the Afognak, Eastside and Northeast CFMUs which contained adequate data, the Westside and Mainland districts were pooled to form the Western Kodiak management area (WKMA) while the Southeast, Southwest, Chignik and South Alaska Peninsula (SAKPEN) districts were pooled into a CFMU called SOKO2PEN. Lastly the </w:t>
+      </w:r>
+      <w:proofErr w:type="spellStart"/>
+      <w:r>
+        <w:t>Aleatian</w:t>
+      </w:r>
+      <w:proofErr w:type="spellEnd"/>
+      <w:r>
+        <w:t xml:space="preserve"> and Bering Sea CFMUs were pooled into the BSAI CFMU and included in the Kodiak region.</w:t>
       </w:r>
     </w:p>
     <w:p>
       <w:pPr>
         <w:pStyle w:val="Heading1"/>
       </w:pPr>
-      <w:bookmarkStart w:id="21" w:name="methods"/>
-      <w:bookmarkStart w:id="22" w:name="_Toc242785274"/>
-      <w:bookmarkEnd w:id="19"/>
+      <w:bookmarkStart w:id="21" w:name="_Toc242785274"/>
+      <w:bookmarkStart w:id="22" w:name="methods"/>
+      <w:bookmarkEnd w:id="20"/>
       <w:r>
         <w:t>Methods</w:t>
       </w:r>
-      <w:bookmarkEnd w:id="22"/>
+      <w:bookmarkEnd w:id="21"/>
     </w:p>
     <w:p>
       <w:pPr>
         <w:pStyle w:val="Heading2"/>
       </w:pPr>
-      <w:bookmarkStart w:id="23" w:name="data"/>
-      <w:bookmarkStart w:id="24" w:name="_Toc242785275"/>
+      <w:bookmarkStart w:id="23" w:name="_Toc242785275"/>
+      <w:bookmarkStart w:id="24" w:name="data"/>
       <w:r>
         <w:t>Data</w:t>
       </w:r>
-      <w:bookmarkEnd w:id="24"/>
+      <w:bookmarkEnd w:id="23"/>
     </w:p>
     <w:p>
       <w:pPr>
@@ -2172,10 +2455,7 @@
       </w:del>
       <w:ins w:id="27" w:author="Joy, Philip J (DFG)" w:date="2026-10-13T14:06:00Z" w16du:dateUtc="2026-10-13T22:06:00Z">
         <w:r>
-          <w:t>are</w:t>
-        </w:r>
-        <w:r>
-          <w:t xml:space="preserve"> </w:t>
+          <w:t xml:space="preserve">are </w:t>
         </w:r>
       </w:ins>
       <w:r>
@@ -2262,7 +2542,15 @@
         </w:r>
       </w:ins>
       <w:r>
-        <w:t xml:space="preserve">the total catch minus the harvest and </w:t>
+        <w:t xml:space="preserve">the total catch minus the </w:t>
+      </w:r>
+      <w:proofErr w:type="gramStart"/>
+      <w:r>
+        <w:t>harvest</w:t>
+      </w:r>
+      <w:proofErr w:type="gramEnd"/>
+      <w:r>
+        <w:t xml:space="preserve"> and </w:t>
       </w:r>
       <w:r>
         <w:lastRenderedPageBreak/>
@@ -2518,7 +2806,15 @@
         <w:pStyle w:val="FirstParagraph"/>
       </w:pPr>
       <w:r>
-        <w:t xml:space="preserve">The department’s port sampling program provides data on the species composition of the catch, biological data on individual fish that includes length, weight, sex, and otolith samples (for aging), and interview data on the relative number of fish harvested and released, all stratified by user group (unguided/private or guided/charter). In Southcentral and Kodiak regions port sampling also collects data on the depth of capture and release and weather a deepwater release mechanism (DRM) was used. The location of capture for biological and interview data is reported by ADF&amp;G groundfish statistical areas. Port sampling data exists from Southcentral and Kodiak areas since 1996 and from Southeast Alaska areas since 2006 (McKean and Ford 2025; Richards et al. 2025; Jaenicke et al. 2019; Failor 2016). Port sampling data in Southcentral and Kodiak areas is subdivided by the number of total rockfish, pelagic and non-pelagic rockfish, black rockfish and yelloweye rockfish. In the Southeast region, species data is further subdivided into demersal shelf (DSR, of which yelloweye </w:t>
+        <w:t xml:space="preserve">The department’s port sampling program provides data on the species composition of the catch, biological data on individual fish that includes length, weight, sex, and otolith samples (for aging), and interview data on the relative number of fish harvested and released, all stratified by user group (unguided/private or guided/charter). In Southcentral and Kodiak regions port sampling also collects data on the depth of capture and release and weather a deepwater release mechanism (DRM) was used. The location of capture for biological and interview data is reported by ADF&amp;G groundfish statistical areas. Port sampling data exists from Southcentral and Kodiak areas since 1996 and from Southeast Alaska areas since 2006 (McKean and Ford 2025; Richards et al. 2025; Jaenicke et al. 2019; Failor 2016). Port sampling data in Southcentral and Kodiak areas is subdivided by the number of total rockfish, pelagic and non-pelagic rockfish, black rockfish and yelloweye rockfish. In the Southeast region, species data is further subdivided into demersal </w:t>
+      </w:r>
+      <w:proofErr w:type="gramStart"/>
+      <w:r>
+        <w:t>shelf</w:t>
+      </w:r>
+      <w:proofErr w:type="gramEnd"/>
+      <w:r>
+        <w:t xml:space="preserve"> (DSR, of which yelloweye </w:t>
       </w:r>
       <w:ins w:id="40" w:author="Joy, Philip J (DFG)" w:date="2026-10-13T14:09:00Z" w16du:dateUtc="2026-10-13T22:09:00Z">
         <w:r>
@@ -2535,14 +2831,27 @@
       </w:del>
       <w:ins w:id="42" w:author="Joy, Philip J (DFG)" w:date="2026-10-13T14:10:00Z" w16du:dateUtc="2026-10-13T22:10:00Z">
         <w:r>
-          <w:t>S</w:t>
-        </w:r>
-        <w:r>
-          <w:t xml:space="preserve">outhcentral </w:t>
+          <w:t xml:space="preserve">Southcentral </w:t>
         </w:r>
       </w:ins>
       <w:r>
-        <w:t>and Kodiak regions sampling is conducted from mid-May through the end of August each year. Fishing for rockfish occurs year-round but is primarily conducted in the summer months, with the sampled time period capturing the majority of the harvest.</w:t>
+        <w:t xml:space="preserve">and Kodiak regions sampling is conducted from mid-May through the end of August each year. Fishing for rockfish occurs year-round but is primarily conducted in the summer months, with the sampled </w:t>
+      </w:r>
+      <w:proofErr w:type="gramStart"/>
+      <w:r>
+        <w:t>time period</w:t>
+      </w:r>
+      <w:proofErr w:type="gramEnd"/>
+      <w:r>
+        <w:t xml:space="preserve"> capturing </w:t>
+      </w:r>
+      <w:proofErr w:type="gramStart"/>
+      <w:r>
+        <w:t>the majority of</w:t>
+      </w:r>
+      <w:proofErr w:type="gramEnd"/>
+      <w:r>
+        <w:t xml:space="preserve"> the harvest.</w:t>
       </w:r>
     </w:p>
     <w:p>
@@ -2597,13 +2906,7 @@
       </w:del>
       <w:ins w:id="46" w:author="Joy, Philip J (DFG)" w:date="2026-10-13T14:11:00Z" w16du:dateUtc="2026-10-13T22:11:00Z">
         <w:r>
-          <w:t>w</w:t>
-        </w:r>
-        <w:r>
-          <w:t>he</w:t>
-        </w:r>
-        <w:r>
-          <w:t xml:space="preserve">ther </w:t>
+          <w:t xml:space="preserve">whether </w:t>
         </w:r>
       </w:ins>
       <w:r>
@@ -2657,7 +2960,15 @@
         <w:pStyle w:val="FirstParagraph"/>
       </w:pPr>
       <w:r>
-        <w:t xml:space="preserve">Port sampling programs also provide the data necessary to convert fish numbers to biomass. All rockfish are sampled for length and in Southcentral Alaska a subsample are weighed. All measured fish that were not individually weighed have weights estimated using a weight ~ length regression. In southcentral and Kodiak regions the weight ~ length relationship for black and yelloweye rockfish is estimated from samples with recorded weights collected between 1996 and 2021 such that the predicted weight is related to the measured length, </w:t>
+        <w:t xml:space="preserve">Port sampling programs also provide the data necessary to convert fish numbers to biomass. All rockfish are sampled for length and in Southcentral Alaska a subsample </w:t>
+      </w:r>
+      <w:proofErr w:type="gramStart"/>
+      <w:r>
+        <w:t>are</w:t>
+      </w:r>
+      <w:proofErr w:type="gramEnd"/>
+      <w:r>
+        <w:t xml:space="preserve"> weighed. All measured fish that were not individually weighed have weights estimated using a weight ~ length regression. In southcentral and Kodiak regions the weight ~ length relationship for black and yelloweye rockfish is estimated from samples with recorded weights collected between 1996 and 2021 such that the predicted weight is related to the measured length, </w:t>
       </w:r>
       <w:r>
         <w:rPr>
@@ -2783,7 +3094,15 @@
       </w:r>
       <w:r>
         <w:lastRenderedPageBreak/>
-        <w:t>minimum sample size of 10 fish from 4 unique vessels was used as cutoff to include in the model. Although this is a small sample size, the hierarchical nature of the model means that annual estimates would regress towards the long term mean when sample sizes are small or absent in any given year.</w:t>
+        <w:t xml:space="preserve">minimum sample size of 10 fish from 4 unique vessels was used as cutoff to include in the model. Although this is a small sample size, the hierarchical nature of the model means that annual estimates would regress towards the long term </w:t>
+      </w:r>
+      <w:proofErr w:type="gramStart"/>
+      <w:r>
+        <w:t>mean</w:t>
+      </w:r>
+      <w:proofErr w:type="gramEnd"/>
+      <w:r>
+        <w:t xml:space="preserve"> when sample sizes are small or absent in any given year.</w:t>
       </w:r>
     </w:p>
     <w:p>
@@ -2791,7 +3110,15 @@
         <w:pStyle w:val="BodyText"/>
       </w:pPr>
       <w:r>
-        <w:t xml:space="preserve">The variance of the mean weight used in the model uses the bootstrap estimate of the standard deviation of the mean. Because the model uses the mean weight to convert from numbers to biomass it is the uncertainty in the estimate of the true mean that is relevant and not the </w:t>
+        <w:t xml:space="preserve">The variance of the mean weight used in the model uses the bootstrap estimate of the standard deviation of the mean. Because the model uses the mean weight to convert from numbers to biomass it is the uncertainty in the estimate of the true </w:t>
+      </w:r>
+      <w:proofErr w:type="gramStart"/>
+      <w:r>
+        <w:t>mean</w:t>
+      </w:r>
+      <w:proofErr w:type="gramEnd"/>
+      <w:r>
+        <w:t xml:space="preserve"> that is relevant and not the </w:t>
       </w:r>
       <w:del w:id="52" w:author="Joy, Philip J (DFG)" w:date="2026-10-13T14:15:00Z" w16du:dateUtc="2026-10-13T22:15:00Z">
         <w:r>
@@ -2800,10 +3127,7 @@
       </w:del>
       <w:ins w:id="53" w:author="Joy, Philip J (DFG)" w:date="2026-10-13T14:15:00Z" w16du:dateUtc="2026-10-13T22:15:00Z">
         <w:r>
-          <w:t>range</w:t>
-        </w:r>
-        <w:r>
-          <w:t xml:space="preserve"> </w:t>
+          <w:t xml:space="preserve">range </w:t>
         </w:r>
       </w:ins>
       <w:r>
@@ -2815,7 +3139,15 @@
         <w:pStyle w:val="BodyText"/>
       </w:pPr>
       <w:r>
-        <w:t xml:space="preserve">Sampling in Southeast Alaska is not proportional to the distribution of the catch and as such uses a 4-stage weighted average procedure to estimate mean weights (Richards et al. 2025). The 4-stage approach is detailed in Richards et al. (2025) but as of this writing historical weight estimates prior to 2025 are being reevaluated and are unavailable. As such weight estimates prior to 2025 use bootstrapped mean weights similar to Southcentral methods but are to be considered </w:t>
+        <w:t xml:space="preserve">Sampling in Southeast Alaska is not proportional to the distribution of the catch and as such uses a 4-stage weighted average procedure to estimate mean weights (Richards et al. 2025). The 4-stage approach is detailed in Richards et al. (2025) but as of this writing historical weight estimates prior to 2025 are being reevaluated and are unavailable. As such weight estimates prior to 2025 use bootstrapped mean weights </w:t>
+      </w:r>
+      <w:proofErr w:type="gramStart"/>
+      <w:r>
+        <w:t>similar to</w:t>
+      </w:r>
+      <w:proofErr w:type="gramEnd"/>
+      <w:r>
+        <w:t xml:space="preserve"> Southcentral methods but are to be considered </w:t>
       </w:r>
       <w:r>
         <w:rPr>
@@ -2843,7 +3175,39 @@
         <w:pStyle w:val="FirstParagraph"/>
       </w:pPr>
       <w:r>
-        <w:t>An auxiliary data set was used to further inform the species composition in Kodiak samples. Port sampling for outlying areas in Kodiak are unavailable to inform species compositions and thus are largely reliant on the hierarchichal structure of the model to derive estimates from the sampled areas. However, ADF&amp;G commercial fisheries division has a robust hydroacoustic survey around the island to estimate black rockfish abundance and as part of that survey stereoscopic cameras are used to estimates species compositions of the surveyed pelagic rockfish communities (Tschersich et al. 2023). The species apportionment data from those cameras was used as supplemental data in this model to further inform the species composition in the Kodiak CFMUs.</w:t>
+        <w:t xml:space="preserve">An auxiliary data set was used to further inform the </w:t>
+      </w:r>
+      <w:proofErr w:type="gramStart"/>
+      <w:r>
+        <w:t>species</w:t>
+      </w:r>
+      <w:proofErr w:type="gramEnd"/>
+      <w:r>
+        <w:t xml:space="preserve"> composition in Kodiak samples. Port sampling for outlying areas in Kodiak </w:t>
+      </w:r>
+      <w:proofErr w:type="gramStart"/>
+      <w:r>
+        <w:t>are</w:t>
+      </w:r>
+      <w:proofErr w:type="gramEnd"/>
+      <w:r>
+        <w:t xml:space="preserve"> unavailable to inform species compositions and thus are largely reliant on the </w:t>
+      </w:r>
+      <w:proofErr w:type="spellStart"/>
+      <w:r>
+        <w:t>hierarchichal</w:t>
+      </w:r>
+      <w:proofErr w:type="spellEnd"/>
+      <w:r>
+        <w:t xml:space="preserve"> structure of the model to derive estimates from the sampled areas. However, ADF&amp;G commercial fisheries division has a robust hydroacoustic survey around the island to estimate black rockfish abundance and as part of that survey stereoscopic cameras are used to </w:t>
+      </w:r>
+      <w:proofErr w:type="gramStart"/>
+      <w:r>
+        <w:t>estimates</w:t>
+      </w:r>
+      <w:proofErr w:type="gramEnd"/>
+      <w:r>
+        <w:t xml:space="preserve"> species compositions of the surveyed pelagic rockfish communities (Tschersich et al. 2023). The species apportionment data from those cameras was used as supplemental data in this model to further inform the species composition in the Kodiak CFMUs.</w:t>
       </w:r>
     </w:p>
     <w:p>
@@ -2869,7 +3233,23 @@
         </w:r>
       </w:del>
       <w:r>
-        <w:t xml:space="preserve">evident. Management action taken by the department was relatively light prior to 2020 and harvest and release trends can be assumed to follow a mostly organic process as these fisheries developed over time. Beginning in 2020 the department began taking stronger management actions to curtail rockfish harvests, including fishery closures and more severe bag limit reductions (Arthur et al 2024; Blain-Roth et al. 2024; Polum et al. 2025). These regulatory changes altered angler behavior with regard to retention probabilities and species composition of the harvest and thus angler behavior during the modern period would not be informative to angler behavior in the past. While the process remains </w:t>
+        <w:t xml:space="preserve">evident. Management action taken by the department was relatively light prior to 2020 and harvest and release trends can be assumed to follow a mostly organic process as these fisheries developed over time. Beginning in </w:t>
+      </w:r>
+      <w:proofErr w:type="gramStart"/>
+      <w:r>
+        <w:t>2020</w:t>
+      </w:r>
+      <w:proofErr w:type="gramEnd"/>
+      <w:r>
+        <w:t xml:space="preserve"> the department began taking stronger management actions to curtail rockfish harvests, including fishery closures and more severe bag limit reductions (Arthur et al 2024; Blain-Roth et al. 2024; Polum et al. 2025). These regulatory changes altered angler behavior </w:t>
+      </w:r>
+      <w:proofErr w:type="gramStart"/>
+      <w:r>
+        <w:t>with regard to</w:t>
+      </w:r>
+      <w:proofErr w:type="gramEnd"/>
+      <w:r>
+        <w:t xml:space="preserve"> retention probabilities and species composition of the harvest and thus angler behavior during the modern period would not be informative to angler behavior in the past. While the process remains </w:t>
       </w:r>
       <w:r>
         <w:lastRenderedPageBreak/>
@@ -2880,14 +3260,14 @@
       <w:pPr>
         <w:pStyle w:val="Heading2"/>
       </w:pPr>
-      <w:bookmarkStart w:id="57" w:name="process-equations"/>
-      <w:bookmarkStart w:id="58" w:name="_Toc242785276"/>
-      <w:bookmarkEnd w:id="23"/>
+      <w:bookmarkStart w:id="57" w:name="_Toc242785276"/>
+      <w:bookmarkStart w:id="58" w:name="process-equations"/>
+      <w:bookmarkEnd w:id="24"/>
       <w:bookmarkEnd w:id="55"/>
       <w:r>
         <w:t>Process equations</w:t>
       </w:r>
-      <w:bookmarkEnd w:id="58"/>
+      <w:bookmarkEnd w:id="57"/>
     </w:p>
     <w:p>
       <w:pPr>
@@ -2966,6 +3346,7 @@
       <w:r>
         <w:t xml:space="preserve"> refers to the species or species complex). Release estimates are based on the proportion of total catches that were harvested by user group, area, year and species/species complex, also referred to as the retention probability or the proportion-harvested, </w:t>
       </w:r>
+      <w:proofErr w:type="spellStart"/>
       <w:r>
         <w:rPr>
           <w:i/>
@@ -2974,7 +3355,11 @@
         <w:t>pH</w:t>
       </w:r>
       <w:r>
-        <w:t>. Numbers of fish are converted to biomass based on mean annual weights and total sport fish mortality is the sum of the harvest weights plus the proportion of releases that are expected to die based on release mortality rates (Jarvis and Lowe 2008; Hochhalter and Reed 2011; Blain and Sutton 2016; Blain-Roth and Sutton 2019). The equations describing this process are as follows.</w:t>
+        <w:t>.</w:t>
+      </w:r>
+      <w:proofErr w:type="spellEnd"/>
+      <w:r>
+        <w:t xml:space="preserve"> Numbers of fish are converted to biomass based on mean annual weights and total sport fish mortality is the sum of the harvest weights plus the proportion of releases that are expected to die based on release mortality rates (Jarvis and Lowe 2008; Hochhalter and Reed 2011; Blain and Sutton 2016; Blain-Roth and Sutton 2019). The equations describing this process are as follows.</w:t>
       </w:r>
     </w:p>
     <w:p>
@@ -5635,7 +6020,15 @@
         </m:sSub>
       </m:oMath>
       <w:r>
-        <w:t xml:space="preserve"> are the fractions of the annual harvest of non-pelagic rockfish for each area and user group that were DSR and slope rockfish, respectively. Although yelloweye rockfish are technically part of the DSR assemblage, in this analysis DSR do not include yelloweye rockfish.</w:t>
+        <w:t xml:space="preserve"> are the fractions of the annual harvest of non-pelagic rockfish for each area and user group that were DSR and slope rockfish, respectively. Although yelloweye rockfish are technically part of the DSR assemblage, in this analysis DSR </w:t>
+      </w:r>
+      <w:proofErr w:type="gramStart"/>
+      <w:r>
+        <w:t>do</w:t>
+      </w:r>
+      <w:proofErr w:type="gramEnd"/>
+      <w:r>
+        <w:t xml:space="preserve"> not include yelloweye rockfish.</w:t>
       </w:r>
     </w:p>
     <w:p>
@@ -6030,7 +6423,15 @@
         </m:d>
       </m:oMath>
       <w:r>
-        <w:t xml:space="preserve"> is an index variable which is 1 when the user groups is private and 0 otherwise, and </w:t>
+        <w:t xml:space="preserve"> is an index variable which is 1 when the user groups </w:t>
+      </w:r>
+      <w:proofErr w:type="gramStart"/>
+      <w:r>
+        <w:t>is</w:t>
+      </w:r>
+      <w:proofErr w:type="gramEnd"/>
+      <w:r>
+        <w:t xml:space="preserve"> private and 0 otherwise, and </w:t>
       </w:r>
       <m:oMath>
         <m:r>
@@ -6279,7 +6680,15 @@
       </w:r>
       <w:r>
         <w:lastRenderedPageBreak/>
-        <w:t xml:space="preserve">account for shifts in the species composition during the observed time period but would not extrapolate beyond the limits of the observed data when hindcasting. The logistic curve was fit to data through 2019 and ignored data after that point. Thus, the composition parameters </w:t>
+        <w:t xml:space="preserve">account for shifts in the species composition during the observed </w:t>
+      </w:r>
+      <w:proofErr w:type="gramStart"/>
+      <w:r>
+        <w:t>time period</w:t>
+      </w:r>
+      <w:proofErr w:type="gramEnd"/>
+      <w:r>
+        <w:t xml:space="preserve"> but would not extrapolate beyond the limits of the observed data when hindcasting. The logistic curve was fit to data through 2019 and ignored data after that point. Thus, the composition parameters </w:t>
       </w:r>
       <m:oMath>
         <m:sSub>
@@ -7020,8 +7429,13 @@
         </m:r>
       </m:oMath>
       <w:r>
-        <w:t xml:space="preserve"> terms were readily estimated and required only vague priors where</w:t>
-      </w:r>
+        <w:t xml:space="preserve"> terms were readily estimated and required only vague priors </w:t>
+      </w:r>
+      <w:proofErr w:type="gramStart"/>
+      <w:r>
+        <w:t>where</w:t>
+      </w:r>
+      <w:proofErr w:type="gramEnd"/>
     </w:p>
     <w:p>
       <w:pPr>
@@ -7284,7 +7698,15 @@
         </m:r>
       </m:oMath>
       <w:r>
-        <w:t xml:space="preserve"> term was sometimes provided a prior that reflected the direction of the curve to speed convergence. Thus, </w:t>
+        <w:t xml:space="preserve"> term was sometimes </w:t>
+      </w:r>
+      <w:proofErr w:type="gramStart"/>
+      <w:r>
+        <w:t>provided</w:t>
+      </w:r>
+      <w:proofErr w:type="gramEnd"/>
+      <w:r>
+        <w:t xml:space="preserve"> a prior that reflected the direction of the curve to speed convergence. Thus, </w:t>
       </w:r>
       <m:oMath>
         <m:r>
@@ -7767,7 +8189,15 @@
         <w:pStyle w:val="BodyText"/>
       </w:pPr>
       <w:r>
-        <w:t>for all areas and species assemblages other than Southeast pelagics which were given a prior of</w:t>
+        <w:t xml:space="preserve">for all areas and species assemblages other than Southeast </w:t>
+      </w:r>
+      <w:proofErr w:type="spellStart"/>
+      <w:r>
+        <w:t>pelagics</w:t>
+      </w:r>
+      <w:proofErr w:type="spellEnd"/>
+      <w:r>
+        <w:t xml:space="preserve"> which were given a prior of</w:t>
       </w:r>
     </w:p>
     <w:p>
@@ -7921,7 +8351,15 @@
         </m:r>
       </m:oMath>
       <w:r>
-        <w:t>) bracketed by the time period during which data was available.</w:t>
+        <w:t xml:space="preserve">) bracketed by the </w:t>
+      </w:r>
+      <w:proofErr w:type="gramStart"/>
+      <w:r>
+        <w:t>time period</w:t>
+      </w:r>
+      <w:proofErr w:type="gramEnd"/>
+      <w:r>
+        <w:t xml:space="preserve"> during which data was available.</w:t>
       </w:r>
     </w:p>
     <w:p>
@@ -8012,7 +8450,15 @@
         </m:sSub>
       </m:oMath>
       <w:r>
-        <w:t xml:space="preserve"> term in equation XX and XX is a random effect describing the deviation from the fitted line. The random effect terms were forced to sum to zero for discrete periods that align with the available data and the period used to inform the hindcasting portion of the model. Thus, for each time period between year </w:t>
+        <w:t xml:space="preserve"> term in equation XX and XX is a random effect describing the deviation from the fitted line. The random effect terms were forced to sum to zero for discrete periods that align with the available data and the period used to inform the hindcasting portion of the model. Thus, for each </w:t>
+      </w:r>
+      <w:proofErr w:type="gramStart"/>
+      <w:r>
+        <w:t>time period</w:t>
+      </w:r>
+      <w:proofErr w:type="gramEnd"/>
+      <w:r>
+        <w:t xml:space="preserve"> between year </w:t>
       </w:r>
       <m:oMath>
         <m:sSub>
@@ -8399,9 +8845,11 @@
       <w:pPr>
         <w:pStyle w:val="BodyText"/>
       </w:pPr>
+      <w:proofErr w:type="gramStart"/>
       <w:r>
         <w:t>where</w:t>
       </w:r>
+      <w:proofErr w:type="gramEnd"/>
     </w:p>
     <w:p>
       <w:pPr>
@@ -8698,7 +9146,23 @@
         </w:r>
       </w:ins>
       <w:r>
-        <w:t>DATA). The second period consisted of the data informed time series through 2019. The third period consisted of 2020 through the present. It was necessary to divide the time series in this manner to ensure that the fit curves were forced through the data. The recent time period was separated to stay consistent with the rest of the model and ensure that the recent period that included management measures did not affect hindcasting. The pre-2020 period necessitated separating the random effects between the periods with and without data to prevent the model from fitting a line that resulted in all of the random effects in the data period being positive or negative and balanced out by the reverse estimates in the pre-data period. Note that the time-blocking that is used for the</w:t>
+        <w:t xml:space="preserve">DATA). The second period consisted of the data informed time series through 2019. The third period consisted of 2020 through the present. It was necessary to divide the time series in this manner to ensure that the fit curves were forced through the data. The recent </w:t>
+      </w:r>
+      <w:proofErr w:type="gramStart"/>
+      <w:r>
+        <w:t>time period</w:t>
+      </w:r>
+      <w:proofErr w:type="gramEnd"/>
+      <w:r>
+        <w:t xml:space="preserve"> was separated to stay consistent with the rest of the model and ensure that the recent period that included management measures did not affect hindcasting. The pre-2020 period necessitated separating the random effects between the periods with and without data to prevent the model from fitting a line that resulted in </w:t>
+      </w:r>
+      <w:proofErr w:type="gramStart"/>
+      <w:r>
+        <w:t>all of</w:t>
+      </w:r>
+      <w:proofErr w:type="gramEnd"/>
+      <w:r>
+        <w:t xml:space="preserve"> the random effects in the data period being positive or negative and balanced out by the reverse estimates in the pre-data period. Note that the time-blocking that is used for the</w:t>
       </w:r>
       <w:ins w:id="69" w:author="Joy, Philip J (DFG)" w:date="2026-10-13T14:26:00Z" w16du:dateUtc="2026-10-13T22:26:00Z">
         <w:r>
@@ -8766,7 +9230,15 @@
         </m:sSub>
       </m:oMath>
       <w:r>
-        <w:t xml:space="preserve"> parameter to address the change in management in Southeast Alaska in 2025 carries forth to the random effects as well. Thus for Southeast Alaska, the third period extends from 2020 through 2024 with a fourth period beginning in 2025.</w:t>
+        <w:t xml:space="preserve"> parameter to address the change in management in Southeast Alaska in 2025 carries forth to the random effects as well. </w:t>
+      </w:r>
+      <w:proofErr w:type="gramStart"/>
+      <w:r>
+        <w:t>Thus</w:t>
+      </w:r>
+      <w:proofErr w:type="gramEnd"/>
+      <w:r>
+        <w:t xml:space="preserve"> for Southeast Alaska, the third period extends from 2020 through 2024 with a fourth period beginning in 2025.</w:t>
       </w:r>
     </w:p>
     <w:p>
@@ -8774,7 +9246,15 @@
         <w:pStyle w:val="BodyText"/>
       </w:pPr>
       <w:r>
-        <w:t xml:space="preserve">When there was no discernible change in composition over the observed time period </w:t>
+        <w:t xml:space="preserve">When there was no discernible change in composition over the observed </w:t>
+      </w:r>
+      <w:proofErr w:type="gramStart"/>
+      <w:r>
+        <w:t>time period</w:t>
+      </w:r>
+      <w:proofErr w:type="gramEnd"/>
+      <w:r>
+        <w:t xml:space="preserve"> </w:t>
       </w:r>
       <m:oMath>
         <m:r>
@@ -8893,7 +9373,15 @@
         <w:pStyle w:val="BodyText"/>
       </w:pPr>
       <w:r>
-        <w:t xml:space="preserve">A regional hierarchical approach was considered for modelling species compositions over time, but it was decided that species composition likely reflected local habitat and broad, regional-scale patterns would have minimal information in estimating these values. However, because there is a lack of port sampling in most Kodiak CFMU’s the species </w:t>
+        <w:t xml:space="preserve">A regional hierarchical approach was considered for modelling species compositions over time, but it was decided that species </w:t>
+      </w:r>
+      <w:proofErr w:type="gramStart"/>
+      <w:r>
+        <w:t>composition</w:t>
+      </w:r>
+      <w:proofErr w:type="gramEnd"/>
+      <w:r>
+        <w:t xml:space="preserve"> likely reflected local habitat and broad, regional-scale patterns would have minimal information in estimating these values. However, because there is a lack of port sampling in most Kodiak CFMU’s the species </w:t>
       </w:r>
       <m:oMath>
         <m:r>
@@ -9353,9 +9841,11 @@
       <w:pPr>
         <w:pStyle w:val="BodyText"/>
       </w:pPr>
+      <w:proofErr w:type="gramStart"/>
       <w:r>
         <w:t>where</w:t>
       </w:r>
+      <w:proofErr w:type="gramEnd"/>
     </w:p>
     <w:p>
       <w:pPr>
@@ -9829,7 +10319,15 @@
         <w:pStyle w:val="FirstParagraph"/>
       </w:pPr>
       <w:r>
-        <w:t xml:space="preserve">The procedure for estimating releases differs from the Howard methods in that it relies on a process driven approach in contrast to the estimation methods employed in Howard et al. (2020; Figure 8 REL_SCHEMATICS) and further incorporates all sources of data, including SWHS estimates and port sampling interview data. Rather than making the assumption that the guided:unguided ratio of total rockfish releases in the SWHS data is an appropriate way to derive unguided releases of each species complex from the logbook record of releases, this approach models releases based on the harvests and the probability that a landed fish is retained separately for each of the regional species assemblages while estimating and accounting for the bias in SWHS release estimates. Thus, the true number of released rockfish </w:t>
+        <w:t xml:space="preserve">The procedure for estimating releases differs from the Howard methods in that it relies on a process driven approach in contrast to the estimation methods employed in Howard et al. (2020; Figure 8 REL_SCHEMATICS) and further incorporates all sources of data, including SWHS estimates and port sampling interview data. Rather than making the assumption that the </w:t>
+      </w:r>
+      <w:proofErr w:type="spellStart"/>
+      <w:r>
+        <w:t>guided:unguided</w:t>
+      </w:r>
+      <w:proofErr w:type="spellEnd"/>
+      <w:r>
+        <w:t xml:space="preserve"> ratio of total rockfish releases in the SWHS data is an appropriate way to derive unguided releases of each species complex from the logbook record of releases, this approach models releases based on the harvests and the probability that a landed fish is retained separately for each of the regional species assemblages while estimating and accounting for the bias in SWHS release estimates. Thus, the true number of released rockfish </w:t>
       </w:r>
       <m:oMath>
         <m:sSub>
@@ -9920,7 +10418,15 @@
         <w:pStyle w:val="BodyText"/>
       </w:pPr>
       <w:r>
-        <w:t xml:space="preserve">Release data from the SWHS is for all rockfish combined and the release data from logbooks is subdivided into pelagics, yelloweye and “other” (non-pelagic, non-yelloweye) rockfish. Port sampling data in Southcentral and Kodiak is available for the same categories as the logbook data, and as such </w:t>
+        <w:t xml:space="preserve">Release data from the SWHS is for all rockfish combined and the release data from logbooks is subdivided into </w:t>
+      </w:r>
+      <w:proofErr w:type="spellStart"/>
+      <w:r>
+        <w:t>pelagics</w:t>
+      </w:r>
+      <w:proofErr w:type="spellEnd"/>
+      <w:r>
+        <w:t xml:space="preserve">, yelloweye and “other” (non-pelagic, non-yelloweye) rockfish. Port sampling data in Southcentral and Kodiak is available for the same categories as the logbook data, and as such </w:t>
       </w:r>
       <m:oMath>
         <m:r>
@@ -11447,11 +11953,27 @@
         </m:sSub>
       </m:oMath>
       <w:r>
-        <w:t xml:space="preserve"> parameter described above. Because Southeast Alaska was closed to the retention of yelloweye rockfish between 2020 and 2024 the probability of </w:t>
+        <w:t xml:space="preserve"> parameter described above. Because Southeast Alaska was </w:t>
+      </w:r>
+      <w:proofErr w:type="gramStart"/>
+      <w:r>
+        <w:t>closed</w:t>
+      </w:r>
+      <w:proofErr w:type="gramEnd"/>
+      <w:r>
+        <w:t xml:space="preserve"> to the retention of yelloweye rockfish between 2020 and 2024 the probability of </w:t>
       </w:r>
       <w:r>
         <w:lastRenderedPageBreak/>
-        <w:t xml:space="preserve">retaining a yelloweye rockfish would be substantially different from when they were reopened to a limited harvest in 2025. This has the knock-on effect of potentially altering angler behavior with regard to other rockfish species as well. As such the </w:t>
+        <w:t xml:space="preserve">retaining a yelloweye rockfish would be substantially different from when they were reopened to a limited harvest in 2025. This has the knock-on effect of potentially altering angler behavior </w:t>
+      </w:r>
+      <w:proofErr w:type="gramStart"/>
+      <w:r>
+        <w:t>with regard to</w:t>
+      </w:r>
+      <w:proofErr w:type="gramEnd"/>
+      <w:r>
+        <w:t xml:space="preserve"> other rockfish species as well. As such the </w:t>
       </w:r>
       <m:oMath>
         <m:r>
@@ -11521,7 +12043,15 @@
         </m:sSub>
       </m:oMath>
       <w:r>
-        <w:t xml:space="preserve"> parameter for Southeast Alaska encompasses the years between 2020 and 2024 as a time block and then a separate parameter estimates a new mean beginning in 2025.</w:t>
+        <w:t xml:space="preserve"> parameter for Southeast Alaska encompasses the years between 2020 and 2024 as a time block and then a separate parameter estimates a new </w:t>
+      </w:r>
+      <w:proofErr w:type="gramStart"/>
+      <w:r>
+        <w:t>mean</w:t>
+      </w:r>
+      <w:proofErr w:type="gramEnd"/>
+      <w:r>
+        <w:t xml:space="preserve"> beginning in 2025.</w:t>
       </w:r>
     </w:p>
     <w:p>
@@ -12502,7 +13032,31 @@
         </m:sSub>
       </m:oMath>
       <w:r>
-        <w:t xml:space="preserve"> is a random effect with a non-informative prior that estimates deviation from the fit line. The random effect term allowed estimation during the historical period when data is available, but the curve defined by the above equation determined release estimates between 1977 and whenever data became available (Figure DATA). Similar to the species composition logistic curve, it was only fit to data through 2019 to avoid changes in harvest proportions that resulted from regulatory changes that began to take place in 2020. Random effect terms were also forced to sum to zero for each area, user group, species and time period in an identical manner to that described in equation </w:t>
+        <w:t xml:space="preserve"> is a random effect with a non-informative prior that estimates deviation from the fit line. The random effect term allowed estimation during the historical period when data is available, but the curve defined by the above equation determined release estimates between 1977 and whenever data became available (Figure DATA). </w:t>
+      </w:r>
+      <w:proofErr w:type="gramStart"/>
+      <w:r>
+        <w:t>Similar to</w:t>
+      </w:r>
+      <w:proofErr w:type="gramEnd"/>
+      <w:r>
+        <w:t xml:space="preserve"> the species composition logistic curve, it was only fit to </w:t>
+      </w:r>
+      <w:proofErr w:type="gramStart"/>
+      <w:r>
+        <w:t>data</w:t>
+      </w:r>
+      <w:proofErr w:type="gramEnd"/>
+      <w:r>
+        <w:t xml:space="preserve"> through 2019 to avoid changes in harvest proportions that resulted from regulatory changes that began to take place in 2020. Random effect terms were also forced to sum to zero for each area, user group, species and </w:t>
+      </w:r>
+      <w:proofErr w:type="gramStart"/>
+      <w:r>
+        <w:t>time period</w:t>
+      </w:r>
+      <w:proofErr w:type="gramEnd"/>
+      <w:r>
+        <w:t xml:space="preserve"> in an identical manner to that described in equation </w:t>
       </w:r>
       <w:r>
         <w:rPr>
@@ -13359,9 +13913,11 @@
       <w:pPr>
         <w:pStyle w:val="BodyText"/>
       </w:pPr>
+      <w:proofErr w:type="gramStart"/>
       <w:r>
         <w:t>where</w:t>
       </w:r>
+      <w:proofErr w:type="gramEnd"/>
     </w:p>
     <w:p>
       <w:pPr>
@@ -14118,7 +14674,15 @@
         <w:t>region</w:t>
       </w:r>
       <w:r>
-        <w:t xml:space="preserve"> refers to Kodiak, Southcentral and Southeast. Similar to the species composition logistic curve, a uniform prior was applied to the inflection point </w:t>
+        <w:t xml:space="preserve"> refers to Kodiak, Southcentral and Southeast. </w:t>
+      </w:r>
+      <w:proofErr w:type="gramStart"/>
+      <w:r>
+        <w:t>Similar to</w:t>
+      </w:r>
+      <w:proofErr w:type="gramEnd"/>
+      <w:r>
+        <w:t xml:space="preserve"> the species composition logistic curve, a uniform prior was applied to the inflection point </w:t>
       </w:r>
       <m:oMath>
         <m:r>
@@ -14129,7 +14693,15 @@
         </m:r>
       </m:oMath>
       <w:r>
-        <w:t xml:space="preserve"> bracketed by the time period </w:t>
+        <w:t xml:space="preserve"> bracketed by the </w:t>
+      </w:r>
+      <w:proofErr w:type="gramStart"/>
+      <w:r>
+        <w:t>time period</w:t>
+      </w:r>
+      <w:proofErr w:type="gramEnd"/>
+      <w:r>
+        <w:t xml:space="preserve"> </w:t>
       </w:r>
       <w:r>
         <w:lastRenderedPageBreak/>
@@ -14235,7 +14807,15 @@
         <w:t>XX</w:t>
       </w:r>
       <w:r>
-        <w:t xml:space="preserve"> and the long term mean value was used for hindcasting. Long term means were fit for WKMA pelagics, all yelloweye, CI, BSAI, SOKO2SAP, and WKMA “other” rockfish, and SE slope rockfish assemblages.</w:t>
+        <w:t xml:space="preserve"> and the long term mean value was used for hindcasting. Long term means were fit for WKMA </w:t>
+      </w:r>
+      <w:proofErr w:type="spellStart"/>
+      <w:r>
+        <w:t>pelagics</w:t>
+      </w:r>
+      <w:proofErr w:type="spellEnd"/>
+      <w:r>
+        <w:t>, all yelloweye, CI, BSAI, SOKO2SAP, and WKMA “other” rockfish, and SE slope rockfish assemblages.</w:t>
       </w:r>
     </w:p>
     <w:p>
@@ -14325,6 +14905,7 @@
       <w:r>
         <w:t xml:space="preserve"> logistic curve (or long-term average) for unguided anglers used a prior developed from the SWHS data that indicated whether private anglers were more or less likely to harvest a landed rockfish. The SWHS provides information on the relative number of total rockfish caught, retained and released for each user group and was used to derive an informative prior on retention probabilities, </w:t>
       </w:r>
+      <w:proofErr w:type="spellStart"/>
       <w:r>
         <w:rPr>
           <w:i/>
@@ -14333,7 +14914,11 @@
         <w:t>pH</w:t>
       </w:r>
       <w:r>
-        <w:t>. Because the proportion harvested is known for guided anglers via logbook data, the difference in the proportion harvested for each user group in the SWHS data suggests whether private anglers are more or less likely to retain a generic rockfish relative to guided anglers. The same relationship was used in the Howard methods to directly calculate unguided releases whereas this approach treats it as a prior that interacts with other relevant data sources to provide a more data and process driven estimate of releases (Figure 8).</w:t>
+        <w:t>.</w:t>
+      </w:r>
+      <w:proofErr w:type="spellEnd"/>
+      <w:r>
+        <w:t xml:space="preserve"> Because the proportion harvested is known for guided anglers via logbook data, the difference in the proportion harvested for each user group in the SWHS data suggests whether private anglers are more or less likely to retain a generic rockfish relative to guided anglers. The same relationship was used in the Howard methods to directly calculate unguided releases whereas this approach treats it as a prior that interacts with other relevant data sources to provide a more data and process driven estimate of releases (Figure 8).</w:t>
       </w:r>
     </w:p>
     <w:p>
@@ -14341,7 +14926,15 @@
         <w:pStyle w:val="BodyText"/>
       </w:pPr>
       <w:r>
-        <w:t xml:space="preserve">As such the SWHS data was used to develop a prior to inform the </w:t>
+        <w:t xml:space="preserve">As such the SWHS data was used to develop a </w:t>
+      </w:r>
+      <w:proofErr w:type="gramStart"/>
+      <w:r>
+        <w:t>prior</w:t>
+      </w:r>
+      <w:proofErr w:type="gramEnd"/>
+      <w:r>
+        <w:t xml:space="preserve"> to inform the </w:t>
       </w:r>
       <m:oMath>
         <m:r>
@@ -14569,7 +15162,15 @@
         </m:sSubSup>
       </m:oMath>
       <w:r>
-        <w:t xml:space="preserve">), such that unguided:guided SWHS </w:t>
+        <w:t xml:space="preserve">), such that </w:t>
+      </w:r>
+      <w:proofErr w:type="gramStart"/>
+      <w:r>
+        <w:t>unguided:guided</w:t>
+      </w:r>
+      <w:proofErr w:type="gramEnd"/>
+      <w:r>
+        <w:t xml:space="preserve"> SWHS </w:t>
       </w:r>
       <w:r>
         <w:rPr>
@@ -14581,6 +15182,7 @@
       <w:r>
         <w:t xml:space="preserve"> ratio in area </w:t>
       </w:r>
+      <w:proofErr w:type="gramStart"/>
       <w:r>
         <w:rPr>
           <w:i/>
@@ -14589,7 +15191,11 @@
         <w:t>a</w:t>
       </w:r>
       <w:r>
-        <w:t xml:space="preserve"> and year </w:t>
+        <w:t xml:space="preserve"> and</w:t>
+      </w:r>
+      <w:proofErr w:type="gramEnd"/>
+      <w:r>
+        <w:t xml:space="preserve"> year </w:t>
       </w:r>
       <w:r>
         <w:rPr>
@@ -15840,7 +16446,15 @@
         </m:sSubSup>
       </m:oMath>
       <w:r>
-        <w:t xml:space="preserve"> ratios was used as a prior on </w:t>
+        <w:t xml:space="preserve"> ratios </w:t>
+      </w:r>
+      <w:proofErr w:type="gramStart"/>
+      <w:r>
+        <w:t>was</w:t>
+      </w:r>
+      <w:proofErr w:type="gramEnd"/>
+      <w:r>
+        <w:t xml:space="preserve"> used as a prior on </w:t>
       </w:r>
       <m:oMath>
         <m:r>
@@ -17170,7 +17784,15 @@
         <w:pStyle w:val="FirstParagraph"/>
       </w:pPr>
       <w:r>
-        <w:t>Release mortality (i.e., the number of released rockfish expected to die) was calculated assuming fixed mortality rates developed in each of the regions (FIGURE 7 REL_MORT). Deep-water release mechanism (DRM) devices were mandated for charter fleets in 2013 and release mortality rates were reduced since then to match research results (Jarvis and Lowe 2008; Hochhalter and Reed 2011; Blain and Sutton 2016; Blain-Roth and Sutton 2019). Southeast applies basic rates estimated in these studies while Southcentral and Kodiak rates were derived by using historical depth-of-release data to adjust the rates based on area and user group.</w:t>
+        <w:t xml:space="preserve">Release mortality (i.e., the number of released rockfish expected to die) was calculated assuming fixed mortality rates developed in each of the regions (FIGURE 7 REL_MORT). Deep-water release mechanism (DRM) devices were mandated for charter fleets in </w:t>
+      </w:r>
+      <w:proofErr w:type="gramStart"/>
+      <w:r>
+        <w:t>2013</w:t>
+      </w:r>
+      <w:proofErr w:type="gramEnd"/>
+      <w:r>
+        <w:t xml:space="preserve"> and release mortality rates were reduced since then to match research results (Jarvis and Lowe 2008; Hochhalter and Reed 2011; Blain and Sutton 2016; Blain-Roth and Sutton 2019). Southeast applies basic rates estimated in these studies while Southcentral and Kodiak rates were derived by using historical depth-of-release data to adjust the rates based on area and user group.</w:t>
       </w:r>
     </w:p>
     <w:p>
@@ -17497,7 +18119,15 @@
         <w:pStyle w:val="FirstParagraph"/>
       </w:pPr>
       <w:r>
-        <w:t>Total removals in numbers of fish were converted to biomass in pounds using the average weight of fish as estimated from port sampling. Weights were modeled hierarchically to estimate weights in years when data was missing. The total biomass of removals by year, area, user and species was thus</w:t>
+        <w:t xml:space="preserve">Total removals in numbers of fish were converted to biomass in pounds using the average weight of fish as estimated from port sampling. Weights were modeled hierarchically to estimate weights in years when data was missing. The total biomass of removals by year, area, user and species </w:t>
+      </w:r>
+      <w:proofErr w:type="gramStart"/>
+      <w:r>
+        <w:t>was</w:t>
+      </w:r>
+      <w:proofErr w:type="gramEnd"/>
+      <w:r>
+        <w:t xml:space="preserve"> thus</w:t>
       </w:r>
     </w:p>
     <w:p>
@@ -17748,15 +18378,15 @@
       <w:pPr>
         <w:pStyle w:val="Heading2"/>
       </w:pPr>
-      <w:bookmarkStart w:id="75" w:name="observation-equations"/>
-      <w:bookmarkStart w:id="76" w:name="_Toc242785277"/>
-      <w:bookmarkEnd w:id="57"/>
+      <w:bookmarkStart w:id="75" w:name="_Toc242785277"/>
+      <w:bookmarkStart w:id="76" w:name="observation-equations"/>
+      <w:bookmarkEnd w:id="58"/>
       <w:bookmarkEnd w:id="74"/>
       <w:r>
         <w:lastRenderedPageBreak/>
         <w:t>Observation equations</w:t>
       </w:r>
-      <w:bookmarkEnd w:id="76"/>
+      <w:bookmarkEnd w:id="75"/>
     </w:p>
     <w:p>
       <w:pPr>
@@ -18608,7 +19238,23 @@
         </w:r>
       </w:del>
       <w:r>
-        <w:t>and is related to true harvest as:</w:t>
+        <w:t xml:space="preserve">and </w:t>
+      </w:r>
+      <w:proofErr w:type="gramStart"/>
+      <w:r>
+        <w:t>is</w:t>
+      </w:r>
+      <w:proofErr w:type="gramEnd"/>
+      <w:r>
+        <w:t xml:space="preserve"> related to true </w:t>
+      </w:r>
+      <w:proofErr w:type="gramStart"/>
+      <w:r>
+        <w:t>harvest</w:t>
+      </w:r>
+      <w:proofErr w:type="gramEnd"/>
+      <w:r>
+        <w:t xml:space="preserve"> as:</w:t>
       </w:r>
     </w:p>
     <w:p>
@@ -20284,7 +20930,15 @@
         <w:pStyle w:val="BodyText"/>
       </w:pPr>
       <w:r>
-        <w:t>Southeast areas have two other non-pelagic groupings such that non-yelloweye DSR and slope rockfish are a proportion of non-pelagics such that</w:t>
+        <w:t>Southeast areas have two other non-pelagic groupings such that non-yelloweye DSR and slope rockfish are a proportion of non-</w:t>
+      </w:r>
+      <w:proofErr w:type="spellStart"/>
+      <w:r>
+        <w:t>pelagics</w:t>
+      </w:r>
+      <w:proofErr w:type="spellEnd"/>
+      <w:r>
+        <w:t xml:space="preserve"> such that</w:t>
       </w:r>
     </w:p>
     <w:p>
@@ -21249,7 +21903,15 @@
         </w:r>
       </w:del>
       <w:r>
-        <w:t>and is related to true releases as:</w:t>
+        <w:t xml:space="preserve">and </w:t>
+      </w:r>
+      <w:proofErr w:type="gramStart"/>
+      <w:r>
+        <w:t>is</w:t>
+      </w:r>
+      <w:proofErr w:type="gramEnd"/>
+      <w:r>
+        <w:t xml:space="preserve"> related to true releases as:</w:t>
       </w:r>
     </w:p>
     <w:p>
@@ -22050,6 +22712,7 @@
       <w:r>
         <w:t xml:space="preserve"> sampled dockside in area </w:t>
       </w:r>
+      <w:proofErr w:type="gramStart"/>
       <w:r>
         <w:rPr>
           <w:i/>
@@ -22058,7 +22721,11 @@
         <w:t>a</w:t>
       </w:r>
       <w:r>
-        <w:t xml:space="preserve"> and year </w:t>
+        <w:t xml:space="preserve"> and</w:t>
+      </w:r>
+      <w:proofErr w:type="gramEnd"/>
+      <w:r>
+        <w:t xml:space="preserve"> year </w:t>
       </w:r>
       <w:r>
         <w:rPr>
@@ -22484,7 +23151,15 @@
       </w:r>
       <w:r>
         <w:lastRenderedPageBreak/>
-        <w:t xml:space="preserve">assemblages a logistic-normal random effect was used to inflate the variance (Molenberghs et al. 2010; Kassahun et al. 2012) such that the observed probability of being harvested in the interview data, </w:t>
+        <w:t>assemblages a logistic-normal random effect was used to inflate the variance (</w:t>
+      </w:r>
+      <w:proofErr w:type="spellStart"/>
+      <w:r>
+        <w:t>Molenberghs</w:t>
+      </w:r>
+      <w:proofErr w:type="spellEnd"/>
+      <w:r>
+        <w:t xml:space="preserve"> et al. 2010; Kassahun et al. 2012) such that the observed probability of being harvested in the interview data, </w:t>
       </w:r>
       <m:oMath>
         <m:r>
@@ -25192,7 +25867,23 @@
         <w:t>I</w:t>
       </w:r>
       <w:r>
-        <w:t xml:space="preserve"> is an index variable which is 1 when the user group is private and 0 when it is guided. The prior for the species mean weight was centered on the mean of the data and corresponding variance and standard deviation.</w:t>
+        <w:t xml:space="preserve"> is an index variable which is 1 when the user group is private and 0 when it is guided. The </w:t>
+      </w:r>
+      <w:proofErr w:type="gramStart"/>
+      <w:r>
+        <w:t>prior</w:t>
+      </w:r>
+      <w:proofErr w:type="gramEnd"/>
+      <w:r>
+        <w:t xml:space="preserve"> for the species </w:t>
+      </w:r>
+      <w:proofErr w:type="gramStart"/>
+      <w:r>
+        <w:t>mean</w:t>
+      </w:r>
+      <w:proofErr w:type="gramEnd"/>
+      <w:r>
+        <w:t xml:space="preserve"> weight was centered on the mean of the data and corresponding variance and standard deviation.</w:t>
       </w:r>
     </w:p>
     <w:p>
@@ -26007,7 +26698,15 @@
         <w:pStyle w:val="FirstParagraph"/>
       </w:pPr>
       <w:r>
-        <w:t xml:space="preserve">Kodiak has limited port sampling beyond the main harbors but has a robust hydroacoustic survey that is used to quantify black rockfish abundance across the management area and uses stereocameras to define the species compositions of the </w:t>
+        <w:t xml:space="preserve">Kodiak has limited port sampling beyond the main harbors but has a robust hydroacoustic survey that is used to quantify black rockfish abundance across the management area and uses </w:t>
+      </w:r>
+      <w:proofErr w:type="spellStart"/>
+      <w:r>
+        <w:t>stereocameras</w:t>
+      </w:r>
+      <w:proofErr w:type="spellEnd"/>
+      <w:r>
+        <w:t xml:space="preserve"> to define the species compositions of the </w:t>
       </w:r>
       <w:del w:id="88" w:author="Joy, Philip J (DFG)" w:date="2026-10-13T14:39:00Z" w16du:dateUtc="2026-10-13T22:39:00Z">
         <w:r>
@@ -26016,14 +26715,19 @@
       </w:del>
       <w:ins w:id="89" w:author="Joy, Philip J (DFG)" w:date="2026-10-13T14:39:00Z" w16du:dateUtc="2026-10-13T22:39:00Z">
         <w:r>
-          <w:t>hydroacoustic</w:t>
-        </w:r>
-        <w:r>
-          <w:t>-</w:t>
+          <w:t>hydroacoustic-</w:t>
         </w:r>
       </w:ins>
       <w:r>
-        <w:t>based fish counts (Tscherisch et al. 2023). This data was used as supplementary data to further inform the model on the proportion of pelagic rockfish that are black in Kodiak areas. Where angler landing data is available, they demonstrate a higher proportion of black rockfish relative to the hydroacoustic survey and thus the predicted proportion of black rockfish in the hydroacoustic sample</w:t>
+        <w:t>based fish counts (</w:t>
+      </w:r>
+      <w:proofErr w:type="spellStart"/>
+      <w:r>
+        <w:t>Tscherisch</w:t>
+      </w:r>
+      <w:proofErr w:type="spellEnd"/>
+      <w:r>
+        <w:t xml:space="preserve"> et al. 2023). This data was used as supplementary data to further inform the model on the proportion of pelagic rockfish that are black in Kodiak areas. Where angler landing data is available, they demonstrate a higher proportion of black rockfish relative to the hydroacoustic survey and thus the predicted proportion of black rockfish in the hydroacoustic sample</w:t>
       </w:r>
       <w:ins w:id="90" w:author="Joy, Philip J (DFG)" w:date="2026-10-13T14:40:00Z" w16du:dateUtc="2026-10-13T22:40:00Z">
         <w:r>
@@ -26274,7 +26978,15 @@
         </m:sSub>
       </m:oMath>
       <w:r>
-        <w:t xml:space="preserve"> is the angler effect for each area and user group modeled hierarchically around a mean of 0. Predicted </w:t>
+        <w:t xml:space="preserve"> is the angler effect for each area and user group modeled hierarchically around a mean of 0</w:t>
+      </w:r>
+      <w:ins w:id="92" w:author="Joy, Philip J (DFG)" w:date="2026-10-14T08:43:00Z" w16du:dateUtc="2026-10-14T16:43:00Z">
+        <w:r>
+          <w:t xml:space="preserve"> (Table 2)</w:t>
+        </w:r>
+      </w:ins>
+      <w:r>
+        <w:t xml:space="preserve">. Predicted </w:t>
       </w:r>
       <m:oMath>
         <m:sSubSup>
@@ -26516,9 +27228,11 @@
       <w:pPr>
         <w:pStyle w:val="BodyText"/>
       </w:pPr>
+      <w:proofErr w:type="gramStart"/>
       <w:r>
         <w:t>where</w:t>
       </w:r>
+      <w:proofErr w:type="gramEnd"/>
     </w:p>
     <w:p>
       <w:pPr>
@@ -28367,9 +29081,9 @@
       <w:pPr>
         <w:pStyle w:val="Heading2"/>
       </w:pPr>
-      <w:bookmarkStart w:id="92" w:name="model-platform-and-diagnostics"/>
       <w:bookmarkStart w:id="93" w:name="_Toc242785278"/>
-      <w:bookmarkEnd w:id="75"/>
+      <w:bookmarkStart w:id="94" w:name="model-platform-and-diagnostics"/>
+      <w:bookmarkEnd w:id="76"/>
       <w:bookmarkEnd w:id="87"/>
       <w:r>
         <w:t>Model platform and diagnostics</w:t>
@@ -28381,7 +29095,31 @@
         <w:pStyle w:val="FirstParagraph"/>
       </w:pPr>
       <w:r>
-        <w:t xml:space="preserve">The model was run using JAGS version 4.3.1 using the jagsUI and rjags packages (Plummer et al. 2006, Lunn et al. 2009, Plummer 2024) on the statistical R Statistical Software (v4.4.3;R Core Team 2021). Note that in the JAGS code normal and lognormal distributions take </w:t>
+        <w:t xml:space="preserve">The model was run using JAGS version 4.3.1 using the </w:t>
+      </w:r>
+      <w:proofErr w:type="spellStart"/>
+      <w:r>
+        <w:t>jagsUI</w:t>
+      </w:r>
+      <w:proofErr w:type="spellEnd"/>
+      <w:r>
+        <w:t xml:space="preserve"> and </w:t>
+      </w:r>
+      <w:proofErr w:type="spellStart"/>
+      <w:r>
+        <w:t>rjags</w:t>
+      </w:r>
+      <w:proofErr w:type="spellEnd"/>
+      <w:r>
+        <w:t xml:space="preserve"> packages (Plummer et al. 2006, Lunn et al. 2009, Plummer 2024) on the statistical R Statistical Software (</w:t>
+      </w:r>
+      <w:proofErr w:type="gramStart"/>
+      <w:r>
+        <w:t>v4.4.3;R</w:t>
+      </w:r>
+      <w:proofErr w:type="gramEnd"/>
+      <w:r>
+        <w:t xml:space="preserve"> Core Team 2021). Note that in the JAGS code normal and lognormal distributions take </w:t>
       </w:r>
       <m:oMath>
         <m:r>
@@ -28474,7 +29212,15 @@
         <w:pStyle w:val="BodyText"/>
       </w:pPr>
       <w:r>
-        <w:t xml:space="preserve">The historical (1977-2019) and contemporary (2020-2025) models were run with 3 MCMC chains. The historical model used 2,500,000 iterations with a burn-in of 250,000 iterations and a thinning rate of 2,250 iterations while the contemporary model used 1,000,000 iterations with a burn-in of 250,000 iterations and a thinning rate of 750 iterations. Model convergence was judged by examining traceplots and ensuring that </w:t>
+        <w:t xml:space="preserve">The historical (1977-2019) and contemporary (2020-2025) models were run with 3 MCMC chains. The historical model used 2,500,000 iterations with a burn-in of 250,000 iterations and a thinning rate of 2,250 iterations while the contemporary model used 1,000,000 iterations with a burn-in of 250,000 iterations and a thinning rate of 750 iterations. Model convergence was judged by examining </w:t>
+      </w:r>
+      <w:proofErr w:type="spellStart"/>
+      <w:r>
+        <w:t>traceplots</w:t>
+      </w:r>
+      <w:proofErr w:type="spellEnd"/>
+      <w:r>
+        <w:t xml:space="preserve"> and ensuring that </w:t>
       </w:r>
       <m:oMath>
         <m:acc>
@@ -28503,10 +29249,10 @@
       <w:pPr>
         <w:pStyle w:val="Heading1"/>
       </w:pPr>
-      <w:bookmarkStart w:id="94" w:name="results"/>
       <w:bookmarkStart w:id="95" w:name="_Toc242785279"/>
-      <w:bookmarkEnd w:id="21"/>
-      <w:bookmarkEnd w:id="92"/>
+      <w:bookmarkStart w:id="96" w:name="results"/>
+      <w:bookmarkEnd w:id="22"/>
+      <w:bookmarkEnd w:id="94"/>
       <w:r>
         <w:t>Results</w:t>
       </w:r>
@@ -28517,7 +29263,15 @@
         <w:pStyle w:val="FirstParagraph"/>
       </w:pPr>
       <w:r>
-        <w:t>The estimation model was able to estimate harvests, releases and total removals (harvests plus release mortalities) with near complete convergence of model parameters. Harvest estimates were very similar to Howard et al. (2020) estimates but differed more in areas where private anglers were the dominant user group. Release estimates were also very similar to guided estimates from the Howard estimates as expected given that both methods rely on the census derived from the logbook program. However, estimates of unguided releases differed substantially from the Howard estimates, particularly in recent years that include portside interview data on release and retention behavior. The large difference is unsurprising given the bias correction undertaken in the Bayesian model, the use of the proportion harvested data from the logbook program, and the integration of the portside interview data.</w:t>
+        <w:t xml:space="preserve">The estimation model was able to estimate harvests, releases and total removals (harvests plus release mortalities) with near complete convergence of model parameters. Harvest estimates were very similar to Howard et al. (2020) estimates but differed more in areas where private anglers were the dominant user group. Release estimates were also very similar to guided estimates from the Howard estimates as expected given that both methods rely on the census derived from the logbook program. However, estimates of unguided releases differed substantially from the Howard estimates, particularly in recent years that </w:t>
+      </w:r>
+      <w:proofErr w:type="gramStart"/>
+      <w:r>
+        <w:t>include</w:t>
+      </w:r>
+      <w:proofErr w:type="gramEnd"/>
+      <w:r>
+        <w:t xml:space="preserve"> portside interview data on release and retention behavior. The large difference is unsurprising given the bias correction undertaken in the Bayesian model, the use of the proportion harvested data from the logbook program, and the integration of the portside interview data.</w:t>
       </w:r>
     </w:p>
     <w:p>
@@ -28896,12 +29650,12 @@
       <w:r>
         <w:t xml:space="preserve">. Secondarily derived quantities are those values derived from the primary derived quantities and their lack of convergence is directly tied to </w:t>
       </w:r>
-      <w:del w:id="96" w:author="Joy, Philip J (DFG)" w:date="2026-10-13T14:43:00Z" w16du:dateUtc="2026-10-13T22:43:00Z">
+      <w:del w:id="97" w:author="Joy, Philip J (DFG)" w:date="2026-10-13T14:43:00Z" w16du:dateUtc="2026-10-13T22:43:00Z">
         <w:r>
           <w:delText>the lack of convergence in</w:delText>
         </w:r>
       </w:del>
-      <w:ins w:id="97" w:author="Joy, Philip J (DFG)" w:date="2026-10-13T14:43:00Z" w16du:dateUtc="2026-10-13T22:43:00Z">
+      <w:ins w:id="98" w:author="Joy, Philip J (DFG)" w:date="2026-10-13T14:43:00Z" w16du:dateUtc="2026-10-13T22:43:00Z">
         <w:r>
           <w:t>that of</w:t>
         </w:r>
@@ -29072,14 +29826,22 @@
         </m:acc>
       </m:oMath>
       <w:r>
-        <w:t xml:space="preserve"> in excess of 1.1, 16 estimates (80%) had medians less than 1 and </w:t>
-      </w:r>
-      <w:del w:id="98" w:author="Joy, Philip J (DFG)" w:date="2026-10-13T12:03:00Z" w16du:dateUtc="2026-10-13T20:03:00Z">
+        <w:t xml:space="preserve"> </w:t>
+      </w:r>
+      <w:proofErr w:type="gramStart"/>
+      <w:r>
+        <w:t>in excess of</w:t>
+      </w:r>
+      <w:proofErr w:type="gramEnd"/>
+      <w:r>
+        <w:t xml:space="preserve"> 1.1, 16 estimates (80%) had medians less than 1 and </w:t>
+      </w:r>
+      <w:del w:id="99" w:author="Joy, Philip J (DFG)" w:date="2026-10-13T12:03:00Z" w16du:dateUtc="2026-10-13T20:03:00Z">
         <w:r>
           <w:delText>20 (100%)</w:delText>
         </w:r>
       </w:del>
-      <w:ins w:id="99" w:author="Joy, Philip J (DFG)" w:date="2026-10-13T12:03:00Z" w16du:dateUtc="2026-10-13T20:03:00Z">
+      <w:ins w:id="100" w:author="Joy, Philip J (DFG)" w:date="2026-10-13T12:03:00Z" w16du:dateUtc="2026-10-13T20:03:00Z">
         <w:r>
           <w:t>all</w:t>
         </w:r>
@@ -29228,20 +29990,36 @@
         </m:acc>
       </m:oMath>
       <w:r>
-        <w:t xml:space="preserve"> in excess of 1.1, 66 estimates (63%) had medians less than 1, 95 (91%) had medians less than 10, 100 (96%) had medians less than 50, and 103 (99%) had medians less than 100. </w:t>
-      </w:r>
-      <w:del w:id="100" w:author="Joy, Philip J (DFG)" w:date="2026-10-13T12:03:00Z" w16du:dateUtc="2026-10-13T20:03:00Z">
+        <w:t xml:space="preserve"> </w:t>
+      </w:r>
+      <w:proofErr w:type="gramStart"/>
+      <w:r>
+        <w:t>in excess of</w:t>
+      </w:r>
+      <w:proofErr w:type="gramEnd"/>
+      <w:r>
+        <w:t xml:space="preserve"> 1.1, 66 estimates (63%) had medians less than 1, 95 (91%) had medians less than 10, 100 (96%) had medians less than 50, and 103 (99%) had medians less than 100. </w:t>
+      </w:r>
+      <w:del w:id="101" w:author="Joy, Philip J (DFG)" w:date="2026-10-13T12:03:00Z" w16du:dateUtc="2026-10-13T20:03:00Z">
         <w:r>
           <w:delText>Of the 1</w:delText>
         </w:r>
       </w:del>
-      <w:ins w:id="101" w:author="Joy, Philip J (DFG)" w:date="2026-10-13T12:03:00Z" w16du:dateUtc="2026-10-13T20:03:00Z">
+      <w:ins w:id="102" w:author="Joy, Philip J (DFG)" w:date="2026-10-13T12:03:00Z" w16du:dateUtc="2026-10-13T20:03:00Z">
         <w:r>
           <w:t>The lone</w:t>
         </w:r>
       </w:ins>
       <w:r>
-        <w:t xml:space="preserve"> unconverged </w:t>
+        <w:t xml:space="preserve"> </w:t>
+      </w:r>
+      <w:proofErr w:type="spellStart"/>
+      <w:r>
+        <w:t>unconverged</w:t>
+      </w:r>
+      <w:proofErr w:type="spellEnd"/>
+      <w:r>
+        <w:t xml:space="preserve"> </w:t>
       </w:r>
       <m:oMath>
         <m:sSub>
@@ -29290,7 +30068,7 @@
       <w:r>
         <w:t xml:space="preserve"> estimate</w:t>
       </w:r>
-      <w:del w:id="102" w:author="Joy, Philip J (DFG)" w:date="2026-10-13T12:03:00Z" w16du:dateUtc="2026-10-13T20:03:00Z">
+      <w:del w:id="103" w:author="Joy, Philip J (DFG)" w:date="2026-10-13T12:03:00Z" w16du:dateUtc="2026-10-13T20:03:00Z">
         <w:r>
           <w:delText>s</w:delText>
         </w:r>
@@ -29298,12 +30076,12 @@
       <w:r>
         <w:t xml:space="preserve"> with a median value greater than 100</w:t>
       </w:r>
-      <w:del w:id="103" w:author="Joy, Philip J (DFG)" w:date="2026-10-13T12:03:00Z" w16du:dateUtc="2026-10-13T20:03:00Z">
+      <w:del w:id="104" w:author="Joy, Philip J (DFG)" w:date="2026-10-13T12:03:00Z" w16du:dateUtc="2026-10-13T20:03:00Z">
         <w:r>
           <w:delText>, all 1 were</w:delText>
         </w:r>
       </w:del>
-      <w:ins w:id="104" w:author="Joy, Philip J (DFG)" w:date="2026-10-13T12:03:00Z" w16du:dateUtc="2026-10-13T20:03:00Z">
+      <w:ins w:id="105" w:author="Joy, Philip J (DFG)" w:date="2026-10-13T12:03:00Z" w16du:dateUtc="2026-10-13T20:03:00Z">
         <w:r>
           <w:t xml:space="preserve"> came</w:t>
         </w:r>
@@ -29311,12 +30089,12 @@
       <w:r>
         <w:t xml:space="preserve"> from pre-1999 years when logbook data became available</w:t>
       </w:r>
-      <w:ins w:id="105" w:author="Joy, Philip J (DFG)" w:date="2026-10-13T12:04:00Z" w16du:dateUtc="2026-10-13T20:04:00Z">
+      <w:ins w:id="106" w:author="Joy, Philip J (DFG)" w:date="2026-10-13T12:04:00Z" w16du:dateUtc="2026-10-13T20:04:00Z">
         <w:r>
           <w:t xml:space="preserve"> and had an </w:t>
         </w:r>
       </w:ins>
-      <w:del w:id="106" w:author="Joy, Philip J (DFG)" w:date="2026-10-13T12:04:00Z" w16du:dateUtc="2026-10-13T20:04:00Z">
+      <w:del w:id="107" w:author="Joy, Philip J (DFG)" w:date="2026-10-13T12:04:00Z" w16du:dateUtc="2026-10-13T20:04:00Z">
         <w:r>
           <w:delText xml:space="preserve"> . The </w:delText>
         </w:r>
@@ -29343,7 +30121,7 @@
       <w:r>
         <w:t xml:space="preserve"> value</w:t>
       </w:r>
-      <w:del w:id="107" w:author="Joy, Philip J (DFG)" w:date="2026-10-13T12:04:00Z" w16du:dateUtc="2026-10-13T20:04:00Z">
+      <w:del w:id="108" w:author="Joy, Philip J (DFG)" w:date="2026-10-13T12:04:00Z" w16du:dateUtc="2026-10-13T20:04:00Z">
         <w:r>
           <w:delText>s</w:delText>
         </w:r>
@@ -29351,7 +30129,7 @@
       <w:r>
         <w:t xml:space="preserve"> of </w:t>
       </w:r>
-      <w:del w:id="108" w:author="Joy, Philip J (DFG)" w:date="2026-10-13T12:04:00Z" w16du:dateUtc="2026-10-13T20:04:00Z">
+      <w:del w:id="109" w:author="Joy, Philip J (DFG)" w:date="2026-10-13T12:04:00Z" w16du:dateUtc="2026-10-13T20:04:00Z">
         <w:r>
           <w:delText xml:space="preserve">these 1 release estimates ranged from </w:delText>
         </w:r>
@@ -29359,7 +30137,7 @@
       <w:r>
         <w:t xml:space="preserve">1.128 </w:t>
       </w:r>
-      <w:del w:id="109" w:author="Joy, Philip J (DFG)" w:date="2026-10-13T12:04:00Z" w16du:dateUtc="2026-10-13T20:04:00Z">
+      <w:del w:id="110" w:author="Joy, Philip J (DFG)" w:date="2026-10-13T12:04:00Z" w16du:dateUtc="2026-10-13T20:04:00Z">
         <w:r>
           <w:delText xml:space="preserve">to 1.128 indicating that these estimates would be likely to converge with longer runs </w:delText>
         </w:r>
@@ -29377,8 +30155,8 @@
       <w:pPr>
         <w:pStyle w:val="Heading2"/>
       </w:pPr>
-      <w:bookmarkStart w:id="110" w:name="residual-patterns"/>
       <w:bookmarkStart w:id="111" w:name="_Toc242785280"/>
+      <w:bookmarkStart w:id="112" w:name="residual-patterns"/>
       <w:r>
         <w:t>Residual Patterns</w:t>
       </w:r>
@@ -29389,7 +30167,23 @@
         <w:pStyle w:val="FirstParagraph"/>
       </w:pPr>
       <w:r>
-        <w:t>Residual patterns of the fit of the data to the SWHS data were generally satisfactory, with a few exceptions. Large harvest residuals (Figure 10 SWHS_H_RESIDS) were often associated with poor precision in the SWHS estimates in all regions. PWSO demonstrated odd residual patterns associated with large uncertainty prior to 2000 with the model predicting higher harvests than demonstrated in the SWHS. Kodiak areas demonstrated some strange residual patterns in the WKMA and eastside CFMU’s, but were generally associated with poor precision in the estimates. Southeast harvests showed generally satisfactory residual patterns, although SSEO model results were consistently higher than survey estimates prior to 1992.</w:t>
+        <w:t xml:space="preserve">Residual patterns of the </w:t>
+      </w:r>
+      <w:proofErr w:type="gramStart"/>
+      <w:r>
+        <w:t>fit</w:t>
+      </w:r>
+      <w:proofErr w:type="gramEnd"/>
+      <w:r>
+        <w:t xml:space="preserve"> of the data to the SWHS data were generally satisfactory, with a few exceptions. Large harvest residuals (Figure 10 SWHS_H_RESIDS) were often associated with poor precision in the SWHS estimates in all regions. PWSO demonstrated odd residual patterns associated with large uncertainty prior to 2000 with the model predicting higher harvests than demonstrated in the SWHS. Kodiak areas demonstrated some strange residual patterns in the WKMA and eastside </w:t>
+      </w:r>
+      <w:proofErr w:type="gramStart"/>
+      <w:r>
+        <w:t>CFMU’s, but</w:t>
+      </w:r>
+      <w:proofErr w:type="gramEnd"/>
+      <w:r>
+        <w:t xml:space="preserve"> were generally associated with poor precision in the estimates. Southeast harvests showed generally satisfactory residual patterns, although SSEO model results were consistently higher than survey estimates prior to 1992.</w:t>
       </w:r>
     </w:p>
     <w:p>
@@ -29399,7 +30193,7 @@
       <w:r>
         <w:t xml:space="preserve">Residual patterns for the SWHS release data showed much larger residuals as would be expected from the </w:t>
       </w:r>
-      <w:del w:id="112" w:author="Joy, Philip J (DFG)" w:date="2026-10-13T14:45:00Z" w16du:dateUtc="2026-10-13T22:45:00Z">
+      <w:del w:id="113" w:author="Joy, Philip J (DFG)" w:date="2026-10-13T14:45:00Z" w16du:dateUtc="2026-10-13T22:45:00Z">
         <w:r>
           <w:delText xml:space="preserve">much </w:delText>
         </w:r>
@@ -29413,18 +30207,50 @@
         <w:pStyle w:val="BodyText"/>
       </w:pPr>
       <w:r>
-        <w:t xml:space="preserve">Residual patterns of the fit to the logbook data show some patterns but are minor with respect to the overall number of fish being estimated (Figure 12 LB_RESIDS). Logbook data is fit with a poisson distribution which assumes a very small error and thus the model estimates are usually within 1% of the logbook value for both harvests and releases. There were some odd patterns in the North Gulf and both Prince William Sound CFMUs where the model predicted less harvests than logbook entries in the early years of the program and across all of southcentral and Kodiak CFMU’s the residuals are larger during that time period. These instances mirror the residual </w:t>
+        <w:t xml:space="preserve">Residual patterns of the fit to the logbook data show some patterns but are minor with respect to the overall number of fish being estimated (Figure 12 LB_RESIDS). Logbook data </w:t>
+      </w:r>
+      <w:proofErr w:type="gramStart"/>
+      <w:r>
+        <w:t>is fit</w:t>
+      </w:r>
+      <w:proofErr w:type="gramEnd"/>
+      <w:r>
+        <w:t xml:space="preserve"> with a </w:t>
+      </w:r>
+      <w:proofErr w:type="spellStart"/>
+      <w:r>
+        <w:t>poisson</w:t>
+      </w:r>
+      <w:proofErr w:type="spellEnd"/>
+      <w:r>
+        <w:t xml:space="preserve"> distribution which assumes a very small error and thus the model estimates are usually within 1% of the logbook value for both harvests and releases. There were some odd patterns in the North Gulf and both Prince William Sound CFMUs where the model predicted less harvests than logbook entries in the early years of the program and across </w:t>
+      </w:r>
+      <w:proofErr w:type="gramStart"/>
+      <w:r>
+        <w:t>all of</w:t>
+      </w:r>
+      <w:proofErr w:type="gramEnd"/>
+      <w:r>
+        <w:t xml:space="preserve"> southcentral and Kodiak CFMU’s the residuals are larger during that </w:t>
+      </w:r>
+      <w:proofErr w:type="gramStart"/>
+      <w:r>
+        <w:t>time period</w:t>
+      </w:r>
+      <w:proofErr w:type="gramEnd"/>
+      <w:r>
+        <w:t xml:space="preserve">. These instances mirror the residual </w:t>
       </w:r>
       <w:r>
         <w:lastRenderedPageBreak/>
         <w:t xml:space="preserve">patterns in the SWHS and are the result of the model balancing the </w:t>
       </w:r>
-      <w:del w:id="113" w:author="Joy, Philip J (DFG)" w:date="2026-10-13T14:46:00Z" w16du:dateUtc="2026-10-13T22:46:00Z">
+      <w:del w:id="114" w:author="Joy, Philip J (DFG)" w:date="2026-10-13T14:46:00Z" w16du:dateUtc="2026-10-13T22:46:00Z">
         <w:r>
           <w:delText>disagreement between the two</w:delText>
         </w:r>
       </w:del>
-      <w:ins w:id="114" w:author="Joy, Philip J (DFG)" w:date="2026-10-13T14:46:00Z" w16du:dateUtc="2026-10-13T22:46:00Z">
+      <w:ins w:id="115" w:author="Joy, Philip J (DFG)" w:date="2026-10-13T14:46:00Z" w16du:dateUtc="2026-10-13T22:46:00Z">
         <w:r>
           <w:t>various</w:t>
         </w:r>
@@ -29437,9 +30263,9 @@
       <w:pPr>
         <w:pStyle w:val="Heading2"/>
       </w:pPr>
-      <w:bookmarkStart w:id="115" w:name="bias-estimation"/>
       <w:bookmarkStart w:id="116" w:name="_Toc242785281"/>
-      <w:bookmarkEnd w:id="110"/>
+      <w:bookmarkStart w:id="117" w:name="bias-estimation"/>
+      <w:bookmarkEnd w:id="112"/>
       <w:r>
         <w:t>Bias Estimation</w:t>
       </w:r>
@@ -29450,7 +30276,23 @@
         <w:pStyle w:val="FirstParagraph"/>
       </w:pPr>
       <w:r>
-        <w:t>Observed bias in the SWHS refers to the difference between SWHS guided harvest and release estimates and that reported in charter logbooks (Figure 6 BIAS). Model predicted bias in SWHS harvest data tracked the observed bias well across years and CFMUs (Figure 13 YEARAREA_BIAS) but there was more discrepancies in the release data (Figure 14 YEARAREA_BIAS). Results demonstrated that SWHS estimates were generally biased low while release estimates were biased high (Figure 15 MEAN_BIAS). Observed and estimated harvest bias were very consistent with the exception of the very data poor BSAI CFMU (Figure 13 YEARAREA_BIAS).</w:t>
+        <w:t xml:space="preserve">Observed bias in the SWHS refers to the difference between SWHS guided harvest and release estimates and that reported in charter logbooks (Figure 6 BIAS). Model predicted bias in SWHS harvest data tracked the observed bias well across years and CFMUs (Figure 13 YEARAREA_BIAS) but there </w:t>
+      </w:r>
+      <w:proofErr w:type="gramStart"/>
+      <w:r>
+        <w:t>was</w:t>
+      </w:r>
+      <w:proofErr w:type="gramEnd"/>
+      <w:r>
+        <w:t xml:space="preserve"> more discrepancies in the release data (Figure 14 YEARAREA_BIAS). Results demonstrated that SWHS estimates were generally biased low while release estimates were biased high (Figure 15 MEAN_BIAS). Observed and estimated harvest bias were very consistent </w:t>
+      </w:r>
+      <w:proofErr w:type="gramStart"/>
+      <w:r>
+        <w:t>with the exception of</w:t>
+      </w:r>
+      <w:proofErr w:type="gramEnd"/>
+      <w:r>
+        <w:t xml:space="preserve"> the very data poor BSAI CFMU (Figure 13 YEARAREA_BIAS).</w:t>
       </w:r>
     </w:p>
     <w:p>
@@ -29465,20 +30307,20 @@
       <w:pPr>
         <w:pStyle w:val="BodyText"/>
         <w:rPr>
-          <w:del w:id="117" w:author="Joy, Philip J (DFG)" w:date="2026-10-13T14:49:00Z" w16du:dateUtc="2026-10-13T22:49:00Z"/>
+          <w:del w:id="118" w:author="Joy, Philip J (DFG)" w:date="2026-10-13T14:49:00Z" w16du:dateUtc="2026-10-13T22:49:00Z"/>
         </w:rPr>
       </w:pPr>
-      <w:del w:id="118" w:author="Joy, Philip J (DFG)" w:date="2026-10-13T14:49:00Z" w16du:dateUtc="2026-10-13T22:49:00Z">
+      <w:del w:id="119" w:author="Joy, Philip J (DFG)" w:date="2026-10-13T14:49:00Z" w16du:dateUtc="2026-10-13T22:49:00Z">
         <w:r>
           <w:delText xml:space="preserve">In contrast, the CSEO in </w:delText>
         </w:r>
       </w:del>
-      <w:del w:id="119" w:author="Joy, Philip J (DFG)" w:date="2026-10-13T14:48:00Z" w16du:dateUtc="2026-10-13T22:48:00Z">
+      <w:del w:id="120" w:author="Joy, Philip J (DFG)" w:date="2026-10-13T14:48:00Z" w16du:dateUtc="2026-10-13T22:48:00Z">
         <w:r>
           <w:delText xml:space="preserve">southeast </w:delText>
         </w:r>
       </w:del>
-      <w:del w:id="120" w:author="Joy, Philip J (DFG)" w:date="2026-10-13T14:49:00Z" w16du:dateUtc="2026-10-13T22:49:00Z">
+      <w:del w:id="121" w:author="Joy, Philip J (DFG)" w:date="2026-10-13T14:49:00Z" w16du:dateUtc="2026-10-13T22:49:00Z">
         <w:r>
           <w:delText>demonstrates much higher bias in the SWHS relative to the logbook data since 2019. This implies that the portside interview data is providing more biased estimates than would be inferred by the guided SWHS and logbook data alone.</w:delText>
         </w:r>
@@ -29488,9 +30330,9 @@
       <w:pPr>
         <w:pStyle w:val="Heading2"/>
       </w:pPr>
-      <w:bookmarkStart w:id="121" w:name="proportion-harvested"/>
       <w:bookmarkStart w:id="122" w:name="_Toc242785282"/>
-      <w:bookmarkEnd w:id="115"/>
+      <w:bookmarkStart w:id="123" w:name="proportion-harvested"/>
+      <w:bookmarkEnd w:id="117"/>
       <w:r>
         <w:t>Proportion Harvested</w:t>
       </w:r>
@@ -29511,7 +30353,15 @@
         <w:t>pH</w:t>
       </w:r>
       <w:r>
-        <w:t xml:space="preserve">) for guided pelagic rockfish accurately tracked the logbook and portside interview data and the logistic curve fit to that data demonstrated reasonable patterns and uncertainty for hindcasting (Figure 16 pH_PEL). Logbook data and portside interviews of guided anglers provided similar estimates and demonstrated similar trends in </w:t>
+        <w:t xml:space="preserve">) for guided pelagic rockfish accurately tracked the logbook and portside interview data and the logistic curve fit to that data demonstrated reasonable patterns and uncertainty for hindcasting (Figure 16 </w:t>
+      </w:r>
+      <w:proofErr w:type="spellStart"/>
+      <w:r>
+        <w:t>pH_PEL</w:t>
+      </w:r>
+      <w:proofErr w:type="spellEnd"/>
+      <w:r>
+        <w:t xml:space="preserve">). Logbook data and portside interviews of guided anglers provided similar estimates and demonstrated similar trends in </w:t>
       </w:r>
       <w:r>
         <w:rPr>
@@ -29656,7 +30506,31 @@
       </w:pPr>
       <w:r>
         <w:lastRenderedPageBreak/>
-        <w:t>The proportion harvested of yelloweye rockfish demonstrated a very different pattern from pelagic rockfish whereby anglers have retained almost all landed fish until recent years when management restrictions came into effect (Figure 17 pH_YE). This is most obvious in the Southeast CFMU’s where yelloweye retention was prohibited beginning in 2020 and to a lesser degree in Prince William Sound (CFMU PWSI and PWSO) where milder restrictions were enacted. Logbook and portside interviews data were mostly in agreement with regard to yelloweye retention. The model tracked the data well and the hindcasting applied a long term mean because the lack of appreciable change in the data since 2006.</w:t>
+        <w:t xml:space="preserve">The proportion harvested of yelloweye rockfish demonstrated a very different pattern from pelagic rockfish whereby anglers have retained almost all landed fish until recent years when management restrictions came into effect (Figure 17 </w:t>
+      </w:r>
+      <w:proofErr w:type="spellStart"/>
+      <w:r>
+        <w:t>pH_YE</w:t>
+      </w:r>
+      <w:proofErr w:type="spellEnd"/>
+      <w:r>
+        <w:t xml:space="preserve">). This is most obvious in the Southeast CFMU’s where yelloweye retention was prohibited beginning in 2020 and to a lesser degree in Prince William Sound (CFMU PWSI and PWSO) where milder restrictions were enacted. Logbook and portside interviews data were mostly in agreement </w:t>
+      </w:r>
+      <w:proofErr w:type="gramStart"/>
+      <w:r>
+        <w:t>with regard to</w:t>
+      </w:r>
+      <w:proofErr w:type="gramEnd"/>
+      <w:r>
+        <w:t xml:space="preserve"> yelloweye retention. The model tracked the data well and the hindcasting applied a long term mean </w:t>
+      </w:r>
+      <w:proofErr w:type="gramStart"/>
+      <w:r>
+        <w:t>because</w:t>
+      </w:r>
+      <w:proofErr w:type="gramEnd"/>
+      <w:r>
+        <w:t xml:space="preserve"> the lack of appreciable change in the data since 2006.</w:t>
       </w:r>
     </w:p>
     <w:p>
@@ -29700,7 +30574,31 @@
         </m:sSub>
       </m:oMath>
       <w:r>
-        <w:t>) the proportion harvested demonstrated variable patterns across regions (Figure 18 pH_OTHER). Central regions demonstrated a static pattern with the exception of Cook Inlet where retention probabilities increased over the observed time period. Kodiak demonstrated increasing retention probabilities with the exception of the WKMA CFMUs which were static. For these two regions, the portside interview data tracked logbook records to various degrees but demonstrated greater differences relative to the other species assemblages.</w:t>
+        <w:t xml:space="preserve">) the proportion harvested demonstrated variable patterns across regions (Figure 18 pH_OTHER). Central regions demonstrated a static pattern </w:t>
+      </w:r>
+      <w:proofErr w:type="gramStart"/>
+      <w:r>
+        <w:t>with the exception of</w:t>
+      </w:r>
+      <w:proofErr w:type="gramEnd"/>
+      <w:r>
+        <w:t xml:space="preserve"> Cook Inlet where retention probabilities increased over the observed </w:t>
+      </w:r>
+      <w:proofErr w:type="gramStart"/>
+      <w:r>
+        <w:t>time period</w:t>
+      </w:r>
+      <w:proofErr w:type="gramEnd"/>
+      <w:r>
+        <w:t xml:space="preserve">. Kodiak demonstrated increasing retention probabilities </w:t>
+      </w:r>
+      <w:proofErr w:type="gramStart"/>
+      <w:r>
+        <w:t>with the exception of</w:t>
+      </w:r>
+      <w:proofErr w:type="gramEnd"/>
+      <w:r>
+        <w:t xml:space="preserve"> the WKMA CFMUs which were static. For these two regions, the portside interview data tracked logbook records to various degrees but demonstrated greater differences relative to the other species assemblages.</w:t>
       </w:r>
     </w:p>
     <w:p>
@@ -29708,9 +30606,49 @@
         <w:pStyle w:val="BodyText"/>
       </w:pPr>
       <w:r>
-        <w:t xml:space="preserve">Southeast CFMU’s show a pattern similar to that of yelloweye rockfish with high retention prior to management restrictions enacted in recent years, but with greater discrepancies between the logbook and portside interview data. The model tracked the logbook data for guided anglers and estimates of unguided releases showed considerable uncertainty even in recent years as a result of high overdispersion in the interview data that is evident from the disparity between logbook and interview data (Figure 18 pH_OTHER). The “other” rockfish in Southeast Alaska are comprised of slope rockfish and non-yelloweye DSR rockfish, which further informs the model but introduces more tension as the likelihoods compete over the contradictory data. The retention probability of non-yelloweye DSR (Figure 19 pH_DSR) and slope rockfish (Figure 20 pH_SLOPE) are fit using the portside interview data while the sum of those releases must be equal to the release of the “other” rockfish </w:t>
-      </w:r>
-      <w:del w:id="123" w:author="Joy, Philip J (DFG)" w:date="2026-10-13T14:53:00Z" w16du:dateUtc="2026-10-13T22:53:00Z">
+        <w:t xml:space="preserve">Southeast CFMU’s show a pattern </w:t>
+      </w:r>
+      <w:proofErr w:type="gramStart"/>
+      <w:r>
+        <w:t>similar to</w:t>
+      </w:r>
+      <w:proofErr w:type="gramEnd"/>
+      <w:r>
+        <w:t xml:space="preserve"> that of yelloweye rockfish with high retention prior to management restrictions enacted in recent years, but with greater discrepancies between the logbook and portside interview data. The model tracked the logbook data for guided anglers and estimates of unguided releases showed considerable uncertainty even in recent years </w:t>
+      </w:r>
+      <w:proofErr w:type="gramStart"/>
+      <w:r>
+        <w:t>as a result of</w:t>
+      </w:r>
+      <w:proofErr w:type="gramEnd"/>
+      <w:r>
+        <w:t xml:space="preserve"> high overdispersion in the interview data that is evident from the disparity between logbook and interview data (Figure 18 </w:t>
+      </w:r>
+      <w:proofErr w:type="spellStart"/>
+      <w:r>
+        <w:t>pH_OTHER</w:t>
+      </w:r>
+      <w:proofErr w:type="spellEnd"/>
+      <w:r>
+        <w:t xml:space="preserve">). The “other” rockfish in Southeast Alaska are comprised of slope rockfish and non-yelloweye DSR rockfish, which further informs the model but introduces more tension as the likelihoods compete over the contradictory data. The retention probability of non-yelloweye DSR (Figure 19 </w:t>
+      </w:r>
+      <w:proofErr w:type="spellStart"/>
+      <w:r>
+        <w:t>pH_DSR</w:t>
+      </w:r>
+      <w:proofErr w:type="spellEnd"/>
+      <w:r>
+        <w:t xml:space="preserve">) and slope rockfish (Figure 20 </w:t>
+      </w:r>
+      <w:proofErr w:type="spellStart"/>
+      <w:r>
+        <w:t>pH_SLOPE</w:t>
+      </w:r>
+      <w:proofErr w:type="spellEnd"/>
+      <w:r>
+        <w:t xml:space="preserve">) are fit using the portside interview data while the sum of those releases must be equal to the release of the “other” rockfish </w:t>
+      </w:r>
+      <w:del w:id="124" w:author="Joy, Philip J (DFG)" w:date="2026-10-13T14:53:00Z" w16du:dateUtc="2026-10-13T22:53:00Z">
         <w:r>
           <w:delText xml:space="preserve">that are </w:delText>
         </w:r>
@@ -29718,13 +30656,29 @@
       <w:r>
         <w:t xml:space="preserve">fit to the </w:t>
       </w:r>
-      <w:del w:id="124" w:author="Joy, Philip J (DFG)" w:date="2026-10-13T14:53:00Z" w16du:dateUtc="2026-10-13T22:53:00Z">
+      <w:del w:id="125" w:author="Joy, Philip J (DFG)" w:date="2026-10-13T14:53:00Z" w16du:dateUtc="2026-10-13T22:53:00Z">
         <w:r>
           <w:delText xml:space="preserve">portside and </w:delText>
         </w:r>
       </w:del>
       <w:r>
-        <w:t xml:space="preserve">logbook data. The resolution of these sometimes contradictory signals results in </w:t>
+        <w:t xml:space="preserve">logbook data. The resolution of these </w:t>
+      </w:r>
+      <w:proofErr w:type="gramStart"/>
+      <w:r>
+        <w:t>sometimes contradictory</w:t>
+      </w:r>
+      <w:proofErr w:type="gramEnd"/>
+      <w:r>
+        <w:t xml:space="preserve"> signals </w:t>
+      </w:r>
+      <w:proofErr w:type="gramStart"/>
+      <w:r>
+        <w:t>results</w:t>
+      </w:r>
+      <w:proofErr w:type="gramEnd"/>
+      <w:r>
+        <w:t xml:space="preserve"> in </w:t>
       </w:r>
       <w:r>
         <w:rPr>
@@ -29734,7 +30688,15 @@
         <w:t>pH</w:t>
       </w:r>
       <w:r>
-        <w:t xml:space="preserve"> estimates for DSR that follow the data (Figure 19 pH_DSR), but </w:t>
+        <w:t xml:space="preserve"> estimates for DSR that follow the data (Figure 19 </w:t>
+      </w:r>
+      <w:proofErr w:type="spellStart"/>
+      <w:r>
+        <w:t>pH_DSR</w:t>
+      </w:r>
+      <w:proofErr w:type="spellEnd"/>
+      <w:r>
+        <w:t xml:space="preserve">), but </w:t>
       </w:r>
       <w:r>
         <w:rPr>
@@ -29744,16 +30706,24 @@
         <w:t>pH</w:t>
       </w:r>
       <w:r>
-        <w:t xml:space="preserve"> estimates for slope rockfish in the SSEO that are substantially less than that reported in portside interviews (Figure 20 pH_SLOPE). Sample sizes for slope rockfish are generally smaller than for DSR, particularly in the SSEO and thus the model resolves the conflicting data signals in favor of the DSR data relative to the slope rockfish data.</w:t>
+        <w:t xml:space="preserve"> estimates for slope rockfish in the SSEO that are substantially less than that reported in portside interviews (Figure 20 </w:t>
+      </w:r>
+      <w:proofErr w:type="spellStart"/>
+      <w:r>
+        <w:t>pH_SLOPE</w:t>
+      </w:r>
+      <w:proofErr w:type="spellEnd"/>
+      <w:r>
+        <w:t>). Sample sizes for slope rockfish are generally smaller than for DSR, particularly in the SSEO and thus the model resolves the conflicting data signals in favor of the DSR data relative to the slope rockfish data.</w:t>
       </w:r>
     </w:p>
     <w:p>
       <w:pPr>
         <w:pStyle w:val="Heading2"/>
       </w:pPr>
-      <w:bookmarkStart w:id="125" w:name="species-composition"/>
       <w:bookmarkStart w:id="126" w:name="_Toc242785283"/>
-      <w:bookmarkEnd w:id="121"/>
+      <w:bookmarkStart w:id="127" w:name="species-composition"/>
+      <w:bookmarkEnd w:id="123"/>
       <w:r>
         <w:t>Species Composition</w:t>
       </w:r>
@@ -29889,7 +30859,23 @@
         </m:sSub>
       </m:oMath>
       <w:r>
-        <w:t xml:space="preserve"> terms but nevertheless resulted in fairly minor differences between guided and unguided anglers with the exception of PWSI and, to a lesser extent, SSEI.</w:t>
+        <w:t xml:space="preserve"> terms but nevertheless resulted in </w:t>
+      </w:r>
+      <w:proofErr w:type="gramStart"/>
+      <w:r>
+        <w:t>fairly minor</w:t>
+      </w:r>
+      <w:proofErr w:type="gramEnd"/>
+      <w:r>
+        <w:t xml:space="preserve"> differences between guided and unguided anglers </w:t>
+      </w:r>
+      <w:proofErr w:type="gramStart"/>
+      <w:r>
+        <w:t>with the exception of</w:t>
+      </w:r>
+      <w:proofErr w:type="gramEnd"/>
+      <w:r>
+        <w:t xml:space="preserve"> PWSI and, to a lesser extent, SSEI.</w:t>
       </w:r>
     </w:p>
     <w:p>
@@ -29938,30 +30924,80 @@
         </m:sSub>
       </m:oMath>
       <w:r>
-        <w:t xml:space="preserve"> were generally well converged with the exception of the Prince William Sound areas and the NSEI in Southeast, which were slow to converge. In these </w:t>
+        <w:t xml:space="preserve"> were generally well converged </w:t>
+      </w:r>
+      <w:proofErr w:type="gramStart"/>
+      <w:r>
+        <w:t>with the exception of</w:t>
+      </w:r>
+      <w:proofErr w:type="gramEnd"/>
+      <w:r>
+        <w:t xml:space="preserve"> the Prince William Sound areas and the NSEI in Southeast, which were slow to converge. In these </w:t>
       </w:r>
       <w:r>
         <w:lastRenderedPageBreak/>
-        <w:t xml:space="preserve">areas the port sampling data and the logbook data differ significantly and the model struggled to fit both of these data sources (Figure 21 P_PEL). Port sampling programs in this region are not proportional to the effort and thus the proportions are weighted to account for that issue (Howard et al. 2020). However, </w:t>
-      </w:r>
-      <w:del w:id="127" w:author="Joy, Philip J (DFG)" w:date="2026-10-13T14:55:00Z" w16du:dateUtc="2026-10-13T22:55:00Z">
+        <w:t xml:space="preserve">areas the port sampling data and the logbook data differ </w:t>
+      </w:r>
+      <w:proofErr w:type="gramStart"/>
+      <w:r>
+        <w:t>significantly</w:t>
+      </w:r>
+      <w:proofErr w:type="gramEnd"/>
+      <w:r>
+        <w:t xml:space="preserve"> and the model struggled to fit </w:t>
+      </w:r>
+      <w:proofErr w:type="gramStart"/>
+      <w:r>
+        <w:t>both of these</w:t>
+      </w:r>
+      <w:proofErr w:type="gramEnd"/>
+      <w:r>
+        <w:t xml:space="preserve"> data sources (Figure 21 P_PEL). Port sampling programs in this region are not proportional to the effort and thus the proportions are weighted to account for that issue (Howard et al. 2020). However, </w:t>
+      </w:r>
+      <w:del w:id="128" w:author="Joy, Philip J (DFG)" w:date="2026-10-13T14:55:00Z" w16du:dateUtc="2026-10-13T22:55:00Z">
         <w:r>
           <w:delText xml:space="preserve">event </w:delText>
         </w:r>
       </w:del>
-      <w:ins w:id="128" w:author="Joy, Philip J (DFG)" w:date="2026-10-13T14:55:00Z" w16du:dateUtc="2026-10-13T22:55:00Z">
+      <w:ins w:id="129" w:author="Joy, Philip J (DFG)" w:date="2026-10-13T14:55:00Z" w16du:dateUtc="2026-10-13T22:55:00Z">
         <w:r>
-          <w:t>even</w:t>
+          <w:t xml:space="preserve">even with </w:t>
         </w:r>
+        <w:proofErr w:type="gramStart"/>
         <w:r>
-          <w:t xml:space="preserve"> with the data weighting</w:t>
+          <w:t>the data</w:t>
         </w:r>
+        <w:proofErr w:type="gramEnd"/>
+        <w:r>
+          <w:t xml:space="preserve"> </w:t>
+        </w:r>
+        <w:proofErr w:type="gramStart"/>
+        <w:r>
+          <w:t>weighting</w:t>
+        </w:r>
+        <w:proofErr w:type="gramEnd"/>
         <w:r>
           <w:t xml:space="preserve"> </w:t>
         </w:r>
       </w:ins>
       <w:r>
-        <w:t>the adjusted values do not align with the logbook data and thus remains an outstanding issue. As it stands, the model favors the logbook data over the port sampling data due to the nature of the relative likelihoods (Figure 21 P_Pel).</w:t>
+        <w:t xml:space="preserve">the adjusted values do not align with the logbook data and thus </w:t>
+      </w:r>
+      <w:proofErr w:type="gramStart"/>
+      <w:r>
+        <w:t>remains</w:t>
+      </w:r>
+      <w:proofErr w:type="gramEnd"/>
+      <w:r>
+        <w:t xml:space="preserve"> an outstanding issue. As it stands, the model favors the logbook data over the port sampling data due to the nature of the relative likelihoods (Figure 21 </w:t>
+      </w:r>
+      <w:proofErr w:type="spellStart"/>
+      <w:r>
+        <w:t>P_Pel</w:t>
+      </w:r>
+      <w:proofErr w:type="spellEnd"/>
+      <w:r>
+        <w:t>).</w:t>
       </w:r>
     </w:p>
     <w:p>
@@ -29969,7 +31005,15 @@
         <w:pStyle w:val="BodyText"/>
       </w:pPr>
       <w:r>
-        <w:t xml:space="preserve">The proportion of pelagic rockfish that were black proved to be static, with the exception of Cook Inlet, which showed an increase, and NSEI, which showed a decrease (Figure 22 P_BLACK). The model tracked observed values well and applied the uncertainty derived from the random effects in the hindcast values. Applying the hydroacoustic survey data to Kodiak </w:t>
+        <w:t xml:space="preserve">The proportion of pelagic rockfish that were black proved to be static, </w:t>
+      </w:r>
+      <w:proofErr w:type="gramStart"/>
+      <w:r>
+        <w:t>with the exception of</w:t>
+      </w:r>
+      <w:proofErr w:type="gramEnd"/>
+      <w:r>
+        <w:t xml:space="preserve"> Cook Inlet, which showed an increase, and NSEI, which showed a decrease (Figure 22 P_BLACK). The model tracked observed values well and applied the uncertainty derived from the random effects in the hindcast values. Applying the hydroacoustic survey data to Kodiak </w:t>
       </w:r>
       <m:oMath>
         <m:sSub>
@@ -30026,7 +31070,7 @@
       <w:r>
         <w:t xml:space="preserve">The yelloweye </w:t>
       </w:r>
-      <w:ins w:id="129" w:author="Joy, Philip J (DFG)" w:date="2026-10-13T14:56:00Z" w16du:dateUtc="2026-10-13T22:56:00Z">
+      <w:ins w:id="130" w:author="Joy, Philip J (DFG)" w:date="2026-10-13T14:56:00Z" w16du:dateUtc="2026-10-13T22:56:00Z">
         <w:r>
           <w:t xml:space="preserve">rockfish </w:t>
         </w:r>
@@ -30034,18 +31078,34 @@
       <w:r>
         <w:t xml:space="preserve">proportion demonstrated a static portion of the harvest in Kodiak, a subtle decline in Southcentral areas and a precipitous drop in Southeast where </w:t>
       </w:r>
-      <w:del w:id="130" w:author="Joy, Philip J (DFG)" w:date="2026-10-13T14:57:00Z" w16du:dateUtc="2026-10-13T22:57:00Z">
+      <w:del w:id="131" w:author="Joy, Philip J (DFG)" w:date="2026-10-13T14:57:00Z" w16du:dateUtc="2026-10-13T22:57:00Z">
         <w:r>
           <w:delText>management restrictions were in place in recent years</w:delText>
         </w:r>
       </w:del>
-      <w:ins w:id="131" w:author="Joy, Philip J (DFG)" w:date="2026-10-13T14:57:00Z" w16du:dateUtc="2026-10-13T22:57:00Z">
+      <w:ins w:id="132" w:author="Joy, Philip J (DFG)" w:date="2026-10-13T14:57:00Z" w16du:dateUtc="2026-10-13T22:57:00Z">
         <w:r>
-          <w:t>when retention was prohibited between 2020 and 2024, but allowed in 2025</w:t>
+          <w:t xml:space="preserve">when retention was prohibited between 2020 and </w:t>
+        </w:r>
+        <w:proofErr w:type="gramStart"/>
+        <w:r>
+          <w:t>2024, but</w:t>
+        </w:r>
+        <w:proofErr w:type="gramEnd"/>
+        <w:r>
+          <w:t xml:space="preserve"> allowed in 2025</w:t>
         </w:r>
       </w:ins>
       <w:r>
-        <w:t xml:space="preserve"> (Figure 23 P_YE). Southcentral data is noisy, but the fitted logistic curve appeared to capture the change in species composition during the observed time period and provided acceptable values for hindcasting with the appropriate level of uncertainty. Kodiak yelloweye trends were poorly informed due to a lack of data associated with consistently low harvests of yelloweye in this region. Southeast yelloweye proportions (relative to the DSR assemblage) were also somewhat noisy, but the trends in the data were adequately captured by the fitted logistic curve.</w:t>
+        <w:t xml:space="preserve"> (Figure 23 P_YE). Southcentral data is noisy, but the fitted logistic curve appeared to capture the change in species composition during the observed </w:t>
+      </w:r>
+      <w:proofErr w:type="gramStart"/>
+      <w:r>
+        <w:t>time period</w:t>
+      </w:r>
+      <w:proofErr w:type="gramEnd"/>
+      <w:r>
+        <w:t xml:space="preserve"> and provided acceptable values for hindcasting with the appropriate level of uncertainty. Kodiak yelloweye trends were poorly informed due to a lack of data associated with consistently low harvests of yelloweye in this region. Southeast yelloweye proportions (relative to the DSR assemblage) were also somewhat noisy, but the trends in the data were adequately captured by the fitted logistic curve.</w:t>
       </w:r>
     </w:p>
     <w:p>
@@ -30060,9 +31120,9 @@
       <w:pPr>
         <w:pStyle w:val="Heading2"/>
       </w:pPr>
-      <w:bookmarkStart w:id="132" w:name="proportion-guided"/>
       <w:bookmarkStart w:id="133" w:name="_Toc242785284"/>
-      <w:bookmarkEnd w:id="125"/>
+      <w:bookmarkStart w:id="134" w:name="proportion-guided"/>
+      <w:bookmarkEnd w:id="127"/>
       <w:r>
         <w:t>Proportion Guided</w:t>
       </w:r>
@@ -30073,27 +31133,56 @@
         <w:pStyle w:val="FirstParagraph"/>
       </w:pPr>
       <w:r>
-        <w:t xml:space="preserve">Data on the proportion of total rockfish catches that were guided is lacking and there was no trend estimated for hindcasting these parameters. The model captured the observed estimates within the credibility intervals but tended to smooth the observed estimates (Figure 26 pG). Difference btween the observed pG and that estimated by the model are the result of bias correction in SWHS estimates and more informed estimates of unguided angler harvests. Without </w:t>
-      </w:r>
-      <w:del w:id="134" w:author="Joy, Philip J (DFG)" w:date="2026-10-13T14:59:00Z" w16du:dateUtc="2026-10-13T22:59:00Z">
+        <w:t xml:space="preserve">Data on the proportion of total rockfish catches that were guided is lacking and there was no trend estimated for hindcasting these parameters. The model captured the observed estimates within the credibility intervals but tended to smooth the observed estimates (Figure 26 </w:t>
+      </w:r>
+      <w:proofErr w:type="spellStart"/>
+      <w:r>
+        <w:t>pG</w:t>
+      </w:r>
+      <w:proofErr w:type="spellEnd"/>
+      <w:r>
+        <w:t xml:space="preserve">). Difference </w:t>
+      </w:r>
+      <w:proofErr w:type="spellStart"/>
+      <w:r>
+        <w:t>btween</w:t>
+      </w:r>
+      <w:proofErr w:type="spellEnd"/>
+      <w:r>
+        <w:t xml:space="preserve"> the observed </w:t>
+      </w:r>
+      <w:proofErr w:type="spellStart"/>
+      <w:r>
+        <w:t>pG</w:t>
+      </w:r>
+      <w:proofErr w:type="spellEnd"/>
+      <w:r>
+        <w:t xml:space="preserve"> and that estimated by the model are the result of bias correction in SWHS estimates and more informed estimates of unguided angler harvests. Without </w:t>
+      </w:r>
+      <w:del w:id="135" w:author="Joy, Philip J (DFG)" w:date="2026-10-13T14:59:00Z" w16du:dateUtc="2026-10-13T22:59:00Z">
         <w:r>
           <w:delText>a modeled trend</w:delText>
         </w:r>
       </w:del>
-      <w:ins w:id="135" w:author="Joy, Philip J (DFG)" w:date="2026-10-13T14:59:00Z" w16du:dateUtc="2026-10-13T22:59:00Z">
+      <w:ins w:id="136" w:author="Joy, Philip J (DFG)" w:date="2026-10-13T14:59:00Z" w16du:dateUtc="2026-10-13T22:59:00Z">
         <w:r>
-          <w:t>modelling a trend in the same manner as for pH and pcomp</w:t>
+          <w:t xml:space="preserve">modelling a trend in the same manner as for pH and </w:t>
+        </w:r>
+        <w:proofErr w:type="spellStart"/>
+        <w:r>
+          <w:t>pcomp</w:t>
         </w:r>
       </w:ins>
+      <w:proofErr w:type="spellEnd"/>
       <w:r>
         <w:t xml:space="preserve">, the model </w:t>
       </w:r>
-      <w:del w:id="136" w:author="Joy, Philip J (DFG)" w:date="2026-10-13T14:59:00Z" w16du:dateUtc="2026-10-13T22:59:00Z">
+      <w:del w:id="137" w:author="Joy, Philip J (DFG)" w:date="2026-10-13T14:59:00Z" w16du:dateUtc="2026-10-13T22:59:00Z">
         <w:r>
           <w:delText>essentially uses</w:delText>
         </w:r>
       </w:del>
-      <w:ins w:id="137" w:author="Joy, Philip J (DFG)" w:date="2026-10-13T14:59:00Z" w16du:dateUtc="2026-10-13T22:59:00Z">
+      <w:ins w:id="138" w:author="Joy, Philip J (DFG)" w:date="2026-10-13T14:59:00Z" w16du:dateUtc="2026-10-13T22:59:00Z">
         <w:r>
           <w:t>relies on</w:t>
         </w:r>
@@ -30129,16 +31218,24 @@
         </m:sSub>
       </m:oMath>
       <w:r>
-        <w:t xml:space="preserve"> parameters to hindcast the guided proportion in the model. Credibility in the hindcasted values reflect the variability occuring during the observed time period.</w:t>
+        <w:t xml:space="preserve"> parameters to hindcast the guided proportion in the model. Credibility in the hindcasted values reflect the variability occuring during the observed </w:t>
+      </w:r>
+      <w:proofErr w:type="gramStart"/>
+      <w:r>
+        <w:t>time period</w:t>
+      </w:r>
+      <w:proofErr w:type="gramEnd"/>
+      <w:r>
+        <w:t>.</w:t>
       </w:r>
     </w:p>
     <w:p>
       <w:pPr>
         <w:pStyle w:val="Heading2"/>
       </w:pPr>
-      <w:bookmarkStart w:id="138" w:name="weight"/>
       <w:bookmarkStart w:id="139" w:name="_Toc242785285"/>
-      <w:bookmarkEnd w:id="132"/>
+      <w:bookmarkStart w:id="140" w:name="weight"/>
+      <w:bookmarkEnd w:id="134"/>
       <w:r>
         <w:lastRenderedPageBreak/>
         <w:t>Weight</w:t>
@@ -30157,9 +31254,9 @@
       <w:pPr>
         <w:pStyle w:val="Heading2"/>
       </w:pPr>
-      <w:bookmarkStart w:id="140" w:name="X9d99479f46dec730a7a401f5db2083d62218015"/>
       <w:bookmarkStart w:id="141" w:name="_Toc242785286"/>
-      <w:bookmarkEnd w:id="138"/>
+      <w:bookmarkStart w:id="142" w:name="X9d99479f46dec730a7a401f5db2083d62218015"/>
+      <w:bookmarkEnd w:id="140"/>
       <w:r>
         <w:t>Harvest, Release and Total Removal Estimates</w:t>
       </w:r>
@@ -30169,7 +31266,7 @@
       <w:pPr>
         <w:pStyle w:val="Heading3"/>
       </w:pPr>
-      <w:bookmarkStart w:id="142" w:name="harvests-2"/>
+      <w:bookmarkStart w:id="143" w:name="harvests-2"/>
       <w:r>
         <w:t>Harvests</w:t>
       </w:r>
@@ -30181,13 +31278,37 @@
       <w:r>
         <w:t>Total rockfish harvests demonstrate</w:t>
       </w:r>
-      <w:ins w:id="143" w:author="Joy, Philip J (DFG)" w:date="2026-10-13T15:00:00Z" w16du:dateUtc="2026-10-13T23:00:00Z">
+      <w:ins w:id="144" w:author="Joy, Philip J (DFG)" w:date="2026-10-13T15:00:00Z" w16du:dateUtc="2026-10-13T23:00:00Z">
         <w:r>
           <w:t>d</w:t>
         </w:r>
       </w:ins>
       <w:r>
-        <w:t xml:space="preserve"> a generally increasing trend across the time series with some plateauing in recent years as a result of management restrictions (Figure 27 H_ALL; Appendix C1). Prior to 1998 when the logbook program went into effect, there is greater uncertainty in estimates and harvests were generally low. Some areas such as Cook Inlet (CI), North Gulf (NG), Northeast Kodiak and many of the Southeast CFMUs demonstrate consistent harvests during that time period. Harvest estimates from the Bayesian model are very consistent with Howard method estimates with some exceptions. There are some differences in the 1998-2001 period when the Howard methods made assumptions to deal with data limitations that were more appropriately handled with the hierarchical approach in the Bayesian model. There are also differences in some of the Kodiak areas where the Howard methods borrowed values from the most data rich Kodiak CFMUs whereas the Bayesian model applies a hierarchical approach to leverage all of the available data.</w:t>
+        <w:t xml:space="preserve"> a generally increasing trend across the time series with some plateauing in recent years </w:t>
+      </w:r>
+      <w:proofErr w:type="gramStart"/>
+      <w:r>
+        <w:t>as a result of</w:t>
+      </w:r>
+      <w:proofErr w:type="gramEnd"/>
+      <w:r>
+        <w:t xml:space="preserve"> management restrictions (Figure 27 H_ALL; Appendix C1). Prior to 1998 when the logbook program went into effect, there is greater uncertainty in estimates and harvests were generally low. Some areas such as Cook Inlet (CI), North Gulf (NG), Northeast Kodiak and many of the Southeast CFMUs demonstrate consistent harvests during that </w:t>
+      </w:r>
+      <w:proofErr w:type="gramStart"/>
+      <w:r>
+        <w:t>time period</w:t>
+      </w:r>
+      <w:proofErr w:type="gramEnd"/>
+      <w:r>
+        <w:t xml:space="preserve">. Harvest estimates from the Bayesian model are very consistent with Howard method estimates with some exceptions. There are some differences in the 1998-2001 period when the Howard methods made assumptions to deal with data limitations that were more appropriately handled with the hierarchical approach in the Bayesian model. There are also differences in some of the Kodiak areas where the Howard methods borrowed values from the most data rich Kodiak CFMUs whereas the Bayesian model applies a hierarchical approach to leverage </w:t>
+      </w:r>
+      <w:proofErr w:type="gramStart"/>
+      <w:r>
+        <w:t>all of</w:t>
+      </w:r>
+      <w:proofErr w:type="gramEnd"/>
+      <w:r>
+        <w:t xml:space="preserve"> the available data.</w:t>
       </w:r>
     </w:p>
     <w:p>
@@ -30195,14 +31316,216 @@
         <w:pStyle w:val="BodyText"/>
       </w:pPr>
       <w:r>
-        <w:t xml:space="preserve">Black rockfish harvests demonstrate an increasing trend over the time series that is dominated by guided anglers with the exception of PWSI (Figure 28 H_BLACK, Appendix </w:t>
-      </w:r>
-      <w:del w:id="144" w:author="Joy, Philip J (DFG)" w:date="2026-10-13T15:01:00Z" w16du:dateUtc="2026-10-13T23:01:00Z">
+        <w:t xml:space="preserve">Black rockfish harvests demonstrate an increasing trend over the time series that is dominated by guided anglers </w:t>
+      </w:r>
+      <w:proofErr w:type="gramStart"/>
+      <w:r>
+        <w:t>with the exception of</w:t>
+      </w:r>
+      <w:proofErr w:type="gramEnd"/>
+      <w:r>
+        <w:t xml:space="preserve"> PWSI (Figure 28 H_BLACK, Appendix </w:t>
+      </w:r>
+      <w:del w:id="145" w:author="Joy, Philip J (DFG)" w:date="2026-10-13T15:01:00Z" w16du:dateUtc="2026-10-13T23:01:00Z">
         <w:r>
           <w:delText>C2</w:delText>
         </w:r>
       </w:del>
-      <w:ins w:id="145" w:author="Joy, Philip J (DFG)" w:date="2026-10-13T15:01:00Z" w16du:dateUtc="2026-10-13T23:01:00Z">
+      <w:ins w:id="146" w:author="Joy, Philip J (DFG)" w:date="2026-10-13T15:01:00Z" w16du:dateUtc="2026-10-13T23:01:00Z">
+        <w:r>
+          <w:t>D2</w:t>
+        </w:r>
+      </w:ins>
+      <w:r>
+        <w:t xml:space="preserve">). Harvests prior to 1998 are generally low, but the North Gulf (NG), Northeast Kodiak, and the SSEI, NSEI and CSEO CFMU’s in Southeast had significant harvests during that </w:t>
+      </w:r>
+      <w:proofErr w:type="gramStart"/>
+      <w:r>
+        <w:t>time period</w:t>
+      </w:r>
+      <w:proofErr w:type="gramEnd"/>
+      <w:r>
+        <w:t xml:space="preserve">. Guided estimates are very precise since the logbook program went into effect and port sampling programs provide robust samples for understanding the black rockfish proportion of the pelagic harvest. Unguided harvests are more uncertain </w:t>
+      </w:r>
+      <w:proofErr w:type="gramStart"/>
+      <w:r>
+        <w:t>as</w:t>
+      </w:r>
+      <w:proofErr w:type="gramEnd"/>
+      <w:r>
+        <w:t xml:space="preserve"> would be expected given their reliance on the SWHS estimates. Unguided estimates are </w:t>
+      </w:r>
+      <w:proofErr w:type="gramStart"/>
+      <w:r>
+        <w:t>similar to</w:t>
+      </w:r>
+      <w:proofErr w:type="gramEnd"/>
+      <w:r>
+        <w:t xml:space="preserve"> the Howard estimates and where they differ the credibility intervals of the Bayesian estimates include Howard estimates in most cases. They differ significantly in the PWSI where unguided harvests are the same magnitude as guided harvests and thus bias corrections made in the Bayesian model have a larger effect on those estimates.</w:t>
+      </w:r>
+    </w:p>
+    <w:p>
+      <w:pPr>
+        <w:pStyle w:val="BodyText"/>
+      </w:pPr>
+      <w:r>
+        <w:t xml:space="preserve">Yelloweye rockfish harvests also demonstrate increasing trends but with reductions in recent years that reflect management actions taken by the department (Figure 29 H_YE, Appendix </w:t>
+      </w:r>
+      <w:del w:id="147" w:author="Joy, Philip J (DFG)" w:date="2026-10-13T15:03:00Z" w16du:dateUtc="2026-10-13T23:03:00Z">
+        <w:r>
+          <w:delText>C3</w:delText>
+        </w:r>
+      </w:del>
+      <w:ins w:id="148" w:author="Joy, Philip J (DFG)" w:date="2026-10-13T15:03:00Z" w16du:dateUtc="2026-10-13T23:03:00Z">
+        <w:r>
+          <w:t>D3</w:t>
+        </w:r>
+      </w:ins>
+      <w:r>
+        <w:t xml:space="preserve">). The Bayesian model demonstrates consistent and steady harvests in many CFMU’s prior to 1998 with the Southeast SSEI and CSEO demonstrating appreciable harvests. As with black rockfish, yelloweye rockfish guided harvests estimates agree with Howard estimates. Unguided yelloweye harvests were also </w:t>
+      </w:r>
+      <w:proofErr w:type="gramStart"/>
+      <w:r>
+        <w:t>similar to</w:t>
+      </w:r>
+      <w:proofErr w:type="gramEnd"/>
+      <w:r>
+        <w:t xml:space="preserve"> Howard estimates </w:t>
+      </w:r>
+      <w:proofErr w:type="gramStart"/>
+      <w:r>
+        <w:t>with the exception of</w:t>
+      </w:r>
+      <w:proofErr w:type="gramEnd"/>
+      <w:r>
+        <w:t xml:space="preserve"> the PWSI CFMU. This is the only area where private harvests are significantly greater than guided harvests and thus the effect of bias correction in the model is more pronounced. Variability in those harvests is significantly dampened in the Bayesian estimates while the overall magnitude of the harvests remains the same.</w:t>
+      </w:r>
+    </w:p>
+    <w:p>
+      <w:pPr>
+        <w:pStyle w:val="BodyText"/>
+      </w:pPr>
+      <w:r>
+        <w:t xml:space="preserve">Yelloweye rockfish harvests in the BSAI and SOKO2SAP areas of Kodiak have extremely large credibility intervals owing to a lack of area-specific data for these areas. Yelloweye harvests are generally low in the Kodiak region and portside samples are lacking, even for the most heavily fished Northeast and Afognak units. As such, the proportion of non-yelloweye harvests that are yelloweye have credibility intervals for 4 of the 6 Kodiak units ranging from 0 to 1 (Figure 23 </w:t>
+      </w:r>
+      <w:r>
+        <w:lastRenderedPageBreak/>
+        <w:t>YE_COMP) with this uncertainty propagated through the harvest and release calculations. Harvest and total removal point estimates for these regions are very low (Figure 29 YE_HARV) and even the upper end of the credibility intervals are relatively low. Although imprecise, these estimates provide managers with information on the scale and trend of harvests in these areas.</w:t>
+      </w:r>
+    </w:p>
+    <w:p>
+      <w:pPr>
+        <w:pStyle w:val="BodyText"/>
+      </w:pPr>
+      <w:r>
+        <w:t xml:space="preserve">Non-yelloweye DSR harvests in Southeast show very similar patterns to yelloweye and strong agreement with Howard estimates (Figure 28 H_DSR and Appendix </w:t>
+      </w:r>
+      <w:del w:id="149" w:author="Joy, Philip J (DFG)" w:date="2026-10-14T07:41:00Z" w16du:dateUtc="2026-10-14T15:41:00Z">
+        <w:r>
+          <w:delText>C4</w:delText>
+        </w:r>
+      </w:del>
+      <w:ins w:id="150" w:author="Joy, Philip J (DFG)" w:date="2026-10-14T07:41:00Z" w16du:dateUtc="2026-10-14T15:41:00Z">
+        <w:r>
+          <w:t>D</w:t>
+        </w:r>
+        <w:r>
+          <w:t>4</w:t>
+        </w:r>
+      </w:ins>
+      <w:r>
+        <w:t xml:space="preserve">) and slope rockfish harvests show an increasing trend that is less pronounced than the other species and complexes (Figure 29 H_SLOPE and Appendix </w:t>
+      </w:r>
+      <w:del w:id="151" w:author="Joy, Philip J (DFG)" w:date="2026-10-14T07:41:00Z" w16du:dateUtc="2026-10-14T15:41:00Z">
+        <w:r>
+          <w:delText>C5</w:delText>
+        </w:r>
+      </w:del>
+      <w:ins w:id="152" w:author="Joy, Philip J (DFG)" w:date="2026-10-14T07:41:00Z" w16du:dateUtc="2026-10-14T15:41:00Z">
+        <w:r>
+          <w:t>D</w:t>
+        </w:r>
+        <w:r>
+          <w:t>5</w:t>
+        </w:r>
+      </w:ins>
+      <w:r>
+        <w:t xml:space="preserve">). Although slope </w:t>
+      </w:r>
+      <w:r>
+        <w:rPr>
+          <w:i/>
+          <w:iCs/>
+        </w:rPr>
+        <w:t>pH</w:t>
+      </w:r>
+      <w:r>
+        <w:t xml:space="preserve"> increased dramatically in recent years, overall harvests did not as overall non-pelagic harvests fell during recent years in Southeast. The slope estimates show some differences from Howard estimates in EWKT CFMU because the Howard methods borrowed values from other areas whereas the Bayesian model uses hierarchical modelling to deal with low or absent samples.</w:t>
+      </w:r>
+    </w:p>
+    <w:p>
+      <w:pPr>
+        <w:pStyle w:val="Heading3"/>
+      </w:pPr>
+      <w:bookmarkStart w:id="153" w:name="releases-2"/>
+      <w:bookmarkEnd w:id="143"/>
+      <w:r>
+        <w:t>Releases</w:t>
+      </w:r>
+    </w:p>
+    <w:p>
+      <w:pPr>
+        <w:pStyle w:val="FirstParagraph"/>
+      </w:pPr>
+      <w:r>
+        <w:t xml:space="preserve">The release estimates for all rockfish are substantially less than harvests and demonstrate variable trends over the course of the time series with substantial uncertainty in the estimates (Figure 32 R_ALL and Appendix </w:t>
+      </w:r>
+      <w:del w:id="154" w:author="Joy, Philip J (DFG)" w:date="2026-10-14T07:41:00Z" w16du:dateUtc="2026-10-14T15:41:00Z">
+        <w:r>
+          <w:delText>C1</w:delText>
+        </w:r>
+      </w:del>
+      <w:ins w:id="155" w:author="Joy, Philip J (DFG)" w:date="2026-10-14T07:41:00Z" w16du:dateUtc="2026-10-14T15:41:00Z">
+        <w:r>
+          <w:t>D</w:t>
+        </w:r>
+        <w:r>
+          <w:t>1</w:t>
+        </w:r>
+      </w:ins>
+      <w:r>
+        <w:t xml:space="preserve">). Estimates from the pre-1998 period </w:t>
+      </w:r>
+      <w:proofErr w:type="gramStart"/>
+      <w:r>
+        <w:t>were</w:t>
+      </w:r>
+      <w:proofErr w:type="gramEnd"/>
+      <w:r>
+        <w:t xml:space="preserve"> sometimes similar to the low end of the post-1998 period or demonstrated an increase as the fishery in that CFMU developed. The trends in the Bayesian model diverge from the Howard estimates more than the harvest estimates due to changes in methodology, including the integration of the portside interview data. Portside interview data in Southcentral and the Northeast Kodiak CFMUs showed much lower retention probabilities for private anglers which greatly increased the release estimates in this region relative to the Howard estimates. In the Southeast region the release estimates are generally in line with the Howard estimates but are significantly lower in the early 2000s when the Howard methods relied on assumptions and long-term averages to compensate for the lack of logbook data on yelloweye releases (Figure DATA).</w:t>
+      </w:r>
+    </w:p>
+    <w:p>
+      <w:pPr>
+        <w:pStyle w:val="BodyText"/>
+      </w:pPr>
+      <w:r>
+        <w:t xml:space="preserve">Releases of black rockfish demonstrate a relatively steady trend with an increase for guided anglers in the early 2000s as anglers began to target the species and then a decline as guided angler retention increased (Figure 33 R_BLACK, Figure 16 </w:t>
+      </w:r>
+      <w:proofErr w:type="spellStart"/>
+      <w:r>
+        <w:t>PEL_pH</w:t>
+      </w:r>
+      <w:proofErr w:type="spellEnd"/>
+      <w:r>
+        <w:t xml:space="preserve">, Appendix </w:t>
+      </w:r>
+      <w:del w:id="156" w:author="Joy, Philip J (DFG)" w:date="2026-10-14T07:41:00Z" w16du:dateUtc="2026-10-14T15:41:00Z">
+        <w:r>
+          <w:delText>C2</w:delText>
+        </w:r>
+      </w:del>
+      <w:ins w:id="157" w:author="Joy, Philip J (DFG)" w:date="2026-10-14T07:41:00Z" w16du:dateUtc="2026-10-14T15:41:00Z">
         <w:r>
           <w:t>D</w:t>
         </w:r>
@@ -30211,7 +31534,49 @@
         </w:r>
       </w:ins>
       <w:r>
-        <w:t>). Harvests prior to 1998 are generally low, but the North Gulf (NG), Northeast Kodiak, and the SSEI, NSEI and CSEO CFMU’s in Southeast had significant harvests during that time period. Guided estimates are very precise since the logbook program went into effect and port sampling programs provide robust samples for understanding the black rockfish proportion of the pelagic harvest. Unguided harvests are more uncertain as would be expected given their reliance on the SWHS estimates. Unguided estimates are similar to the Howard estimates and where they differ the credibility intervals of the Bayesian estimates include Howard estimates in most cases. They differ significantly in the PWSI where unguided harvests are the same magnitude as guided harvests and thus bias corrections made in the Bayesian model have a larger effect on those estimates.</w:t>
+        <w:t xml:space="preserve">). Unguided anglers show a gradual increase in releases that mirrors the overall increased participation in </w:t>
+      </w:r>
+      <w:proofErr w:type="gramStart"/>
+      <w:r>
+        <w:t>the fishery</w:t>
+      </w:r>
+      <w:proofErr w:type="gramEnd"/>
+      <w:r>
+        <w:t xml:space="preserve">. Estimates of guided releases </w:t>
+      </w:r>
+      <w:proofErr w:type="gramStart"/>
+      <w:r>
+        <w:t>are</w:t>
+      </w:r>
+      <w:proofErr w:type="gramEnd"/>
+      <w:r>
+        <w:t xml:space="preserve"> very precise since 1998 owing to logbook records and adequate sampling in the port sampling program. Prior to 1998, guided release estimates demonstrate significant uncertainty. Owing to less informative data estimates of unguided releases have substantial uncertainty </w:t>
+      </w:r>
+      <w:proofErr w:type="gramStart"/>
+      <w:r>
+        <w:t>as a result of</w:t>
+      </w:r>
+      <w:proofErr w:type="gramEnd"/>
+      <w:r>
+        <w:t xml:space="preserve"> data specific to unguided release numbers and the reliance on the </w:t>
+      </w:r>
+      <w:r>
+        <w:rPr>
+          <w:i/>
+          <w:iCs/>
+        </w:rPr>
+        <w:t>pH</w:t>
+      </w:r>
+      <w:r>
+        <w:t xml:space="preserve"> demonstrated by guided anglers. Unguided black rockfish release estimates were substantially higher than the Howard estimates in Southcentral and Kodiak regions </w:t>
+      </w:r>
+      <w:proofErr w:type="gramStart"/>
+      <w:r>
+        <w:t>as a result of</w:t>
+      </w:r>
+      <w:proofErr w:type="gramEnd"/>
+      <w:r>
+        <w:t xml:space="preserve"> integrating the portside interview data. In contrast, that same data resulted in lower release estimates in Southeast.</w:t>
       </w:r>
     </w:p>
     <w:p>
@@ -30219,14 +31584,14 @@
         <w:pStyle w:val="BodyText"/>
       </w:pPr>
       <w:r>
-        <w:t xml:space="preserve">Yelloweye rockfish harvests also demonstrate increasing trends but with reductions in recent years that reflect management actions taken by the department (Figure 29 H_YE, Appendix </w:t>
-      </w:r>
-      <w:del w:id="146" w:author="Joy, Philip J (DFG)" w:date="2026-10-13T15:03:00Z" w16du:dateUtc="2026-10-13T23:03:00Z">
+        <w:t xml:space="preserve">Yelloweye release estimates demonstrated steady trends with pronounced uncertainty around the unguided estimates (Figure 34 R_YE and Appendix </w:t>
+      </w:r>
+      <w:del w:id="158" w:author="Joy, Philip J (DFG)" w:date="2026-10-14T07:41:00Z" w16du:dateUtc="2026-10-14T15:41:00Z">
         <w:r>
           <w:delText>C3</w:delText>
         </w:r>
       </w:del>
-      <w:ins w:id="147" w:author="Joy, Philip J (DFG)" w:date="2026-10-13T15:03:00Z" w16du:dateUtc="2026-10-13T23:03:00Z">
+      <w:ins w:id="159" w:author="Joy, Philip J (DFG)" w:date="2026-10-14T07:41:00Z" w16du:dateUtc="2026-10-14T15:41:00Z">
         <w:r>
           <w:t>D</w:t>
         </w:r>
@@ -30235,27 +31600,378 @@
         </w:r>
       </w:ins>
       <w:r>
-        <w:t>). The Bayesian model demonstrates consistent and steady harvests in many CFMU’s prior to 1998 with the Southeast SSEI and CSEO demonstrating appreciable harvests. As with black rockfish, yelloweye rockfish guided harvests estimates agree with Howard estimates. Unguided yelloweye harvests were also similar to Howard estimates with the exception of the PWSI CFMU. This is the only area where private harvests are significantly greater than guided harvests and thus the effect of bias correction in the model is more pronounced. Variability in those harvests is significantly dampened in the Bayesian estimates while the overall magnitude of the harvests remains the same.</w:t>
+        <w:t xml:space="preserve">). Retention of yelloweye rockfish has historically been high (Figure 17 </w:t>
+      </w:r>
+      <w:proofErr w:type="spellStart"/>
+      <w:r>
+        <w:t>YE_pH</w:t>
+      </w:r>
+      <w:proofErr w:type="spellEnd"/>
+      <w:r>
+        <w:t>) and the overall release estimates are generally low. Unguided release estimates also differ substantially from the Howard estimates but, unlike black rockfish, are sometime higher and sometimes lower. In almost all cases the credibility intervals from the Bayesian model include the Howard estimates.</w:t>
       </w:r>
     </w:p>
     <w:p>
       <w:pPr>
         <w:pStyle w:val="BodyText"/>
       </w:pPr>
-      <w:r>
-        <w:t xml:space="preserve">Yelloweye rockfish harvests in the BSAI and SOKO2SAP areas of Kodiak have extremely large credibility intervals owing to a lack of area-specific data for these areas. Yelloweye harvests are generally low in the Kodiak region and portside samples are lacking, even for the most heavily fished Northeast and Afognak units. As such, the proportion of non-yelloweye harvests that are yelloweye have credibility intervals for 4 of the 6 Kodiak units ranging from 0 to 1 (Figure 23 </w:t>
-      </w:r>
-      <w:r>
-        <w:lastRenderedPageBreak/>
-        <w:t>YE_COMP) with this uncertainty propagated through the harvest and release calculations. Harvest and total removal point estimates for these regions are very low (Figure 29 YE_HARV) and even the upper end of the credibility intervals are relatively low. Although imprecise, these estimates provide managers with information on the scale and trend of harvests in these areas.</w:t>
+      <w:ins w:id="160" w:author="Joy, Philip J (DFG)" w:date="2026-10-14T07:33:00Z" w16du:dateUtc="2026-10-14T15:33:00Z">
+        <w:r>
+          <w:lastRenderedPageBreak/>
+          <w:t xml:space="preserve">Non-yelloweye DSR </w:t>
+        </w:r>
+        <w:r>
+          <w:t>and slope rockfish demonstrated the most uncertainty in release estimates owing to conf</w:t>
+        </w:r>
+      </w:ins>
+      <w:ins w:id="161" w:author="Joy, Philip J (DFG)" w:date="2026-10-14T07:34:00Z" w16du:dateUtc="2026-10-14T15:34:00Z">
+        <w:r>
+          <w:t xml:space="preserve">licting information on the proportion harvested, </w:t>
+        </w:r>
+        <w:r>
+          <w:rPr>
+            <w:i/>
+            <w:iCs/>
+          </w:rPr>
+          <w:t>pH</w:t>
+        </w:r>
+        <w:r>
+          <w:t>, coming from the portside interview and logbook data</w:t>
+        </w:r>
+      </w:ins>
+      <w:ins w:id="162" w:author="Joy, Philip J (DFG)" w:date="2026-10-14T07:36:00Z" w16du:dateUtc="2026-10-14T15:36:00Z">
+        <w:r>
+          <w:t xml:space="preserve"> (Figure </w:t>
+        </w:r>
+        <w:r>
+          <w:t xml:space="preserve">18, </w:t>
+        </w:r>
+        <w:r>
+          <w:t>19 and 20)</w:t>
+        </w:r>
+      </w:ins>
+      <w:ins w:id="163" w:author="Joy, Philip J (DFG)" w:date="2026-10-14T07:34:00Z" w16du:dateUtc="2026-10-14T15:34:00Z">
+        <w:r>
+          <w:t xml:space="preserve">. </w:t>
+        </w:r>
+      </w:ins>
+      <w:ins w:id="164" w:author="Joy, Philip J (DFG)" w:date="2026-10-14T07:39:00Z" w16du:dateUtc="2026-10-14T15:39:00Z">
+        <w:r>
+          <w:t>Nevertheless,</w:t>
+        </w:r>
+      </w:ins>
+      <w:ins w:id="165" w:author="Joy, Philip J (DFG)" w:date="2026-10-14T07:38:00Z" w16du:dateUtc="2026-10-14T15:38:00Z">
+        <w:r>
+          <w:t xml:space="preserve"> release estimates for both species assemblages are </w:t>
+        </w:r>
+      </w:ins>
+      <w:ins w:id="166" w:author="Joy, Philip J (DFG)" w:date="2026-10-14T07:39:00Z" w16du:dateUtc="2026-10-14T15:39:00Z">
+        <w:r>
+          <w:t>relatively small in all areas except the SSEI.</w:t>
+        </w:r>
+      </w:ins>
+      <w:ins w:id="167" w:author="Joy, Philip J (DFG)" w:date="2026-10-14T07:34:00Z" w16du:dateUtc="2026-10-14T15:34:00Z">
+        <w:r>
+          <w:t xml:space="preserve"> </w:t>
+        </w:r>
+      </w:ins>
+      <w:r>
+        <w:t>Non</w:t>
+      </w:r>
+      <w:r>
+        <w:t xml:space="preserve">-yelloweye DSR demonstrated similar release patterns to yelloweye rockfish and lower unguided estimates than Howard (Figure R_DSR 35 and Appendix </w:t>
+      </w:r>
+      <w:del w:id="168" w:author="Joy, Philip J (DFG)" w:date="2026-10-14T07:41:00Z" w16du:dateUtc="2026-10-14T15:41:00Z">
+        <w:r>
+          <w:delText>C4</w:delText>
+        </w:r>
+      </w:del>
+      <w:ins w:id="169" w:author="Joy, Philip J (DFG)" w:date="2026-10-14T07:41:00Z" w16du:dateUtc="2026-10-14T15:41:00Z">
+        <w:r>
+          <w:t>D</w:t>
+        </w:r>
+        <w:r>
+          <w:t>4</w:t>
+        </w:r>
+      </w:ins>
+      <w:r>
+        <w:t>) while slope rockfish show very low release numbers for most of the time series and a large</w:t>
+      </w:r>
+      <w:del w:id="170" w:author="Joy, Philip J (DFG)" w:date="2026-10-14T07:40:00Z" w16du:dateUtc="2026-10-14T15:40:00Z">
+        <w:r>
+          <w:delText>,</w:delText>
+        </w:r>
+      </w:del>
+      <w:r>
+        <w:t xml:space="preserve"> uptick in recent years with substantial uncertainty (R_SLOPE 36 and Appendix </w:t>
+      </w:r>
+      <w:del w:id="171" w:author="Joy, Philip J (DFG)" w:date="2026-10-14T07:41:00Z" w16du:dateUtc="2026-10-14T15:41:00Z">
+        <w:r>
+          <w:delText>C5</w:delText>
+        </w:r>
+      </w:del>
+      <w:ins w:id="172" w:author="Joy, Philip J (DFG)" w:date="2026-10-14T07:41:00Z" w16du:dateUtc="2026-10-14T15:41:00Z">
+        <w:r>
+          <w:t>D</w:t>
+        </w:r>
+        <w:r>
+          <w:t>5</w:t>
+        </w:r>
+      </w:ins>
+      <w:r>
+        <w:t>). While the DSR estimates track the Howard estimates to a fair degree, the slope rockfish estimates are substantially higher in the SSEO and, to a lesser degree, the NSEI and EWYKT, although the overall number is still low and not likely to be a management concern.</w:t>
       </w:r>
     </w:p>
     <w:p>
       <w:pPr>
+        <w:pStyle w:val="Heading3"/>
+      </w:pPr>
+      <w:bookmarkStart w:id="173" w:name="total-removals-in-biomass"/>
+      <w:bookmarkEnd w:id="153"/>
+      <w:r>
+        <w:t>Total Removals in Biomass</w:t>
+      </w:r>
+    </w:p>
+    <w:p>
+      <w:pPr>
+        <w:pStyle w:val="FirstParagraph"/>
+      </w:pPr>
+      <w:r>
+        <w:t>After factoring in release mortalities and converting to biomass total removals of rockfish in sport fisheries were calculated</w:t>
+      </w:r>
+      <w:ins w:id="174" w:author="Joy, Philip J (DFG)" w:date="2026-10-14T07:42:00Z" w16du:dateUtc="2026-10-14T15:42:00Z">
+        <w:r>
+          <w:t xml:space="preserve"> (Appendix D)</w:t>
+        </w:r>
+      </w:ins>
+      <w:del w:id="175" w:author="Joy, Philip J (DFG)" w:date="2026-10-14T07:41:00Z" w16du:dateUtc="2026-10-14T15:41:00Z">
+        <w:r>
+          <w:delText xml:space="preserve"> for Southcentral and Kodiak regions</w:delText>
+        </w:r>
+      </w:del>
+      <w:r>
+        <w:t>. The release mortality rate for pelagic and black rockfish is relatively low even before the introduction of DWRs and coupled with high retention in recent years, release mortalities represent a trivial component of overall fishery removals (Figure 37 BRF_M, 38 PEL_M</w:t>
+      </w:r>
+      <w:del w:id="176" w:author="Joy, Philip J (DFG)" w:date="2026-10-14T07:42:00Z" w16du:dateUtc="2026-10-14T15:42:00Z">
+        <w:r>
+          <w:delText>, Appendix B1 and B6</w:delText>
+        </w:r>
+      </w:del>
+      <w:r>
+        <w:t>). DSR (including yelloweye) and slope rockfish assemblages experienced high release mortality prior to DRM requirements and even with DWR experience appreciable mortality rates (Figure 7 REL_M). As such, release mortalities comprised a modest but appreciable contribution to overall mortalities for these species (Figure 39, 40 and 41 YE_M, DRS_M and SLOPE_M</w:t>
+      </w:r>
+      <w:del w:id="177" w:author="Joy, Philip J (DFG)" w:date="2026-10-14T07:43:00Z" w16du:dateUtc="2026-10-14T15:43:00Z">
+        <w:r>
+          <w:delText>, Appendix C3, C4 and C5</w:delText>
+        </w:r>
+      </w:del>
+      <w:r>
+        <w:t>).</w:t>
+      </w:r>
+    </w:p>
+    <w:p>
+      <w:pPr>
+        <w:pStyle w:val="Heading1"/>
+      </w:pPr>
+      <w:bookmarkStart w:id="178" w:name="_Toc242785287"/>
+      <w:bookmarkStart w:id="179" w:name="discussion"/>
+      <w:bookmarkEnd w:id="96"/>
+      <w:bookmarkEnd w:id="142"/>
+      <w:bookmarkEnd w:id="173"/>
+      <w:r>
+        <w:t>Discussion</w:t>
+      </w:r>
+      <w:bookmarkEnd w:id="178"/>
+    </w:p>
+    <w:p>
+      <w:pPr>
+        <w:pStyle w:val="FirstParagraph"/>
+      </w:pPr>
+      <w:r>
+        <w:t xml:space="preserve">The Bayesian approach to reconstructing historical rockfish removals and calculating current rockfish removals build and improve on the foundation established by Howard et al. (2020). This new approach offers unified methods that encompasses </w:t>
+      </w:r>
+      <w:proofErr w:type="gramStart"/>
+      <w:r>
+        <w:t>all of</w:t>
+      </w:r>
+      <w:proofErr w:type="gramEnd"/>
+      <w:r>
+        <w:t xml:space="preserve"> the necessary steps to go from the SWHS, logbook and port sampling data to produce estimates of harvests, releases and total biomass removal estimates necessary to conduct stock assessments. These methods are reproducible and offer the first documentation of the biomass and mortality calculations that have been used since the Howard methods were first adopted. This will provide greater consistency and transparency in accounting for rockfish removals in Alaska waters. These methods improve on the Howard methodology by accurately addressing bias in the SWHS data, models the release data in a more realistic process, </w:t>
+      </w:r>
+      <w:proofErr w:type="gramStart"/>
+      <w:r>
+        <w:t>uses</w:t>
+      </w:r>
+      <w:proofErr w:type="gramEnd"/>
+      <w:r>
+        <w:t xml:space="preserve"> hierarchical modelling to deal with low or absent samples, and generates a time series back to 1977 by utilizing all available data.</w:t>
+      </w:r>
+    </w:p>
+    <w:p>
+      <w:pPr>
         <w:pStyle w:val="BodyText"/>
       </w:pPr>
       <w:r>
-        <w:t xml:space="preserve">Non-yelloweye DSR harvests in Southeast show very similar patterns to yelloweye and strong agreement with Howard estimates (Figure 28 H_DSR and Appendix C4) and slope rockfish harvests show an increasing trend that is less pronounced than the other species and complexes (Figure 29 H_SLOPE and Appendix C5). Although slope </w:t>
+        <w:t xml:space="preserve">Harvest estimates produced with these methods are generally consistent with the Howard estimates and differ only where the Bayesian methods offer improvements on a key, but flawed, assumption about the use of SWHS data. The Howard methods rely on the SWHS ratio of </w:t>
+      </w:r>
+      <w:proofErr w:type="spellStart"/>
+      <w:r>
+        <w:t>guided:unguided</w:t>
+      </w:r>
+      <w:proofErr w:type="spellEnd"/>
+      <w:r>
+        <w:t xml:space="preserve"> harvests to expand guided logbook harvests to generate unguided estimates thus </w:t>
+      </w:r>
+      <w:proofErr w:type="gramStart"/>
+      <w:r>
+        <w:t>making the assumption</w:t>
+      </w:r>
+      <w:proofErr w:type="gramEnd"/>
+      <w:r>
+        <w:t xml:space="preserve"> that the </w:t>
+      </w:r>
+      <w:proofErr w:type="spellStart"/>
+      <w:r>
+        <w:t>guided:unguided</w:t>
+      </w:r>
+      <w:proofErr w:type="spellEnd"/>
+      <w:r>
+        <w:t xml:space="preserve"> ratio applies equally to all species and species complexes. Most CFMUs have considerably higher harvests by guided users and thus this flaw is less significant as the Bayesian estimates of unguided harvests align well with Howard estimates. However, where guided anglers are in the minority (i.e., PWSI) we see larger differences in the unguided harvests </w:t>
+      </w:r>
+      <w:del w:id="180" w:author="Joy, Philip J (DFG)" w:date="2026-10-14T07:45:00Z" w16du:dateUtc="2026-10-14T15:45:00Z">
+        <w:r>
+          <w:delText>that demonstrate</w:delText>
+        </w:r>
+      </w:del>
+      <w:ins w:id="181" w:author="Joy, Philip J (DFG)" w:date="2026-10-14T07:45:00Z" w16du:dateUtc="2026-10-14T15:45:00Z">
+        <w:r>
+          <w:t>demonstrating</w:t>
+        </w:r>
+      </w:ins>
+      <w:r>
+        <w:t xml:space="preserve"> the limitations of </w:t>
+      </w:r>
+      <w:del w:id="182" w:author="Joy, Philip J (DFG)" w:date="2026-10-14T07:45:00Z" w16du:dateUtc="2026-10-14T15:45:00Z">
+        <w:r>
+          <w:delText xml:space="preserve">that </w:delText>
+        </w:r>
+      </w:del>
+      <w:ins w:id="183" w:author="Joy, Philip J (DFG)" w:date="2026-10-14T07:45:00Z" w16du:dateUtc="2026-10-14T15:45:00Z">
+        <w:r>
+          <w:t>the Howard</w:t>
+        </w:r>
+        <w:r>
+          <w:t xml:space="preserve"> </w:t>
+        </w:r>
+      </w:ins>
+      <w:del w:id="184" w:author="Joy, Philip J (DFG)" w:date="2026-10-14T07:45:00Z" w16du:dateUtc="2026-10-14T15:45:00Z">
+        <w:r>
+          <w:delText>approach</w:delText>
+        </w:r>
+      </w:del>
+      <w:ins w:id="185" w:author="Joy, Philip J (DFG)" w:date="2026-10-14T07:45:00Z" w16du:dateUtc="2026-10-14T15:45:00Z">
+        <w:r>
+          <w:t>methods</w:t>
+        </w:r>
+      </w:ins>
+      <w:r>
+        <w:t>.</w:t>
+      </w:r>
+    </w:p>
+    <w:p>
+      <w:pPr>
+        <w:pStyle w:val="BodyText"/>
+      </w:pPr>
+      <w:r>
+        <w:lastRenderedPageBreak/>
+        <w:t xml:space="preserve">The Bayesian approach to estimating releases produces noticeably different estimates from the Howard approach, particularly for the unguided sector. The Howard approach uses the same methods for estimating unguided releases as </w:t>
+      </w:r>
+      <w:del w:id="186" w:author="Joy, Philip J (DFG)" w:date="2026-10-14T07:45:00Z" w16du:dateUtc="2026-10-14T15:45:00Z">
+        <w:r>
+          <w:delText xml:space="preserve">it does </w:delText>
+        </w:r>
+      </w:del>
+      <w:r>
+        <w:t xml:space="preserve">for harvests </w:t>
+      </w:r>
+      <w:del w:id="187" w:author="Joy, Philip J (DFG)" w:date="2026-10-14T07:45:00Z" w16du:dateUtc="2026-10-14T15:45:00Z">
+        <w:r>
+          <w:delText>as it applies</w:delText>
+        </w:r>
+      </w:del>
+      <w:ins w:id="188" w:author="Joy, Philip J (DFG)" w:date="2026-10-14T07:45:00Z" w16du:dateUtc="2026-10-14T15:45:00Z">
+        <w:r>
+          <w:t>by applying</w:t>
+        </w:r>
+      </w:ins>
+      <w:r>
+        <w:t xml:space="preserve"> the SWHS ratio of </w:t>
+      </w:r>
+      <w:proofErr w:type="spellStart"/>
+      <w:r>
+        <w:t>guided:unguided</w:t>
+      </w:r>
+      <w:proofErr w:type="spellEnd"/>
+      <w:r>
+        <w:t xml:space="preserve"> release of all rockfish to the logbook release data. However, the Howard methods do not address bias in those estimates, assumes the ratio is equal for all species, and </w:t>
+      </w:r>
+      <w:proofErr w:type="gramStart"/>
+      <w:r>
+        <w:t>do</w:t>
+      </w:r>
+      <w:proofErr w:type="gramEnd"/>
+      <w:r>
+        <w:t xml:space="preserve"> not make use of the portside interview data. In contrast to SWHS harvest estimates, SWHS release estimates are biased high (i.e., anglers over-report their releases relative to logbook data) with a much larger magnitude in the bias relative to harvests. Rather than multiplying the logbook release estimates by the </w:t>
+      </w:r>
+      <w:proofErr w:type="spellStart"/>
+      <w:r>
+        <w:t>unguided:guided</w:t>
+      </w:r>
+      <w:proofErr w:type="spellEnd"/>
+      <w:r>
+        <w:t xml:space="preserve"> ratio of releases in the SWHS data, the Bayesian model corrects the SWHS release estimates and ensures that releases of the three logbook categories sum to that value, ensuring a more process and data driven estimation procedure. In many cases the Howard method results in unguided release estimates that are at or above guided release estimates even when the harvest of unguided anglers is substantially less (Figures 28 H_BLACK and 33 R_BLACK). This would imply that unguided anglers are discarding fish at a far higher rate than guided anglers.</w:t>
+      </w:r>
+    </w:p>
+    <w:p>
+      <w:pPr>
+        <w:pStyle w:val="BodyText"/>
+      </w:pPr>
+      <w:r>
+        <w:t xml:space="preserve">The flaw in the Howard methods is apparent when examining release estimates of rockfish in Southeast CFMU’s since 2020 when yelloweye retention was prohibited and DSR retention restricted. During these years the logbook data demonstrated almost 100% retention of black rockfish while regulations reduced yelloweye retention to zero and limited DSR retention to 1 per day. In most of Southeast guided harvests are significantly higher than unguided harvests but the SWHS </w:t>
+      </w:r>
+      <w:proofErr w:type="spellStart"/>
+      <w:proofErr w:type="gramStart"/>
+      <w:r>
+        <w:t>unguided:guided</w:t>
+      </w:r>
+      <w:proofErr w:type="spellEnd"/>
+      <w:proofErr w:type="gramEnd"/>
+      <w:r>
+        <w:t xml:space="preserve"> release ratio suggests more releases by unguided anglers. Thus, the Howard methods expand the guided release estimates to derive unguided estimates, resulting in estimates of unguided black rockfish releases far above the guided estimates while the harvest estimates display the opposite pattern. The CSEO is particularly indicative of this inconsistency where guided harvests of black rockfish are over 4 times that of the unguided anglers while the Howard methods generate unguided release estimates 2 to 3 times that of guided anglers. Because the SWHS data is for all rockfish combined it does not address the different retention probabilities among species complexes which </w:t>
+      </w:r>
+      <w:proofErr w:type="gramStart"/>
+      <w:r>
+        <w:t>are</w:t>
+      </w:r>
+      <w:proofErr w:type="gramEnd"/>
+      <w:r>
+        <w:t xml:space="preserve"> particularly divergent in Southeast since 2000 due to management action.</w:t>
+      </w:r>
+    </w:p>
+    <w:p>
+      <w:pPr>
+        <w:pStyle w:val="BodyText"/>
+      </w:pPr>
+      <w:r>
+        <w:t xml:space="preserve">The Bayesian approach is not without flaws and required </w:t>
+      </w:r>
+      <w:proofErr w:type="gramStart"/>
+      <w:r>
+        <w:t>making an assumption</w:t>
+      </w:r>
+      <w:proofErr w:type="gramEnd"/>
+      <w:r>
+        <w:t xml:space="preserve"> that retention probabilities have followed similar trends in both user groups. Projecting release estimates back in time required relating releases to the harvest data and necessitated estimating retention probability (</w:t>
       </w:r>
       <w:r>
         <w:rPr>
@@ -30265,33 +31981,7 @@
         <w:t>pH</w:t>
       </w:r>
       <w:r>
-        <w:t xml:space="preserve"> increased dramatically in recent years, overall harvests did not as overall non-pelagic harvests fell during recent years in Southeast. The slope estimates show some differences from Howard estimates in EWKT CFMU because the Howard methods borrowed values from other areas whereas the Bayesian model uses hierarchical modelling to deal with low or absent samples.</w:t>
-      </w:r>
-    </w:p>
-    <w:p>
-      <w:pPr>
-        <w:pStyle w:val="Heading3"/>
-      </w:pPr>
-      <w:bookmarkStart w:id="148" w:name="releases-2"/>
-      <w:bookmarkEnd w:id="142"/>
-      <w:r>
-        <w:t>Releases</w:t>
-      </w:r>
-    </w:p>
-    <w:p>
-      <w:pPr>
-        <w:pStyle w:val="FirstParagraph"/>
-      </w:pPr>
-      <w:r>
-        <w:t>The release estimates for all rockfish are substantially less than harvests and demonstrate variable trends over the course of the time series with substantial uncertainty in the estimates (Figure 32 R_ALL and Appendix C1). Estimates from the pre-1998 period were sometimes similar to the low end of the post-1998 period or demonstrated an increase as the fishery in that CFMU developed. The trends in the Bayesian model diverge from the Howard estimates more than the harvest estimates due to changes in methodology, including the integration of the portside interview data. Portside interview data in Southcentral and the Northeast Kodiak CFMUs showed much lower retention probabilities for private anglers which greatly increased the release estimates in this region relative to the Howard estimates. In the Southeast region the release estimates are generally in line with the Howard estimates but are significantly lower in the early 2000s when the Howard methods relied on assumptions and long-term averages to compensate for the lack of logbook data on yelloweye releases (Figure DATA).</w:t>
-      </w:r>
-    </w:p>
-    <w:p>
-      <w:pPr>
-        <w:pStyle w:val="BodyText"/>
-      </w:pPr>
-      <w:r>
-        <w:t xml:space="preserve">Releases of black rockfish demonstrate a relatively steady trend with an increase for guided anglers in the early 2000s as anglers began to target the species and then a decline as guided angler retention increased (Figure 33 R_BLACK, Figure 16 PEL_pH, Appendix C2). Unguided anglers show a gradual increase in releases that mirrors the overall increased participation in the fishery. Estimates of guided releases are very precise since 1998 owing to logbook records and adequate sampling in the port sampling program. Prior to 1998, guided release estimates demonstrate significant uncertainty. Owing to less informative data estimates of unguided releases have substantial uncertainty as a result of data specific to unguided release numbers and the reliance on the </w:t>
+        <w:t xml:space="preserve">). However, initial efforts to maintain consistency with the Howard methods and model </w:t>
       </w:r>
       <w:r>
         <w:rPr>
@@ -30301,100 +31991,7 @@
         <w:t>pH</w:t>
       </w:r>
       <w:r>
-        <w:t xml:space="preserve"> demonstrated by guided anglers. Unguided black rockfish release estimates were substantially higher than the Howard estimates in Southcentral and Kodiak regions as a result of integrating the portside interview data. In contrast, that same data resulted in lower release estimates in Southeast.</w:t>
-      </w:r>
-    </w:p>
-    <w:p>
-      <w:pPr>
-        <w:pStyle w:val="BodyText"/>
-      </w:pPr>
-      <w:r>
-        <w:t>Yelloweye release estimates demonstrated steady trends with pronounced uncertainty around the unguided estimates (Figure 34 R_YE and Appendix C3). Retention of yelloweye rockfish has historically been high (Figure 17 YE_pH) and the overall release estimates are generally low. Unguided release estimates also differ substantially from the Howard estimates but, unlike black rockfish, are sometime higher and sometimes lower. In almost all cases the credibility intervals from the Bayesian model include the Howard estimates.</w:t>
-      </w:r>
-    </w:p>
-    <w:p>
-      <w:pPr>
-        <w:pStyle w:val="BodyText"/>
-      </w:pPr>
-      <w:r>
-        <w:lastRenderedPageBreak/>
-        <w:t>Non-yelloweye DSR demonstrated similar release patterns to yelloweye rockfish and lower unguided estimates than Howard (Figure R_DSR 35 and Appendix C4) while slope rockfish show very low release numbers for most of the time series and a large, uptick in recent years with substantial uncertainty (R_SLOPE 36 and Appendix C5). While the DSR estimates track the Howard estimates to a fair degree, the slope rockfish estimates are substantially higher in the SSEO and, to a lesser degree, the NSEI and EWYKT, although the overall number is still low and not likely to be a management concern.</w:t>
-      </w:r>
-    </w:p>
-    <w:p>
-      <w:pPr>
-        <w:pStyle w:val="Heading3"/>
-      </w:pPr>
-      <w:bookmarkStart w:id="149" w:name="total-removals-in-biomass"/>
-      <w:bookmarkEnd w:id="148"/>
-      <w:r>
-        <w:t>Total Removals in Biomass</w:t>
-      </w:r>
-    </w:p>
-    <w:p>
-      <w:pPr>
-        <w:pStyle w:val="FirstParagraph"/>
-      </w:pPr>
-      <w:r>
-        <w:t>After factoring in release mortalities and converting to biomass total removals of rockfish in sport fisheries were calculated for Southcentral and Kodiak regions. The release mortality rate for pelagic and black rockfish is relatively low even before the introduction of DWRs and coupled with high retention in recent years, release mortalities represent a trivial component of overall fishery removals (Figure 37 BRF_M, 38 PEL_M, Appendix B1 and B6). DSR (including yelloweye) and slope rockfish assemblages experienced high release mortality prior to DRM requirements and even with DWR experience appreciable mortality rates (Figure 7 REL_M). As such, release mortalities comprised a modest but appreciable contribution to overall mortalities for these species (Figure 39, 40 and 41 YE_M, DRS_M and SLOPE_M, Appendix C3, C4 and C5).</w:t>
-      </w:r>
-    </w:p>
-    <w:p>
-      <w:pPr>
-        <w:pStyle w:val="Heading1"/>
-      </w:pPr>
-      <w:bookmarkStart w:id="150" w:name="discussion"/>
-      <w:bookmarkStart w:id="151" w:name="_Toc242785287"/>
-      <w:bookmarkEnd w:id="94"/>
-      <w:bookmarkEnd w:id="140"/>
-      <w:bookmarkEnd w:id="149"/>
-      <w:r>
-        <w:t>Discussion</w:t>
-      </w:r>
-      <w:bookmarkEnd w:id="151"/>
-    </w:p>
-    <w:p>
-      <w:pPr>
-        <w:pStyle w:val="FirstParagraph"/>
-      </w:pPr>
-      <w:r>
-        <w:t>The Bayesian approach to reconstructing historical rockfish removals and calculating current rockfish removals build and improve on the foundation established by Howard et al. (2020). This new approach offers unified methods that encompasses all of the necessary steps to go from the SWHS, logbook and port sampling data to produce estimates of harvests, releases and total biomass removal estimates necessary to conduct stock assessments. These methods are reproducible and offer the first documentation of the biomass and mortality calculations that have been used since the Howard methods were first adopted. This will provide greater consistency and transparency in accounting for rockfish removals in Alaska waters. These methods improve on the Howard methodology by accurately addressing bias in the SWHS data, models the release data in a more realistic process, uses hierarchical modelling to deal with low or absent samples, and generates a time series back to 1977 by utilizing all available data.</w:t>
-      </w:r>
-    </w:p>
-    <w:p>
-      <w:pPr>
-        <w:pStyle w:val="BodyText"/>
-      </w:pPr>
-      <w:r>
-        <w:t>Harvest estimates produced with these methods are generally consistent with the Howard estimates and differ only where the Bayesian methods offer improvements on a key, but flawed, assumption about the use of SWHS data. The Howard methods rely on the SWHS ratio of guided:unguided harvests to expand guided logbook harvests to generate unguided estimates thus making the assumption that the guided:unguided ratio applies equally to all species and species complexes. Most CFMUs have considerably higher harvests by guided users and thus this flaw is less significant as the Bayesian estimates of unguided harvests align well with Howard estimates. However, where guided anglers are in the minority (i.e., PWSI) we see larger differences in the unguided harvests that demonstrate the limitations of that approach.</w:t>
-      </w:r>
-    </w:p>
-    <w:p>
-      <w:pPr>
-        <w:pStyle w:val="BodyText"/>
-      </w:pPr>
-      <w:r>
-        <w:t xml:space="preserve">The Bayesian approach to estimating releases produces noticeably different estimates from the Howard approach, particularly for the unguided sector. The Howard approach uses the same methods for estimating unguided releases as it does for harvests as it applies the SWHS ratio of guided:unguided release of all rockfish to the logbook release data. However, the Howard methods do not address bias in those estimates, assumes the ratio is equal for all species, and do not make </w:t>
-      </w:r>
-      <w:r>
-        <w:lastRenderedPageBreak/>
-        <w:t>use of the portside interview data. In contrast to SWHS harvest estimates, SWHS release estimates are biased high (i.e., anglers over-report their releases relative to logbook data) with a much larger magnitude in the bias relative to harvests. Rather than multiplying the logbook release estimates by the unguided:guided ratio of releases in the SWHS data, the Bayesian model corrects the SWHS release estimates and ensures that releases of the three logbook categories sum to that value, ensuring a more process and data driven estimation procedure. In many cases the Howard method results in unguided release estimates that are at or above guided release estimates even when the harvest of unguided anglers is substantially less (Figures 28 H_BLACK and 33 R_BLACK). This would imply that unguided anglers are discarding fish at a far higher rate than guided anglers.</w:t>
-      </w:r>
-    </w:p>
-    <w:p>
-      <w:pPr>
-        <w:pStyle w:val="BodyText"/>
-      </w:pPr>
-      <w:r>
-        <w:t>The flaw in the Howard methods is apparent when examining release estimates of rockfish in Southeast CFMU’s since 2020 when yelloweye retention was prohibited and DSR retention restricted. During these years the logbook data demonstrated almost 100% retention of black rockfish while regulations reduced yelloweye retention to zero and limited DSR retention to 1 per day. In most of Southeast guided harvests are significantly higher than unguided harvests but the SWHS unguided:guided release ratio suggests more releases by unguided anglers. Thus, the Howard methods expand the guided release estimates to derive unguided estimates, resulting in estimates of unguided black rockfish releases far above the guided estimates while the harvest estimates display the opposite pattern. The CSEO is particularly indicative of this inconsistency where guided harvests of black rockfish are over 4 times that of the unguided anglers while the Howard methods generate unguided release estimates 2 to 3 times that of guided anglers. Because the SWHS data is for all rockfish combined it does not address the different retention probabilities among species complexes which are particularly divergent in Southeast since 2000 due to management action.</w:t>
-      </w:r>
-    </w:p>
-    <w:p>
-      <w:pPr>
-        <w:pStyle w:val="BodyText"/>
-      </w:pPr>
-      <w:r>
-        <w:t>The Bayesian approach is not without flaws and required making an assumption that retention probabilities have followed similar trends in both user groups. Projecting release estimates back in time required relating releases to the harvest data and necessitated estimating retention probability (</w:t>
+        <w:t xml:space="preserve"> for all rockfish proved to be untenable given the underlying inconsistency in retention probabilities of pelagic, yelloweye and “other” rockfish in the logbook data. As such, the approach was altered to estimating </w:t>
       </w:r>
       <w:r>
         <w:rPr>
@@ -30404,27 +32001,28 @@
         <w:t>pH</w:t>
       </w:r>
       <w:r>
-        <w:t xml:space="preserve">). However, initial efforts to maintain consistency with the Howard methods and model </w:t>
-      </w:r>
-      <w:r>
-        <w:rPr>
-          <w:i/>
-          <w:iCs/>
-        </w:rPr>
-        <w:t>pH</w:t>
-      </w:r>
-      <w:r>
-        <w:t xml:space="preserve"> for all rockfish proved to be untenable given the underlying inconsistency in retention probabilities of pelagic, yelloweye and “other” rockfish in the logbook data. As such, the approach was altered to estimating </w:t>
-      </w:r>
-      <w:r>
-        <w:rPr>
-          <w:i/>
-          <w:iCs/>
-        </w:rPr>
-        <w:t>pH</w:t>
-      </w:r>
-      <w:r>
-        <w:t xml:space="preserve"> by species complex. This worked well for guided anglers because of the logbook data but was challenging to deal with for unguided anglers.</w:t>
+        <w:t xml:space="preserve"> by species complex. This worked well for guided anglers because of the logbook data but was challenging </w:t>
+      </w:r>
+      <w:del w:id="189" w:author="Joy, Philip J (DFG)" w:date="2026-10-14T07:48:00Z" w16du:dateUtc="2026-10-14T15:48:00Z">
+        <w:r>
+          <w:delText xml:space="preserve">to deal with </w:delText>
+        </w:r>
+      </w:del>
+      <w:r>
+        <w:t>for unguided angler</w:t>
+      </w:r>
+      <w:ins w:id="190" w:author="Joy, Philip J (DFG)" w:date="2026-10-14T07:48:00Z" w16du:dateUtc="2026-10-14T15:48:00Z">
+        <w:r>
+          <w:t xml:space="preserve"> estimates</w:t>
+        </w:r>
+      </w:ins>
+      <w:del w:id="191" w:author="Joy, Philip J (DFG)" w:date="2026-10-14T07:48:00Z" w16du:dateUtc="2026-10-14T15:48:00Z">
+        <w:r>
+          <w:delText>s</w:delText>
+        </w:r>
+      </w:del>
+      <w:r>
+        <w:t>.</w:t>
       </w:r>
     </w:p>
     <w:p>
@@ -30432,7 +32030,27 @@
         <w:pStyle w:val="BodyText"/>
       </w:pPr>
       <w:r>
-        <w:t>Estimating unguided releases thus required an assumption that retention probabilities for unguided anglers followed similar trends to that of unguided anglers but was informed by the integration of the portside interview data. All release estimates are based on the assumption that charter captains accurately report the number of fish they release and under-reported releases in logbook data would have the effect of inflating the model estimates of release bias in the SWHS. While law enforcement provides incentives for the accurate recording of harvests, enforcement of release reporting is near impossible. Apparent bias of SWHS release estimates is very high, suggesting that anglers overestimate the number of fish released by a factor of 2 or more while underestimating the number of fish harvested. Recall bias, which may be worse with released fish relative to harvests, may partially explain these results but it cannot be ruled out that release estimates from the logbook data are not entirely accurate. Models were explored to loosen the assumption that logbook releases act as a census, but thus far no viable model has been developed that produces reasonable release estimates. The SWHS is currently undergoing a modernization project that may shed more light on how to resolve some of these issues in the future.</w:t>
+        <w:t xml:space="preserve">Estimating unguided releases thus required an assumption that retention probabilities for unguided anglers followed similar trends to that of unguided anglers but was informed by the integration of the portside interview data. All release estimates </w:t>
+      </w:r>
+      <w:proofErr w:type="gramStart"/>
+      <w:r>
+        <w:t>are based on the assumption</w:t>
+      </w:r>
+      <w:proofErr w:type="gramEnd"/>
+      <w:r>
+        <w:t xml:space="preserve"> that charter captains accurately report the number of fish they release and under-reported releases in logbook data would have the effect of inflating the model estimates of release bias in the SWHS. While law enforcement provides incentives for the accurate recording of harvests, enforcement of release reporting is near impossible. Apparent bias of SWHS release estimates is very high, suggesting that anglers overestimate the number of fish released by a factor of 2 or more while </w:t>
+      </w:r>
+      <w:r>
+        <w:lastRenderedPageBreak/>
+        <w:t xml:space="preserve">underestimating the number of fish harvested. </w:t>
+      </w:r>
+      <w:proofErr w:type="gramStart"/>
+      <w:r>
+        <w:t>Recall</w:t>
+      </w:r>
+      <w:proofErr w:type="gramEnd"/>
+      <w:r>
+        <w:t xml:space="preserve"> bias, which may be worse with released fish relative to harvests, may partially explain these results but it cannot be ruled out that release estimates from the logbook data are not entirely accurate. Models were explored to loosen the assumption that logbook releases act as a census, but thus far no viable model has been developed that produces reasonable release estimates. The SWHS is currently undergoing a modernization project that may shed more light on how to resolve some of these issues in the future.</w:t>
       </w:r>
     </w:p>
     <w:p>
@@ -30440,7 +32058,6 @@
         <w:pStyle w:val="BodyText"/>
       </w:pPr>
       <w:r>
-        <w:lastRenderedPageBreak/>
         <w:t xml:space="preserve">One key parameter in the model that is poorly informed prior to 2011 is the proportion guided, </w:t>
       </w:r>
       <m:oMath>
@@ -30471,7 +32088,15 @@
         </m:sSub>
       </m:oMath>
       <w:r>
-        <w:t xml:space="preserve">. There is limited data on this parameter and was thus modeled as a long-term average using a beta distribution (Figure 24 pG). Ideally, this would be estimated as a trend similar to how retention probability and species proportions were handled in the model, however the available data did not suggest obvious trends that would support that approach. If </w:t>
+        <w:t xml:space="preserve">. There is limited data on this parameter and was thus modeled as a long-term average using a beta distribution (Figure 24 pG). Ideally, this would be estimated as a trend </w:t>
+      </w:r>
+      <w:proofErr w:type="gramStart"/>
+      <w:r>
+        <w:t>similar to</w:t>
+      </w:r>
+      <w:proofErr w:type="gramEnd"/>
+      <w:r>
+        <w:t xml:space="preserve"> how retention probability and species proportions were handled in the model, however the available data did not suggest obvious trends that would support that approach. If </w:t>
       </w:r>
       <m:oMath>
         <m:sSub>
@@ -30550,7 +32175,51 @@
         </m:sSub>
       </m:oMath>
       <w:r>
-        <w:t xml:space="preserve">) were generally consistent between port samples and logbook data in all areas except Prince William Sound where port samples suggest a lower proportion than the logbook data (Figure 21 P_PEL). Howard et al. (2020) identified issues with the representativeness of the port samples in relation to the harvests. Consequently, that data has been weighted according to their methods although the issue remains even with the adjusted data. The discrepancy between the logbook and port sampling data may be a byproduct of the proportion of fish that are cleaned at sea and not brought to port where they can be sampled. The proportion of rockfish cleaned at sea in Prince William Sound can be as high as 73% of rockfish reported in interviews out of Whittier and if pelagic rockfish (which have historically had a higher bag limit that non-pelagic species) are more likely to be cleaned at sea than non-pelagic rockfish the lower </w:t>
+        <w:t xml:space="preserve">) were generally consistent between port samples and logbook data in all areas except Prince William Sound where port samples suggest a lower proportion than the logbook data (Figure 21 P_PEL). Howard et al. (2020) identified issues with the representativeness of the port samples in relation to the harvests. Consequently, that data has been weighted according to their methods although the issue remains even with the adjusted data. The discrepancy between the logbook and port sampling data may be a byproduct of the proportion of fish that are cleaned at sea and not brought to port where they can be sampled. The proportion of rockfish cleaned at sea in Prince William Sound can be as high as 73% </w:t>
+      </w:r>
+      <w:del w:id="192" w:author="Joy, Philip J (DFG)" w:date="2026-10-14T07:51:00Z" w16du:dateUtc="2026-10-14T15:51:00Z">
+        <w:r>
+          <w:delText xml:space="preserve">of rockfish reported </w:delText>
+        </w:r>
+      </w:del>
+      <w:ins w:id="193" w:author="Joy, Philip J (DFG)" w:date="2026-10-14T07:51:00Z" w16du:dateUtc="2026-10-14T15:51:00Z">
+        <w:r>
+          <w:t>base</w:t>
+        </w:r>
+      </w:ins>
+      <w:ins w:id="194" w:author="Joy, Philip J (DFG)" w:date="2026-10-14T07:52:00Z" w16du:dateUtc="2026-10-14T15:52:00Z">
+        <w:r>
+          <w:t xml:space="preserve">d on </w:t>
+        </w:r>
+      </w:ins>
+      <w:del w:id="195" w:author="Joy, Philip J (DFG)" w:date="2026-10-14T07:52:00Z" w16du:dateUtc="2026-10-14T15:52:00Z">
+        <w:r>
+          <w:delText xml:space="preserve">in </w:delText>
+        </w:r>
+      </w:del>
+      <w:r>
+        <w:t xml:space="preserve">interviews </w:t>
+      </w:r>
+      <w:del w:id="196" w:author="Joy, Philip J (DFG)" w:date="2026-10-14T07:52:00Z" w16du:dateUtc="2026-10-14T15:52:00Z">
+        <w:r>
+          <w:delText>out of</w:delText>
+        </w:r>
+      </w:del>
+      <w:ins w:id="197" w:author="Joy, Philip J (DFG)" w:date="2026-10-14T07:52:00Z" w16du:dateUtc="2026-10-14T15:52:00Z">
+        <w:r>
+          <w:t>in the</w:t>
+        </w:r>
+      </w:ins>
+      <w:r>
+        <w:t xml:space="preserve"> Whittier</w:t>
+      </w:r>
+      <w:ins w:id="198" w:author="Joy, Philip J (DFG)" w:date="2026-10-14T07:52:00Z" w16du:dateUtc="2026-10-14T15:52:00Z">
+        <w:r>
+          <w:t xml:space="preserve"> port</w:t>
+        </w:r>
+      </w:ins>
+      <w:r>
+        <w:t xml:space="preserve"> and if pelagic rockfish (which have historically had a higher bag limit that non-pelagic species) are more likely to be cleaned at sea than non-pelagic rockfish the lower </w:t>
       </w:r>
       <m:oMath>
         <m:sSub>
@@ -30591,7 +32260,23 @@
         </m:sSub>
       </m:oMath>
       <w:r>
-        <w:t xml:space="preserve"> seen in port samples relative to logbook data would align with this explanation. The model favors the logbook data as a result of model construction that treats the logbook data as a census and estimates adhere more closely to the logbook estimates of </w:t>
+        <w:t xml:space="preserve"> seen in port samples relative to logbook data would align with this explanation. The model favors </w:t>
+      </w:r>
+      <w:del w:id="199" w:author="Joy, Philip J (DFG)" w:date="2026-10-14T07:52:00Z" w16du:dateUtc="2026-10-14T15:52:00Z">
+        <w:r>
+          <w:delText xml:space="preserve">the </w:delText>
+        </w:r>
+      </w:del>
+      <w:r>
+        <w:t xml:space="preserve">logbook data </w:t>
+      </w:r>
+      <w:proofErr w:type="gramStart"/>
+      <w:r>
+        <w:t>as a result of</w:t>
+      </w:r>
+      <w:proofErr w:type="gramEnd"/>
+      <w:r>
+        <w:t xml:space="preserve"> model construction that treats the logbook data as a census and estimates adhere more closely to the logbook estimates of </w:t>
       </w:r>
       <m:oMath>
         <m:sSub>
@@ -30632,7 +32317,28 @@
         </m:sSub>
       </m:oMath>
       <w:r>
-        <w:t xml:space="preserve"> while the logistic curve appears to capture the uncertainty in pre-logbook estimates. However, the cause of the discrepancy remains unclear and a reevaluation of the Prince William Sound port sampling estimates is recommended. Improving port sampling procedures and regulations may help to better understand these discrepancies.</w:t>
+        <w:t xml:space="preserve"> while the logistic curve appears to capture the uncertainty in pre-logbook estimates. However, the cause of the discrepancy remains unclear </w:t>
+      </w:r>
+      <w:del w:id="200" w:author="Joy, Philip J (DFG)" w:date="2026-10-14T07:53:00Z" w16du:dateUtc="2026-10-14T15:53:00Z">
+        <w:r>
+          <w:delText>and a reevaluation of the Prince William Sound port sampling estimates is recommended</w:delText>
+        </w:r>
+      </w:del>
+      <w:ins w:id="201" w:author="Joy, Philip J (DFG)" w:date="2026-10-14T07:53:00Z" w16du:dateUtc="2026-10-14T15:53:00Z">
+        <w:r>
+          <w:t>although lessened in recent years</w:t>
+        </w:r>
+      </w:ins>
+      <w:r>
+        <w:t xml:space="preserve">. Improving port sampling procedures and regulations may </w:t>
+      </w:r>
+      <w:proofErr w:type="gramStart"/>
+      <w:r>
+        <w:t>help</w:t>
+      </w:r>
+      <w:proofErr w:type="gramEnd"/>
+      <w:r>
+        <w:t xml:space="preserve"> to better understand these discrepancies.</w:t>
       </w:r>
     </w:p>
     <w:p>
@@ -30640,7 +32346,39 @@
         <w:pStyle w:val="BodyText"/>
       </w:pPr>
       <w:r>
-        <w:t>Release estimates of DSR and slope rockfish in Southeast Alaska diverge from the raw data and should be viewed with caution. There is significant discrepancy in the release of non-yelloweye DSR and slope rockfish in the SSEO and NSEI between the portside sampling and logbook data . In particular, logbooks record low retention of “other” rockfish while portside interviews indicate high retention. The model makes estimates based on the data and associated sample sizes but cannot resolve which data source is more reliable. Area biologists should investigate this data discrepancy to determine if species identification or systematic under- or overreporting in logbooks is contributing to the contradictory data.</w:t>
+        <w:t>Release estimates of DSR and slope rockfish in Southeast Alaska diverge from the raw data and should be viewed with caution. There is significant discrepancy in the release of non-yelloweye DSR and slope rockfish in the SSEO and NSEI between the portside sampling and logbook data</w:t>
+      </w:r>
+      <w:del w:id="202" w:author="Joy, Philip J (DFG)" w:date="2026-10-14T07:53:00Z" w16du:dateUtc="2026-10-14T15:53:00Z">
+        <w:r>
+          <w:delText xml:space="preserve"> </w:delText>
+        </w:r>
+      </w:del>
+      <w:r>
+        <w:t xml:space="preserve">. </w:t>
+      </w:r>
+      <w:proofErr w:type="gramStart"/>
+      <w:r>
+        <w:t>In particular, logbooks</w:t>
+      </w:r>
+      <w:proofErr w:type="gramEnd"/>
+      <w:r>
+        <w:t xml:space="preserve"> record low retention of “other” rockfish while portside interviews indicate high retention. The model makes estimates based on the data and associated sample sizes but cannot resolve which data source is more reliable. Area biologists should investigate this </w:t>
+      </w:r>
+      <w:del w:id="203" w:author="Joy, Philip J (DFG)" w:date="2026-10-14T07:54:00Z" w16du:dateUtc="2026-10-14T15:54:00Z">
+        <w:r>
+          <w:delText xml:space="preserve">data </w:delText>
+        </w:r>
+      </w:del>
+      <w:r>
+        <w:t xml:space="preserve">discrepancy to determine if species identification or systematic under- or overreporting in logbooks is contributing to </w:t>
+      </w:r>
+      <w:proofErr w:type="gramStart"/>
+      <w:r>
+        <w:t>the contradictory</w:t>
+      </w:r>
+      <w:proofErr w:type="gramEnd"/>
+      <w:r>
+        <w:t xml:space="preserve"> data.</w:t>
       </w:r>
     </w:p>
     <w:p>
@@ -30648,7 +32386,45 @@
         <w:pStyle w:val="BodyText"/>
       </w:pPr>
       <w:r>
-        <w:t xml:space="preserve">This report provides the first harvest, release and mortality estimates for the BSAI and SOKO2SAP Kodiak CFMU’s but estimates for unguided anglers lack precise and unbiased estimates from the SWHS as well as species compositional and interview data specific to those areas. As such, these estimates are dependent on the association with guided anglers in the region and relationships estimated from other areas in the Kodiak region and are thus reliant on underlying model structure. This is particularly evident in the </w:t>
+        <w:t>This report provides the first harvest, release and mortality estimates for the BSAI and SOKO2SAP Kodiak CFMU’s but estimates for unguided anglers lack precise and unbiased estimates from the SWHS as well as species composition</w:t>
+      </w:r>
+      <w:del w:id="204" w:author="Joy, Philip J (DFG)" w:date="2026-10-14T07:54:00Z" w16du:dateUtc="2026-10-14T15:54:00Z">
+        <w:r>
+          <w:delText>al</w:delText>
+        </w:r>
+      </w:del>
+      <w:r>
+        <w:t xml:space="preserve"> and interview data specific to those areas. As such, these estimates are dependent on the association with guided anglers in the region and relationships </w:t>
+      </w:r>
+      <w:r>
+        <w:lastRenderedPageBreak/>
+        <w:t xml:space="preserve">estimated from other areas in the Kodiak region and </w:t>
+      </w:r>
+      <w:del w:id="205" w:author="Joy, Philip J (DFG)" w:date="2026-10-14T07:55:00Z" w16du:dateUtc="2026-10-14T15:55:00Z">
+        <w:r>
+          <w:delText xml:space="preserve">are </w:delText>
+        </w:r>
+      </w:del>
+      <w:r>
+        <w:t xml:space="preserve">thus </w:t>
+      </w:r>
+      <w:del w:id="206" w:author="Joy, Philip J (DFG)" w:date="2026-10-14T07:55:00Z" w16du:dateUtc="2026-10-14T15:55:00Z">
+        <w:r>
+          <w:delText xml:space="preserve">reliant </w:delText>
+        </w:r>
+      </w:del>
+      <w:ins w:id="207" w:author="Joy, Philip J (DFG)" w:date="2026-10-14T07:55:00Z" w16du:dateUtc="2026-10-14T15:55:00Z">
+        <w:r>
+          <w:t>sensitive to</w:t>
+        </w:r>
+      </w:ins>
+      <w:del w:id="208" w:author="Joy, Philip J (DFG)" w:date="2026-10-14T07:55:00Z" w16du:dateUtc="2026-10-14T15:55:00Z">
+        <w:r>
+          <w:delText>on</w:delText>
+        </w:r>
+      </w:del>
+      <w:r>
+        <w:t xml:space="preserve"> underlying model structure. This is particularly evident in the </w:t>
       </w:r>
       <m:oMath>
         <m:sSub>
@@ -30689,11 +32465,46 @@
         </m:sSub>
       </m:oMath>
       <w:r>
-        <w:t xml:space="preserve"> estimates (Figure 21 P_PELAGIC) where there is a noticeable drop in the estimate between the historical model (1977-2019) and the contemporary portion of the model (2020-2025) that overlap in credibility intervals. Sensitivity testing during model development showed that this had minimal effect on estimates of black rockfish harvests because those estimates were underpinned by more informative data. However, the knock-on effect was that it did impact estimates of yelloweye removals because there was minimal data on yelloweye from the logbook and port sampling data while SWHS estimates for these regions lack </w:t>
-      </w:r>
-      <w:r>
-        <w:lastRenderedPageBreak/>
-        <w:t xml:space="preserve">precision. These estimates are likely to shift as data is added each year and will require monitoring as estimates are produced each year. Nevertheless, trace plots show consistent exploration of the parameter space and estimates include large credibility intervals that reflect the lack of data from these areas. This is true even for the </w:t>
+        <w:t xml:space="preserve"> estimates (Figure 21 P_PELAGIC) where there is a noticeable drop in the estimate between the historical model (1977-2019) and the contemporary portion of the model (2020-2025) that overlap in credibility intervals. Sensitivity testing during model development showed that this had minimal effect on estimates of black rockfish harvests because those estimates were underpinned by more informative data. However, the knock-on effect was that it </w:t>
+      </w:r>
+      <w:del w:id="209" w:author="Joy, Philip J (DFG)" w:date="2026-10-14T07:55:00Z" w16du:dateUtc="2026-10-14T15:55:00Z">
+        <w:r>
+          <w:delText>did impact</w:delText>
+        </w:r>
+      </w:del>
+      <w:ins w:id="210" w:author="Joy, Philip J (DFG)" w:date="2026-10-14T07:55:00Z" w16du:dateUtc="2026-10-14T15:55:00Z">
+        <w:r>
+          <w:t>affected</w:t>
+        </w:r>
+      </w:ins>
+      <w:r>
+        <w:t xml:space="preserve"> estimates of yelloweye removals because there was minimal data on yelloweye from the logbook and port sampling data while SWHS estimates for these regions lack precision. These estimates are likely to shift as data is added each year and will require monitoring as </w:t>
+      </w:r>
+      <w:ins w:id="211" w:author="Joy, Philip J (DFG)" w:date="2026-10-14T07:55:00Z" w16du:dateUtc="2026-10-14T15:55:00Z">
+        <w:r>
+          <w:t xml:space="preserve">annual </w:t>
+        </w:r>
+      </w:ins>
+      <w:r>
+        <w:t xml:space="preserve">estimates are </w:t>
+      </w:r>
+      <w:del w:id="212" w:author="Joy, Philip J (DFG)" w:date="2026-10-14T07:55:00Z" w16du:dateUtc="2026-10-14T15:55:00Z">
+        <w:r>
+          <w:delText>produced each year</w:delText>
+        </w:r>
+      </w:del>
+      <w:ins w:id="213" w:author="Joy, Philip J (DFG)" w:date="2026-10-14T07:55:00Z" w16du:dateUtc="2026-10-14T15:55:00Z">
+        <w:r>
+          <w:t>generate</w:t>
+        </w:r>
+      </w:ins>
+      <w:ins w:id="214" w:author="Joy, Philip J (DFG)" w:date="2026-10-14T07:56:00Z" w16du:dateUtc="2026-10-14T15:56:00Z">
+        <w:r>
+          <w:t>d</w:t>
+        </w:r>
+      </w:ins>
+      <w:r>
+        <w:t xml:space="preserve">. Nevertheless, trace plots show consistent exploration of the parameter space and estimates include large credibility intervals that reflect the lack of data from these areas. This is true even for the </w:t>
       </w:r>
       <m:oMath>
         <m:sSub>
@@ -30734,34 +32545,89 @@
         </m:sSub>
       </m:oMath>
       <w:r>
-        <w:t xml:space="preserve"> estimates where although the point estimates differ, both the historical and contemporary point estimates are well within the broad credibility intervals of both. The hierarchical nature of the model allows inferences to be made based on data from the rest of the Kodiak region and these estimates provide managers with reasonable, if imprecise, information about the scale and trend of rockfish harvests in these areas.</w:t>
+        <w:t xml:space="preserve"> estimates where </w:t>
+      </w:r>
+      <w:del w:id="215" w:author="Joy, Philip J (DFG)" w:date="2026-10-14T07:56:00Z" w16du:dateUtc="2026-10-14T15:56:00Z">
+        <w:r>
+          <w:delText xml:space="preserve">although </w:delText>
+        </w:r>
+      </w:del>
+      <w:ins w:id="216" w:author="Joy, Philip J (DFG)" w:date="2026-10-14T07:56:00Z" w16du:dateUtc="2026-10-14T15:56:00Z">
+        <w:r>
+          <w:t>despite differences in</w:t>
+        </w:r>
+      </w:ins>
+      <w:del w:id="217" w:author="Joy, Philip J (DFG)" w:date="2026-10-14T07:56:00Z" w16du:dateUtc="2026-10-14T15:56:00Z">
+        <w:r>
+          <w:delText>the</w:delText>
+        </w:r>
+      </w:del>
+      <w:r>
+        <w:t xml:space="preserve"> point estimates</w:t>
+      </w:r>
+      <w:del w:id="218" w:author="Joy, Philip J (DFG)" w:date="2026-10-14T07:56:00Z" w16du:dateUtc="2026-10-14T15:56:00Z">
+        <w:r>
+          <w:delText xml:space="preserve"> differ</w:delText>
+        </w:r>
+      </w:del>
+      <w:r>
+        <w:t>, both the historical and contemporary point estimates are well within the broad credibility intervals of both. The hierarchical nature of the model allows inferences to be made based on data from the rest of the Kodiak region and these estimates provide managers with reasonable, if imprecise, information about the scale and trend of rockfish harvests in these areas.</w:t>
       </w:r>
     </w:p>
     <w:p>
       <w:pPr>
         <w:pStyle w:val="Heading2"/>
       </w:pPr>
-      <w:bookmarkStart w:id="152" w:name="conclusions-and-recommendations"/>
-      <w:bookmarkStart w:id="153" w:name="_Toc242785288"/>
+      <w:bookmarkStart w:id="219" w:name="_Toc242785288"/>
+      <w:bookmarkStart w:id="220" w:name="conclusions-and-recommendations"/>
       <w:r>
         <w:t>Conclusions and Recommendations</w:t>
       </w:r>
-      <w:bookmarkEnd w:id="153"/>
+      <w:bookmarkEnd w:id="219"/>
     </w:p>
     <w:p>
       <w:pPr>
         <w:pStyle w:val="FirstParagraph"/>
       </w:pPr>
       <w:r>
-        <w:t>Managers understandably prefer harvest estimates to remain static once published yet removals occurring in sport fisheries are estimated quantities that can change with improved science reflecting our understanding of the system. Adopting new harvest and release estimates is ultimately at the discretion of regional staff and managers. These revisions were made to address shortcomings in the original Howard methods which provided the first steps in estimating rockfish harvests from the various data sources used to monitor sport harvests in Alaska. The new estimates represent a more uniform and reproducible approach to generating removal estimates, extend the time series back to 1977 and furthermore provide a robust and more streamlined approach to generating estimates going forward.</w:t>
+        <w:t xml:space="preserve">Managers understandably prefer harvest estimates to remain static once published yet removals occurring in sport fisheries are estimated quantities that can change with improved science reflecting our understanding of the system. Adopting new harvest and release estimates is ultimately at the discretion of regional staff and managers. These revisions were made to address shortcomings in the original Howard methods which provided the first steps in estimating rockfish harvests from the various data sources used to monitor sport harvests in Alaska. The new estimates represent a more uniform and reproducible approach to generating removal estimates, extend the time series back to 1977 and furthermore provide a robust and </w:t>
+      </w:r>
+      <w:del w:id="221" w:author="Joy, Philip J (DFG)" w:date="2026-10-14T07:57:00Z" w16du:dateUtc="2026-10-14T15:57:00Z">
+        <w:r>
+          <w:delText xml:space="preserve">more </w:delText>
+        </w:r>
+      </w:del>
+      <w:r>
+        <w:t>streamlined approach to generating estimates going forward.</w:t>
       </w:r>
     </w:p>
     <w:p>
       <w:pPr>
         <w:pStyle w:val="BodyText"/>
       </w:pPr>
-      <w:r>
-        <w:t>With regard to contemporary estimates, the model readily converges and this model provides a single, unified method for calculating annual harvests and removals from all available data sources. Estimates should remain stable provided that sampling programs remain in place, but the model’s built-in use of long term means in the recent time period will provide reasonable estimates when samples sizes are low or absent. Biomass estimates may shift to a minute degree as weight data is added annually but should not cause concern.</w:t>
+      <w:proofErr w:type="gramStart"/>
+      <w:r>
+        <w:t>With regard to</w:t>
+      </w:r>
+      <w:proofErr w:type="gramEnd"/>
+      <w:r>
+        <w:t xml:space="preserve"> contemporary estimates, the model readily converges and this model provides a single, unified method for calculating annual harvests and removals from all available data sources. Estimates should remain stable </w:t>
+      </w:r>
+      <w:proofErr w:type="gramStart"/>
+      <w:r>
+        <w:t>provided that</w:t>
+      </w:r>
+      <w:proofErr w:type="gramEnd"/>
+      <w:r>
+        <w:t xml:space="preserve"> sampling programs remain in place, but the model’s built-in use of long term means in the recent </w:t>
+      </w:r>
+      <w:proofErr w:type="gramStart"/>
+      <w:r>
+        <w:t>time period</w:t>
+      </w:r>
+      <w:proofErr w:type="gramEnd"/>
+      <w:r>
+        <w:t xml:space="preserve"> will provide reasonable estimates when samples sizes are low or absent. Biomass estimates may shift to a minute degree as weight data is added annually but should not cause concern.</w:t>
       </w:r>
     </w:p>
     <w:p>
@@ -30769,7 +32635,15 @@
         <w:pStyle w:val="BodyText"/>
       </w:pPr>
       <w:r>
-        <w:t xml:space="preserve">One caveat to moving forward with these methods is the possibility of gaps occurring in the port sampling programs. The modern period of the model calculates the </w:t>
+        <w:t>One caveat to moving forward with these methods is the possibility of gaps occurring in the port sampling programs</w:t>
+      </w:r>
+      <w:ins w:id="222" w:author="Joy, Philip J (DFG)" w:date="2026-10-14T08:02:00Z" w16du:dateUtc="2026-10-14T16:02:00Z">
+        <w:r>
+          <w:t xml:space="preserve"> and large changes in management</w:t>
+        </w:r>
+      </w:ins>
+      <w:r>
+        <w:t xml:space="preserve">. The modern period of the model calculates the </w:t>
       </w:r>
       <w:r>
         <w:rPr>
@@ -30809,50 +32683,362 @@
         </m:sSub>
       </m:oMath>
       <w:r>
-        <w:t xml:space="preserve"> parameters as deviations around a mean and those values could be substantially changed as a result of management action. Were that to occur it would be a simple matter of introducing a new time-block defined by abrupt changes in management. For example, the Southeast region closed yelloweye rockfish retention between 2020 and 2024 but opened it up in 2025. Provided that port sampling programs remain in place, there would be no need to alter the model. However, if gaps were to occur in the port sampling program the missing years would resort to the mean values for those parameters which would be greatly influenced by the management regime. This could be simply addressed by introducing a new time block for Southeast in 2025.</w:t>
-      </w:r>
+        <w:t xml:space="preserve"> parameters as deviations around a mean and those values could be substantially </w:t>
+      </w:r>
+      <w:ins w:id="223" w:author="Joy, Philip J (DFG)" w:date="2026-10-14T08:14:00Z" w16du:dateUtc="2026-10-14T16:14:00Z">
+        <w:r>
+          <w:t>altered</w:t>
+        </w:r>
+        <w:r>
+          <w:t xml:space="preserve"> </w:t>
+        </w:r>
+      </w:ins>
+      <w:proofErr w:type="gramStart"/>
+      <w:r>
+        <w:t>as a result of</w:t>
+      </w:r>
+      <w:proofErr w:type="gramEnd"/>
+      <w:r>
+        <w:t xml:space="preserve"> management action. </w:t>
+      </w:r>
+      <w:ins w:id="224" w:author="Joy, Philip J (DFG)" w:date="2026-10-14T08:02:00Z" w16du:dateUtc="2026-10-14T16:02:00Z">
+        <w:r>
+          <w:t>When</w:t>
+        </w:r>
+        <w:r>
+          <w:t xml:space="preserve"> </w:t>
+        </w:r>
+      </w:ins>
+      <w:r>
+        <w:t xml:space="preserve">that to </w:t>
+      </w:r>
+      <w:proofErr w:type="gramStart"/>
+      <w:r>
+        <w:t>occur</w:t>
+      </w:r>
+      <w:ins w:id="225" w:author="Joy, Philip J (DFG)" w:date="2026-10-14T08:02:00Z" w16du:dateUtc="2026-10-14T16:02:00Z">
+        <w:r>
+          <w:t>s</w:t>
+        </w:r>
+      </w:ins>
+      <w:proofErr w:type="gramEnd"/>
+      <w:r>
+        <w:t xml:space="preserve"> it </w:t>
+      </w:r>
+      <w:ins w:id="226" w:author="Joy, Philip J (DFG)" w:date="2026-10-14T08:03:00Z" w16du:dateUtc="2026-10-14T16:03:00Z">
+        <w:r>
+          <w:t>may be necessary to introduce</w:t>
+        </w:r>
+      </w:ins>
+      <w:r>
+        <w:t xml:space="preserve"> a new time-block </w:t>
+      </w:r>
+      <w:del w:id="227" w:author="Joy, Philip J (DFG)" w:date="2026-10-14T08:03:00Z" w16du:dateUtc="2026-10-14T16:03:00Z">
+        <w:r>
+          <w:delText>defined by abrupt changes in management</w:delText>
+        </w:r>
+      </w:del>
+      <w:ins w:id="228" w:author="Joy, Philip J (DFG)" w:date="2026-10-14T08:03:00Z" w16du:dateUtc="2026-10-14T16:03:00Z">
+        <w:r>
+          <w:t>as was done for the Southeast region between 2024 and 2025</w:t>
+        </w:r>
+      </w:ins>
+      <w:r>
+        <w:t xml:space="preserve">. </w:t>
+      </w:r>
+      <w:del w:id="229" w:author="Joy, Philip J (DFG)" w:date="2026-10-14T08:03:00Z" w16du:dateUtc="2026-10-14T16:03:00Z">
+        <w:r>
+          <w:delText>For example, t</w:delText>
+        </w:r>
+      </w:del>
+      <w:ins w:id="230" w:author="Joy, Philip J (DFG)" w:date="2026-10-14T08:03:00Z" w16du:dateUtc="2026-10-14T16:03:00Z">
+        <w:r>
+          <w:t>T</w:t>
+        </w:r>
+      </w:ins>
+      <w:r>
+        <w:t xml:space="preserve">he </w:t>
+      </w:r>
+      <w:del w:id="231" w:author="Joy, Philip J (DFG)" w:date="2026-10-14T08:04:00Z" w16du:dateUtc="2026-10-14T16:04:00Z">
+        <w:r>
+          <w:delText>Southeast region closed</w:delText>
+        </w:r>
+      </w:del>
+      <w:ins w:id="232" w:author="Joy, Philip J (DFG)" w:date="2026-10-14T08:04:00Z" w16du:dateUtc="2026-10-14T16:04:00Z">
+        <w:r>
+          <w:t>closure of</w:t>
+        </w:r>
+      </w:ins>
+      <w:r>
+        <w:t xml:space="preserve"> yelloweye rockfish retention between 2020 and 2024 </w:t>
+      </w:r>
+      <w:del w:id="233" w:author="Joy, Philip J (DFG)" w:date="2026-10-14T08:04:00Z" w16du:dateUtc="2026-10-14T16:04:00Z">
+        <w:r>
+          <w:delText>but opened it up in</w:delText>
+        </w:r>
+      </w:del>
+      <w:ins w:id="234" w:author="Joy, Philip J (DFG)" w:date="2026-10-14T08:04:00Z" w16du:dateUtc="2026-10-14T16:04:00Z">
+        <w:r>
+          <w:t>followed by reopening in</w:t>
+        </w:r>
+      </w:ins>
+      <w:r>
+        <w:t xml:space="preserve"> 2025</w:t>
+      </w:r>
+      <w:ins w:id="235" w:author="Joy, Philip J (DFG)" w:date="2026-10-14T08:04:00Z" w16du:dateUtc="2026-10-14T16:04:00Z">
+        <w:r>
+          <w:t xml:space="preserve"> significantly altered the species composition </w:t>
+        </w:r>
+      </w:ins>
+      <w:ins w:id="236" w:author="Joy, Philip J (DFG)" w:date="2026-10-14T08:05:00Z" w16du:dateUtc="2026-10-14T16:05:00Z">
+        <w:r>
+          <w:t xml:space="preserve">in port sampling data as well as angler behavior </w:t>
+        </w:r>
+        <w:proofErr w:type="gramStart"/>
+        <w:r>
+          <w:t>with regard to</w:t>
+        </w:r>
+        <w:proofErr w:type="gramEnd"/>
+        <w:r>
+          <w:t xml:space="preserve"> releasing and retaining fish</w:t>
+        </w:r>
+      </w:ins>
+      <w:r>
+        <w:t xml:space="preserve">. </w:t>
+      </w:r>
+      <w:ins w:id="237" w:author="Joy, Philip J (DFG)" w:date="2026-10-14T08:08:00Z" w16du:dateUtc="2026-10-14T16:08:00Z">
+        <w:r>
+          <w:t xml:space="preserve">With adequate data there would </w:t>
+        </w:r>
+      </w:ins>
+      <w:ins w:id="238" w:author="Joy, Philip J (DFG)" w:date="2026-10-14T08:10:00Z" w16du:dateUtc="2026-10-14T16:10:00Z">
+        <w:r>
+          <w:t>be no</w:t>
+        </w:r>
+      </w:ins>
+      <w:ins w:id="239" w:author="Joy, Philip J (DFG)" w:date="2026-10-14T08:08:00Z" w16du:dateUtc="2026-10-14T16:08:00Z">
+        <w:r>
+          <w:t xml:space="preserve"> need </w:t>
+        </w:r>
+      </w:ins>
+      <w:ins w:id="240" w:author="Joy, Philip J (DFG)" w:date="2026-10-14T08:09:00Z" w16du:dateUtc="2026-10-14T16:09:00Z">
+        <w:r>
+          <w:t xml:space="preserve">to </w:t>
+        </w:r>
+        <w:proofErr w:type="spellStart"/>
+        <w:r>
+          <w:t>timeblock</w:t>
+        </w:r>
+        <w:proofErr w:type="spellEnd"/>
+        <w:r>
+          <w:t xml:space="preserve"> the B0 parameters, however</w:t>
+        </w:r>
+      </w:ins>
+      <w:ins w:id="241" w:author="Joy, Philip J (DFG)" w:date="2026-10-14T08:10:00Z" w16du:dateUtc="2026-10-14T16:10:00Z">
+        <w:r>
+          <w:t xml:space="preserve"> the imperfect data informing the DSR and slope</w:t>
+        </w:r>
+      </w:ins>
+      <w:ins w:id="242" w:author="Joy, Philip J (DFG)" w:date="2026-10-14T08:11:00Z" w16du:dateUtc="2026-10-14T16:11:00Z">
+        <w:r>
+          <w:t xml:space="preserve"> species complexes resulted in model instability in </w:t>
+        </w:r>
+      </w:ins>
+      <w:ins w:id="243" w:author="Joy, Philip J (DFG)" w:date="2026-10-14T08:12:00Z" w16du:dateUtc="2026-10-14T16:12:00Z">
+        <w:r>
+          <w:t xml:space="preserve">pH and </w:t>
+        </w:r>
+        <w:proofErr w:type="spellStart"/>
+        <w:r>
+          <w:t>pcomp</w:t>
+        </w:r>
+        <w:proofErr w:type="spellEnd"/>
+        <w:r>
+          <w:t xml:space="preserve"> estimates for those groups that was only resolved when the </w:t>
+        </w:r>
+      </w:ins>
+      <w:ins w:id="244" w:author="Joy, Philip J (DFG)" w:date="2026-10-14T08:14:00Z" w16du:dateUtc="2026-10-14T16:14:00Z">
+        <w:r>
+          <w:lastRenderedPageBreak/>
+          <w:t>B0 and B0</w:t>
+        </w:r>
+      </w:ins>
+      <w:ins w:id="245" w:author="Joy, Philip J (DFG)" w:date="2026-10-14T08:12:00Z" w16du:dateUtc="2026-10-14T16:12:00Z">
+        <w:r>
+          <w:t xml:space="preserve"> </w:t>
+        </w:r>
+      </w:ins>
+      <w:ins w:id="246" w:author="Joy, Philip J (DFG)" w:date="2026-10-14T08:18:00Z" w16du:dateUtc="2026-10-14T16:18:00Z">
+        <w:r>
+          <w:t>parameters</w:t>
+        </w:r>
+      </w:ins>
+      <w:ins w:id="247" w:author="Joy, Philip J (DFG)" w:date="2026-10-14T08:15:00Z" w16du:dateUtc="2026-10-14T16:15:00Z">
+        <w:r>
+          <w:t xml:space="preserve"> (and associated random effect parameters) </w:t>
+        </w:r>
+      </w:ins>
+      <w:ins w:id="248" w:author="Joy, Philip J (DFG)" w:date="2026-10-14T08:14:00Z" w16du:dateUtc="2026-10-14T16:14:00Z">
+        <w:r>
+          <w:t>were estimated separately for th</w:t>
+        </w:r>
+      </w:ins>
+      <w:ins w:id="249" w:author="Joy, Philip J (DFG)" w:date="2026-10-14T08:15:00Z" w16du:dateUtc="2026-10-14T16:15:00Z">
+        <w:r>
+          <w:t>e 2020-20204 and 2025+ time periods</w:t>
+        </w:r>
+      </w:ins>
+      <w:ins w:id="250" w:author="Joy, Philip J (DFG)" w:date="2026-10-14T08:12:00Z" w16du:dateUtc="2026-10-14T16:12:00Z">
+        <w:r>
+          <w:t>.</w:t>
+        </w:r>
+      </w:ins>
+      <w:ins w:id="251" w:author="Joy, Philip J (DFG)" w:date="2026-10-14T08:08:00Z" w16du:dateUtc="2026-10-14T16:08:00Z">
+        <w:r>
+          <w:t xml:space="preserve"> </w:t>
+        </w:r>
+      </w:ins>
+      <w:ins w:id="252" w:author="Joy, Philip J (DFG)" w:date="2026-10-14T08:15:00Z" w16du:dateUtc="2026-10-14T16:15:00Z">
+        <w:r>
+          <w:t xml:space="preserve">Small changes in management and adequate port sampling should mitigate the need for introducing </w:t>
+        </w:r>
+        <w:proofErr w:type="spellStart"/>
+        <w:r>
+          <w:t>timebloc</w:t>
+        </w:r>
+      </w:ins>
+      <w:ins w:id="253" w:author="Joy, Philip J (DFG)" w:date="2026-10-14T08:16:00Z" w16du:dateUtc="2026-10-14T16:16:00Z">
+        <w:r>
+          <w:t>ks</w:t>
+        </w:r>
+        <w:proofErr w:type="spellEnd"/>
+        <w:r>
+          <w:t xml:space="preserve">, but </w:t>
+        </w:r>
+        <w:r>
+          <w:t xml:space="preserve">care should be taken </w:t>
+        </w:r>
+        <w:r>
+          <w:t>whe</w:t>
+        </w:r>
+        <w:r>
+          <w:t>n</w:t>
+        </w:r>
+        <w:r>
+          <w:t xml:space="preserve"> large management changes occur and the data is imperfect</w:t>
+        </w:r>
+      </w:ins>
+      <w:ins w:id="254" w:author="Joy, Philip J (DFG)" w:date="2026-10-14T08:17:00Z" w16du:dateUtc="2026-10-14T16:17:00Z">
+        <w:r>
+          <w:t xml:space="preserve">. Similarly, if there were gaps in the port sampling programs the model can inform those periods through the long-term means but care should be taken in considering how those </w:t>
+        </w:r>
+      </w:ins>
+      <w:ins w:id="255" w:author="Joy, Philip J (DFG)" w:date="2026-10-14T08:18:00Z" w16du:dateUtc="2026-10-14T16:18:00Z">
+        <w:r>
+          <w:t>means are estimated.</w:t>
+        </w:r>
+      </w:ins>
+      <w:ins w:id="256" w:author="Joy, Philip J (DFG)" w:date="2026-10-14T08:16:00Z" w16du:dateUtc="2026-10-14T16:16:00Z">
+        <w:r>
+          <w:t xml:space="preserve"> </w:t>
+        </w:r>
+      </w:ins>
+      <w:del w:id="257" w:author="Joy, Philip J (DFG)" w:date="2026-10-14T08:13:00Z" w16du:dateUtc="2026-10-14T16:13:00Z">
+        <w:r>
+          <w:delText>Provided that port sampling programs remain in place, there would be no need to alter the model. However, if gaps were to occur in the port sampling program the missing years would resort to the mean values for those parameters which would be greatly influenced by the management regime. This could be simply addressed by introducing a new time block for Southeast in 2025.</w:delText>
+        </w:r>
+      </w:del>
     </w:p>
     <w:p>
       <w:pPr>
         <w:pStyle w:val="BodyText"/>
       </w:pPr>
       <w:r>
-        <w:t>In conclusion, these new estimates of rockfish harvest, release and removals offer an improved and more reproducible approach to catch accounting for this increasingly targeted and vulnerable group of fish. These methods build on the location accounting system built by Howard et al. (2020) as well as the validation of the port sampling representativeness. In addition to extending the time series, the new methods are more reflective of the angling process, better capture the uncertainty in the data, more appropriately share information within regions, and provide a unified and centralized approach to calculating, reporting and archiving rockfish harvests, releases and removals in Alaska waters.</w:t>
+        <w:t xml:space="preserve">In conclusion, these new estimates of rockfish harvest, release and removals offer an improved and more reproducible approach to catch accounting for this increasingly targeted and vulnerable group of fish. These methods build on the location accounting system built by Howard et al. (2020) as well as the validation of the port sampling representativeness. In addition to extending the time series, the new methods </w:t>
+      </w:r>
+      <w:del w:id="258" w:author="Joy, Philip J (DFG)" w:date="2026-10-14T08:18:00Z" w16du:dateUtc="2026-10-14T16:18:00Z">
+        <w:r>
+          <w:delText xml:space="preserve">are </w:delText>
+        </w:r>
+      </w:del>
+      <w:r>
+        <w:t xml:space="preserve">more </w:t>
+      </w:r>
+      <w:ins w:id="259" w:author="Joy, Philip J (DFG)" w:date="2026-10-14T08:18:00Z" w16du:dateUtc="2026-10-14T16:18:00Z">
+        <w:r>
+          <w:t xml:space="preserve">accurately </w:t>
+        </w:r>
+      </w:ins>
+      <w:del w:id="260" w:author="Joy, Philip J (DFG)" w:date="2026-10-14T08:18:00Z" w16du:dateUtc="2026-10-14T16:18:00Z">
+        <w:r>
+          <w:delText>reflective</w:delText>
+        </w:r>
+      </w:del>
+      <w:ins w:id="261" w:author="Joy, Philip J (DFG)" w:date="2026-10-14T08:18:00Z" w16du:dateUtc="2026-10-14T16:18:00Z">
+        <w:r>
+          <w:t>capture</w:t>
+        </w:r>
+      </w:ins>
+      <w:r>
+        <w:t xml:space="preserve"> </w:t>
+      </w:r>
+      <w:del w:id="262" w:author="Joy, Philip J (DFG)" w:date="2026-10-14T08:18:00Z" w16du:dateUtc="2026-10-14T16:18:00Z">
+        <w:r>
+          <w:delText xml:space="preserve">of </w:delText>
+        </w:r>
+      </w:del>
+      <w:r>
+        <w:t xml:space="preserve">the angling process, better capture </w:t>
+      </w:r>
+      <w:del w:id="263" w:author="Joy, Philip J (DFG)" w:date="2026-10-14T08:19:00Z" w16du:dateUtc="2026-10-14T16:19:00Z">
+        <w:r>
+          <w:delText xml:space="preserve">the </w:delText>
+        </w:r>
+      </w:del>
+      <w:r>
+        <w:t>uncertainty in the data, more appropriately share information within regions, and provide a unified and centralized approach to calculating, reporting and archiving rockfish harvests, releases and removals in Alaska waters.</w:t>
       </w:r>
     </w:p>
     <w:p>
       <w:pPr>
         <w:pStyle w:val="Heading1"/>
       </w:pPr>
-      <w:bookmarkStart w:id="154" w:name="acknowledgments"/>
-      <w:bookmarkStart w:id="155" w:name="_Toc242785289"/>
-      <w:bookmarkEnd w:id="150"/>
-      <w:bookmarkEnd w:id="152"/>
-      <w:r>
-        <w:lastRenderedPageBreak/>
+      <w:bookmarkStart w:id="264" w:name="_Toc242785289"/>
+      <w:bookmarkStart w:id="265" w:name="acknowledgments"/>
+      <w:bookmarkEnd w:id="179"/>
+      <w:bookmarkEnd w:id="220"/>
+      <w:r>
         <w:t>Acknowledgments</w:t>
       </w:r>
-      <w:bookmarkEnd w:id="155"/>
+      <w:bookmarkEnd w:id="264"/>
     </w:p>
     <w:p>
       <w:pPr>
         <w:pStyle w:val="FirstParagraph"/>
       </w:pPr>
       <w:r>
-        <w:t>Sport harvest reconstructions provided in this document were made possible by the devoted time and effort of many people administering the data collection projects used in these analyses. First and foremost, it needs to be acknowledged that although this report may seem critical of the Howard methods, this effort does not exist without the foundational work undertaken by Katie Howard and her coauthors in developing these methods, establishing and validating the relevancy of the data, and developing a system of accurately assigning data to appropriate CFMUs that are now available annually from the SWHS and logbook programs. Similarly, those overseeing and running those programs deserve special thanks for the high-quality work and products produced including Nick Smith and Jacob Bozzini from the SWHS program and Ben Jevons and Kyla Buster from the Saltwater Guide Logbook program. This project also highlights the high value of the port sampling programs with particular thanks going to Marian Ford, Corey Litwiniak, Adam Lake, and a virtual army of technicians. We would also like to thank Tyler Polum and Philip Tschersich for the Kodiak hydroacoustic data and advice. We would like to thank Adam Reimer for developing the initial approach to this model and Hamachan Hamazaki for his review of this work.</w:t>
+        <w:t xml:space="preserve">Sport harvest reconstructions provided in this document were made possible by the devoted time and effort of many people administering the data collection projects used in these analyses. First and foremost, it needs to be acknowledged that although this report may seem critical of the Howard methods, this effort does not exist without the foundational work undertaken by Katie Howard and her coauthors in developing these methods, establishing and validating the relevancy of the data, and developing a system of accurately assigning data to appropriate CFMUs that are now available annually from the SWHS and logbook programs. Similarly, those overseeing and running those programs deserve special thanks for the high-quality work and products produced including Nick Smith and Jacob Bozzini from the SWHS program and Ben Jevons and Kyla Buster from the Saltwater Guide Logbook program. This project also highlights the high value of the port sampling programs with </w:t>
+      </w:r>
+      <w:proofErr w:type="gramStart"/>
+      <w:r>
+        <w:t>particular thanks</w:t>
+      </w:r>
+      <w:proofErr w:type="gramEnd"/>
+      <w:r>
+        <w:t xml:space="preserve"> going to Marian Ford, Corey Litwiniak, Adam Lake, and a virtual army of technicians. We would also like to thank Tyler Polum and Philip Tschersich for the Kodiak hydroacoustic data and advice. We would like to thank Adam Reimer for developing the initial approach to this model and Hamachan Hamazaki for his review of this work.</w:t>
       </w:r>
     </w:p>
     <w:p>
       <w:pPr>
         <w:pStyle w:val="Heading1"/>
       </w:pPr>
-      <w:bookmarkStart w:id="156" w:name="literature-cited"/>
-      <w:bookmarkStart w:id="157" w:name="_Toc242785290"/>
-      <w:bookmarkEnd w:id="154"/>
+      <w:bookmarkStart w:id="266" w:name="_Toc242785290"/>
+      <w:bookmarkStart w:id="267" w:name="literature-cited"/>
+      <w:bookmarkEnd w:id="265"/>
       <w:r>
         <w:t>Literature Cited</w:t>
       </w:r>
-      <w:bookmarkEnd w:id="157"/>
+      <w:bookmarkEnd w:id="266"/>
     </w:p>
     <w:p>
       <w:pPr>
@@ -30875,7 +33061,16 @@
         <w:pStyle w:val="BodyText"/>
       </w:pPr>
       <w:r>
-        <w:t>Blain, B. J. and T. M. Sutton. 2016. Reproductive status and blood-plasma indicators of sex and gonad maturation status for yelloweye rockfish following barotrauma and recompression events. Transactions of the American Fisheries Socociety 145: 1234-1240.</w:t>
+        <w:lastRenderedPageBreak/>
+        <w:t xml:space="preserve">Blain, B. J. and T. M. Sutton. 2016. Reproductive status and blood-plasma indicators of sex and gonad maturation status for yelloweye rockfish following barotrauma and recompression events. Transactions of the American Fisheries </w:t>
+      </w:r>
+      <w:proofErr w:type="spellStart"/>
+      <w:r>
+        <w:t>Socociety</w:t>
+      </w:r>
+      <w:proofErr w:type="spellEnd"/>
+      <w:r>
+        <w:t xml:space="preserve"> 145: 1234-1240.</w:t>
       </w:r>
     </w:p>
     <w:p>
@@ -30915,7 +33110,15 @@
         <w:pStyle w:val="BodyText"/>
       </w:pPr>
       <w:r>
-        <w:t>Gelman, A.. Prior distributions for variance parameters in hierarchical models. Bayesian Analysis, 1:515–533, 2006.</w:t>
+        <w:t xml:space="preserve">Gelman, </w:t>
+      </w:r>
+      <w:proofErr w:type="gramStart"/>
+      <w:r>
+        <w:t>A..</w:t>
+      </w:r>
+      <w:proofErr w:type="gramEnd"/>
+      <w:r>
+        <w:t xml:space="preserve"> Prior distributions for variance parameters in hierarchical models. Bayesian Analysis, 1:515–533, 2006.</w:t>
       </w:r>
     </w:p>
     <w:p>
@@ -30931,7 +33134,15 @@
         <w:pStyle w:val="BodyText"/>
       </w:pPr>
       <w:r>
-        <w:t>Hannah, R. W., P. S. Rankin, and M. T. O. Blume. 2012. Use of a novel cage system to measure postrecompression survival of northeast Pacific rockfish. Marine and Coastal Fisheries: Dynamics, Management, and Ecosystem Science, 4:1, 46-56.</w:t>
+        <w:t xml:space="preserve">Hannah, R. W., P. S. Rankin, and M. T. O. Blume. 2012. Use of a novel cage system to measure </w:t>
+      </w:r>
+      <w:proofErr w:type="spellStart"/>
+      <w:r>
+        <w:t>postrecompression</w:t>
+      </w:r>
+      <w:proofErr w:type="spellEnd"/>
+      <w:r>
+        <w:t xml:space="preserve"> survival of northeast Pacific rockfish. Marine and Coastal Fisheries: Dynamics, Management, and Ecosystem Science, 4:1, 46-56.</w:t>
       </w:r>
     </w:p>
     <w:p>
@@ -30939,7 +33150,6 @@
         <w:pStyle w:val="BodyText"/>
       </w:pPr>
       <w:r>
-        <w:lastRenderedPageBreak/>
         <w:t>Hannah, R. W., S. J. Parker, and K. M. Matteson. 2008. Escaping the surface: the effect of capture depth on submergence success of surface-released Pacific rockfish. North American Journal of Fisheries Management, 28:694-700.</w:t>
       </w:r>
     </w:p>
@@ -30948,7 +33158,23 @@
         <w:pStyle w:val="BodyText"/>
       </w:pPr>
       <w:r>
-        <w:t>Hochhalter, S. J. 2012. Modeling submergence success of discarded yelloweye rockfish (Sebastes ruberrimus) and quillback rockfish (Sebastes maliger): Towards improved estimation of total fishery removals: Fisheries Research 127-128.</w:t>
+        <w:t xml:space="preserve">Hochhalter, S. J. 2012. Modeling submergence success of discarded yelloweye rockfish (Sebastes </w:t>
+      </w:r>
+      <w:proofErr w:type="spellStart"/>
+      <w:r>
+        <w:t>ruberrimus</w:t>
+      </w:r>
+      <w:proofErr w:type="spellEnd"/>
+      <w:r>
+        <w:t xml:space="preserve">) and quillback rockfish (Sebastes </w:t>
+      </w:r>
+      <w:proofErr w:type="spellStart"/>
+      <w:r>
+        <w:t>maliger</w:t>
+      </w:r>
+      <w:proofErr w:type="spellEnd"/>
+      <w:r>
+        <w:t>): Towards improved estimation of total fishery removals: Fisheries Research 127-128.</w:t>
       </w:r>
     </w:p>
     <w:p>
@@ -31006,7 +33232,24 @@
         <w:pStyle w:val="BodyText"/>
       </w:pPr>
       <w:r>
-        <w:t xml:space="preserve">Kassahun, W., Neyens, T., Molenberghs, G. et al. 2012. Modeling overdispersed longitudinal binary data using a combined beta and normal random-effects model. Arch Public Health 70, 7. </w:t>
+        <w:lastRenderedPageBreak/>
+        <w:t xml:space="preserve">Kassahun, W., Neyens, T., </w:t>
+      </w:r>
+      <w:proofErr w:type="spellStart"/>
+      <w:r>
+        <w:t>Molenberghs</w:t>
+      </w:r>
+      <w:proofErr w:type="spellEnd"/>
+      <w:r>
+        <w:t xml:space="preserve">, G. et al. 2012. Modeling </w:t>
+      </w:r>
+      <w:proofErr w:type="spellStart"/>
+      <w:r>
+        <w:t>overdispersed</w:t>
+      </w:r>
+      <w:proofErr w:type="spellEnd"/>
+      <w:r>
+        <w:t xml:space="preserve"> longitudinal binary data using a combined beta and normal random-effects model. Arch Public Health 70, 7. </w:t>
       </w:r>
       <w:hyperlink r:id="rId7">
         <w:r>
@@ -31045,8 +33288,13 @@
       <w:pPr>
         <w:pStyle w:val="BodyText"/>
       </w:pPr>
-      <w:r>
-        <w:t xml:space="preserve">Molenberghs, G., Verbeke, G., Demétrio, C. G. B., &amp; Vieira, A. M. C. 2010. A Family of Generalized Linear Models for Repeated Measures with Normal and Conjugate Random Effects. Statistical Science, 25(3), 325–347. </w:t>
+      <w:proofErr w:type="spellStart"/>
+      <w:r>
+        <w:t>Molenberghs</w:t>
+      </w:r>
+      <w:proofErr w:type="spellEnd"/>
+      <w:r>
+        <w:t xml:space="preserve">, G., Verbeke, G., Demétrio, C. G. B., &amp; Vieira, A. M. C. 2010. A Family of Generalized Linear Models for Repeated Measures with Normal and Conjugate Random Effects. Statistical Science, 25(3), 325–347. </w:t>
       </w:r>
       <w:hyperlink r:id="rId8">
         <w:r>
@@ -31064,12 +33312,21 @@
       <w:r>
         <w:t xml:space="preserve">Plummer M (2024). </w:t>
       </w:r>
+      <w:proofErr w:type="spellStart"/>
       <w:r>
         <w:rPr>
           <w:i/>
           <w:iCs/>
         </w:rPr>
-        <w:t>rjags: Bayesian Graphical Models using MCMC</w:t>
+        <w:t>rjags</w:t>
+      </w:r>
+      <w:proofErr w:type="spellEnd"/>
+      <w:r>
+        <w:rPr>
+          <w:i/>
+          <w:iCs/>
+        </w:rPr>
+        <w:t>: Bayesian Graphical Models using MCMC</w:t>
       </w:r>
       <w:r>
         <w:t xml:space="preserve">. R package version 4-16, </w:t>
@@ -31099,7 +33356,6 @@
         <w:pStyle w:val="BodyText"/>
       </w:pPr>
       <w:r>
-        <w:lastRenderedPageBreak/>
         <w:t>Polum, T., M. Witteveen, and B. Woolever. 2025. Report on selected sport fisheries of the Alaska Peninsula–Aleutian Islands Management Area, 2015–2025. Alaska Department of Fish and Game, Fishery Management Report No. 25-36, Anchorage.</w:t>
       </w:r>
     </w:p>
@@ -31167,7 +33423,23 @@
         <w:pStyle w:val="BodyText"/>
       </w:pPr>
       <w:r>
-        <w:t>Tschersich, P., J. Dissen, and W. Gaeuman. 2023. Westward Region hydroacoustic survey for black rockfish Sebastes melanops abundance, 2007–2022. Alaska Department of Fish and Game, Fishery Data Series No. 23-31, Anchorage.</w:t>
+        <w:t xml:space="preserve">Tschersich, P., J. Dissen, and W. </w:t>
+      </w:r>
+      <w:proofErr w:type="spellStart"/>
+      <w:r>
+        <w:t>Gaeuman</w:t>
+      </w:r>
+      <w:proofErr w:type="spellEnd"/>
+      <w:r>
+        <w:t xml:space="preserve">. 2023. Westward Region hydroacoustic survey for black rockfish Sebastes </w:t>
+      </w:r>
+      <w:proofErr w:type="spellStart"/>
+      <w:r>
+        <w:t>melanops</w:t>
+      </w:r>
+      <w:proofErr w:type="spellEnd"/>
+      <w:r>
+        <w:t xml:space="preserve"> abundance, 2007–2022. Alaska Department of Fish and Game, Fishery Data Series No. 23-31, Anchorage.</w:t>
       </w:r>
     </w:p>
     <w:p>
@@ -31179,7 +33451,7 @@
       <w:pPr>
         <w:pStyle w:val="Heading4"/>
       </w:pPr>
-      <w:bookmarkStart w:id="158" w:name="extra-stuff-not-ready-to-delete"/>
+      <w:bookmarkStart w:id="268" w:name="extra-stuff-not-ready-to-delete"/>
       <w:r>
         <w:lastRenderedPageBreak/>
         <w:t>Extra Stuff not ready to delete:</w:t>
@@ -32469,8 +34741,8 @@
           </m:sSup>
         </m:oMath>
       </m:oMathPara>
-      <w:bookmarkEnd w:id="156"/>
-      <w:bookmarkEnd w:id="158"/>
+      <w:bookmarkEnd w:id="267"/>
+      <w:bookmarkEnd w:id="268"/>
     </w:p>
     <w:sectPr>
       <w:footerReference w:type="default" r:id="rId11"/>

</xml_diff>